<commit_message>
WIP: Scott's local edits to submission-ready file + draft replacements
</commit_message>
<xml_diff>
--- a/paper/OneDrive_1_22-05-2026/SIR/Main file - SIR submission ready - 2026-06-22.docx
+++ b/paper/OneDrive_1_22-05-2026/SIR/Main file - SIR submission ready - 2026-06-22.docx
@@ -1,21 +1,7 @@
 
 <file path=word/document.xml><?xml version="1.0" encoding="utf-8"?>
-<w:document xmlns:wpc="http://schemas.microsoft.com/office/word/2010/wordprocessingCanvas" xmlns:cx="http://schemas.microsoft.com/office/drawing/2014/chartex" xmlns:cx1="http://schemas.microsoft.com/office/drawing/2015/9/8/chartex" xmlns:cx2="http://schemas.microsoft.com/office/drawing/2015/10/21/chartex" xmlns:cx3="http://schemas.microsoft.com/office/drawing/2016/5/9/chartex" xmlns:cx4="http://schemas.microsoft.com/office/drawing/2016/5/10/chartex" xmlns:cx5="http://schemas.microsoft.com/office/drawing/2016/5/11/chartex" xmlns:cx6="http://schemas.microsoft.com/office/drawing/2016/5/12/chartex" xmlns:cx7="http://schemas.microsoft.com/office/drawing/2016/5/13/chartex" xmlns:cx8="http://schemas.microsoft.com/office/drawing/2016/5/14/chartex" xmlns:mc="http://schemas.openxmlformats.org/markup-compatibility/2006" xmlns:aink="http://schemas.microsoft.com/office/drawing/2016/ink" xmlns:am3d="http://schemas.microsoft.com/office/drawing/2017/model3d" xmlns:o="urn:schemas-microsoft-com:office:office" xmlns:oel="http://schemas.microsoft.com/office/2019/extlst" xmlns:r="http://schemas.openxmlformats.org/officeDocument/2006/relationships" xmlns:m="http://schemas.openxmlformats.org/officeDocument/2006/math" xmlns:v="urn:schemas-microsoft-com:vml" xmlns:wp14="http://schemas.microsoft.com/office/word/2010/wordprocessingDrawing" xmlns:wp="http://schemas.openxmlformats.org/drawingml/2006/wordprocessingDrawing" xmlns:w10="urn:schemas-microsoft-com:office:word" xmlns:w="http://schemas.openxmlformats.org/wordprocessingml/2006/main" xmlns:w14="http://schemas.microsoft.com/office/word/2010/wordml" xmlns:w15="http://schemas.microsoft.com/office/word/2012/wordml" xmlns:w16cex="http://schemas.microsoft.com/office/word/2018/wordml/cex" xmlns:w16cid="http://schemas.microsoft.com/office/word/2016/wordml/cid" xmlns:w16="http://schemas.microsoft.com/office/word/2018/wordml" xmlns:w16du="http://schemas.microsoft.com/office/word/2023/wordml/word16du" xmlns:w16sdtdh="http://schemas.microsoft.com/office/word/2020/wordml/sdtdatahash" xmlns:w16sdtfl="http://schemas.microsoft.com/office/word/2024/wordml/sdtformatlock" xmlns:w16se="http://schemas.microsoft.com/office/word/2015/wordml/symex" xmlns:wpg="http://schemas.microsoft.com/office/word/2010/wordprocessingGroup" xmlns:wpi="http://schemas.microsoft.com/office/word/2010/wordprocessingInk" xmlns:wne="http://schemas.microsoft.com/office/word/2006/wordml" xmlns:wps="http://schemas.microsoft.com/office/word/2010/wordprocessingShape" mc:Ignorable="w14 w15 w16se w16cid w16 w16cex w16sdtdh w16sdtfl w16du wp14">
+<w:document xmlns:wpc="http://schemas.microsoft.com/office/word/2010/wordprocessingCanvas" xmlns:cx="http://schemas.microsoft.com/office/drawing/2014/chartex" xmlns:cx1="http://schemas.microsoft.com/office/drawing/2015/9/8/chartex" xmlns:cx2="http://schemas.microsoft.com/office/drawing/2015/10/21/chartex" xmlns:cx3="http://schemas.microsoft.com/office/drawing/2016/5/9/chartex" xmlns:cx4="http://schemas.microsoft.com/office/drawing/2016/5/10/chartex" xmlns:cx5="http://schemas.microsoft.com/office/drawing/2016/5/11/chartex" xmlns:cx6="http://schemas.microsoft.com/office/drawing/2016/5/12/chartex" xmlns:cx7="http://schemas.microsoft.com/office/drawing/2016/5/13/chartex" xmlns:cx8="http://schemas.microsoft.com/office/drawing/2016/5/14/chartex" xmlns:mc="http://schemas.openxmlformats.org/markup-compatibility/2006" xmlns:m="http://schemas.openxmlformats.org/officeDocument/2006/math" xmlns:aink="http://schemas.microsoft.com/office/drawing/2016/ink" xmlns:am3d="http://schemas.microsoft.com/office/drawing/2017/model3d" xmlns:oel="http://schemas.microsoft.com/office/2019/extlst" xmlns:r="http://schemas.openxmlformats.org/officeDocument/2006/relationships" xmlns:wp14="http://schemas.microsoft.com/office/word/2010/wordprocessingDrawing" xmlns:wp="http://schemas.openxmlformats.org/drawingml/2006/wordprocessingDrawing" xmlns:wpg="http://schemas.microsoft.com/office/word/2010/wordprocessingGroup" xmlns:wpi="http://schemas.microsoft.com/office/word/2010/wordprocessingInk" xmlns:wps="http://schemas.microsoft.com/office/word/2010/wordprocessingShape" xmlns:o="urn:schemas-microsoft-com:office:office" xmlns:v="urn:schemas-microsoft-com:vml" xmlns:w10="urn:schemas-microsoft-com:office:word" xmlns:w="http://schemas.openxmlformats.org/wordprocessingml/2006/main" xmlns:w14="http://schemas.microsoft.com/office/word/2010/wordml" xmlns:w15="http://schemas.microsoft.com/office/word/2012/wordml" xmlns:w16cex="http://schemas.microsoft.com/office/word/2018/wordml/cex" xmlns:w16cid="http://schemas.microsoft.com/office/word/2016/wordml/cid" xmlns:w16="http://schemas.microsoft.com/office/word/2018/wordml" xmlns:w16sdtdh="http://schemas.microsoft.com/office/word/2020/wordml/sdtdatahash" xmlns:w16sdtfl="http://schemas.microsoft.com/office/word/2024/wordml/sdtformatlock" xmlns:w16se="http://schemas.microsoft.com/office/word/2015/wordml/symex" xmlns:w16du="http://schemas.microsoft.com/office/word/2023/wordml/word16du" xmlns:wne="http://schemas.microsoft.com/office/word/2006/wordml" mc:Ignorable="w14 w15 w16se w16cid w16 w16cex w16sdtdh w16sdtfl w16du wp14">
   <w:body>
-    <w:p>
-      <w:pPr>
-        <w:jc w:val="center"/>
-      </w:pPr>
-      <w:r>
-        <w:rPr>
-          <w:b/>
-          <w:i/>
-          <w:sz w:val="22"/>
-          <w:color w:val="666666"/>
-        </w:rPr>
-        <w:t xml:space="preserve">COMPLETE IN-TEXT MANUSCRIPT (assembled 24 May 2026). Tables and figures embedded inline at their cross-reference points. This is the editing surface for the SIR submission. Note: Figure 4 and Figure 5 originally had near-identical captions in the source files — please verify which figure goes in which slot.</w:t>
-      </w:r>
-    </w:p>
     <w:p>
       <w:pPr>
         <w:spacing w:line="480" w:lineRule="auto"/>
@@ -33,27 +19,7 @@
           <w:bCs/>
           <w:lang w:val="en-US"/>
         </w:rPr>
-        <w:t xml:space="preserve">Quantifying hidden exploitation: Dual method prevalence estimates of </w:t>
-      </w:r>
-      <w:proofErr w:type="spellStart"/>
-      <w:r>
-        <w:rPr>
-          <w:rFonts w:ascii="var(--bs-body-font-family)" w:hAnsi="var(--bs-body-font-family)"/>
-          <w:b/>
-          <w:bCs/>
-          <w:lang w:val="en-US"/>
-        </w:rPr>
-        <w:t>labour</w:t>
-      </w:r>
-      <w:proofErr w:type="spellEnd"/>
-      <w:r>
-        <w:rPr>
-          <w:rFonts w:ascii="var(--bs-body-font-family)" w:hAnsi="var(--bs-body-font-family)"/>
-          <w:b/>
-          <w:bCs/>
-          <w:lang w:val="en-US"/>
-        </w:rPr>
-        <w:t xml:space="preserve"> exploitation among domestic workers in the United Kingdom  </w:t>
+        <w:t xml:space="preserve">Quantifying hidden exploitation: Dual method prevalence estimates of labour exploitation among domestic workers in the United Kingdom  </w:t>
       </w:r>
     </w:p>
     <w:p>
@@ -87,12 +53,6 @@
           <w:lang w:val="en-US"/>
         </w:rPr>
       </w:pPr>
-      <w:proofErr w:type="spellStart"/>
-      <w:proofErr w:type="spellEnd"/>
-      <w:proofErr w:type="spellStart"/>
-      <w:proofErr w:type="spellEnd"/>
-      <w:proofErr w:type="spellStart"/>
-      <w:proofErr w:type="spellEnd"/>
       <w:r>
         <w:t>Forced labour and labour exploitation are recognised under SDG Target 8.7 as priorities for elimination by 2030, yet the populations affected — undocumented migrant workers, domestic workers, sex workers, agricultural day labourers — are largely invisible to the household surveys on which official social indicators rely. Conventional measurement understates prevalence, often by an order of magnitude, and provides no actionable baseline against which progress toward SDG 8.7 can be assessed. This paper makes two contributions to the measurement of modern slavery among hidden vulnerable populations. First, we apply respondent-driven sampling (RDS) and the network scale-up method (NSUM) to the same survey instrument, eliciting both ego-based reports (what respondents say about themselves) and alter-based reports (what respondents say about people they know) for an identical set of indicators on the same respondents. This dual-method design lets the two estimators triangulate prevalence and, where they diverge, exposes how the visibility of different exploitation behaviours within personal networks shapes what each method 'sees'. Second, we operationalise modern slavery as a graded hierarchy of five ILO-aligned indicators, using the ILO's own operational distinction between 'medium' indicators (multiple needed to indicate forced labour: excessive working hours, pay-related issues, limited access to help) and 'strong' indicators (any one alone sufficient: threats and abuse, document and passport withholding). This hierarchy treats exploitation as a spectrum of severity rather than a binary condition. We apply the approach to UK domestic workers, the hardest realistic case in a developed-economy setting, and report per-indicator prevalence estimates with bootstrap and Bayesian uncertainty intervals. The methodology generalises to other hidden populations relevant to SDG 8.7 monitoring.</w:t>
       </w:r>
@@ -110,6 +70,7 @@
           <w:rStyle w:val="Strong"/>
           <w:lang w:val="en-US"/>
         </w:rPr>
+        <w:lastRenderedPageBreak/>
         <w:t>Key words</w:t>
       </w:r>
     </w:p>
@@ -126,23 +87,7 @@
           <w:rFonts w:ascii="var(--bs-body-font-family)" w:hAnsi="var(--bs-body-font-family)"/>
           <w:lang w:val="en-US"/>
         </w:rPr>
-        <w:t xml:space="preserve">Prevalence estimation; </w:t>
-      </w:r>
-      <w:proofErr w:type="spellStart"/>
-      <w:r>
-        <w:rPr>
-          <w:rFonts w:ascii="var(--bs-body-font-family)" w:hAnsi="var(--bs-body-font-family)"/>
-          <w:lang w:val="en-US"/>
-        </w:rPr>
-        <w:t>labour</w:t>
-      </w:r>
-      <w:proofErr w:type="spellEnd"/>
-      <w:r>
-        <w:rPr>
-          <w:rFonts w:ascii="var(--bs-body-font-family)" w:hAnsi="var(--bs-body-font-family)"/>
-          <w:lang w:val="en-US"/>
-        </w:rPr>
-        <w:t xml:space="preserve"> exploitation risk; </w:t>
+        <w:t xml:space="preserve">Prevalence estimation; labour exploitation risk; </w:t>
       </w:r>
       <w:r>
         <w:rPr>
@@ -216,20 +161,12 @@
           <w:lang w:val="en-US"/>
         </w:rPr>
       </w:pPr>
-      <w:proofErr w:type="spellStart"/>
-      <w:proofErr w:type="spellEnd"/>
-      <w:proofErr w:type="spellStart"/>
-      <w:proofErr w:type="spellEnd"/>
-      <w:proofErr w:type="spellStart"/>
-      <w:proofErr w:type="spellEnd"/>
-      <w:proofErr w:type="spellStart"/>
-      <w:proofErr w:type="spellEnd"/>
-      <w:proofErr w:type="spellStart"/>
-      <w:proofErr w:type="spellEnd"/>
-      <w:proofErr w:type="spellStart"/>
-      <w:proofErr w:type="spellEnd"/>
-      <w:r>
-        <w:t>Modern slavery — forced labour, debt bondage, document and identity-document withholding, and related coercive practices — is named under Sustainable Development Goal Target 8.7 as a priority for elimination by 2030. Reliable prevalence measurement is a precondition for monitoring that target, yet the populations most affected are largely invisible to the household and labour-force surveys on which official social indicators rely. Conventional household surveys underestimate prevalence in this domain by an order of magnitude or more, both because the populations affected (undocumented migrants, live-in domestic workers, sex workers, agricultural day labourers) are excluded from sampling frames, and because exploitation behaviours — especially those at the more severe end of the spectrum — are typically not self-reported even when the respondent is contacted. The civil-society and grey-literature evidence base on UK domestic workers (Kalayaan 2008; Latin American Women's Rights Service 2023) is qualitatively rich but does not yield population-level prevalence estimates suitable for SDG monitoring or comparison across populations. The International Labour Organization's eleven indicators of forced labour (ILO 2012, 2017) provide an operational framework for measuring modern slavery, but the empirical question of which indicators are observable through which survey design remains open. Studies typically apply one design — household survey, respondent-driven sampling (RDS), or the network scale-up method (NSUM) — and report prevalence accordingly. None to our knowledge applies both RDS and NSUM to the same survey instrument for the same indicators, the design that would allow direct triangulation of ego-based against alter-based estimates and, where the two diverge, diagnostic inference about which exploitation behaviours are visible within personal networks and which are not.</w:t>
+      <w:r>
+        <w:t xml:space="preserve">Modern slavery — forced labour, debt bondage, document and identity-document withholding, and related coercive practices — is named under Sustainable Development Goal Target 8.7 as a priority for elimination by 2030. Reliable prevalence measurement is a precondition for monitoring that target, yet the populations most affected are largely invisible to the household and labour-force surveys on which official social indicators rely. Conventional household surveys underestimate prevalence in this domain by an order of magnitude or more, both because the populations affected (undocumented migrants, live-in domestic workers, sex workers, agricultural day labourers) are excluded from sampling frames, and because exploitation behaviours — especially those at the more severe end of the spectrum — are typically not self-reported even when the respondent is contacted. The civil-society and grey-literature evidence base on UK domestic workers (Kalayaan 2008; Latin American Women's Rights Service 2023) is qualitatively rich but does not yield population-level prevalence estimates suitable for SDG monitoring or comparison across populations. The International Labour Organization's eleven indicators of forced labour (ILO 2012, 2017) provide an operational framework for measuring modern slavery, but the empirical question of which indicators are observable through which survey design remains open. Studies typically apply one design — household survey, respondent-driven sampling (RDS), or the network scale-up method (NSUM) — and report prevalence accordingly. None to our knowledge applies both RDS and NSUM to the same survey instrument for the same indicators, the design that would allow direct triangulation of ego-based against alter-based estimates and, where the two </w:t>
+      </w:r>
+      <w:r>
+        <w:lastRenderedPageBreak/>
+        <w:t>diverge, diagnostic inference about which exploitation behaviours are visible within personal networks and which are not.</w:t>
       </w:r>
     </w:p>
     <w:p>
@@ -241,12 +178,6 @@
           <w:lang w:val="en-US"/>
         </w:rPr>
       </w:pPr>
-      <w:proofErr w:type="spellStart"/>
-      <w:proofErr w:type="spellEnd"/>
-      <w:proofErr w:type="spellStart"/>
-      <w:proofErr w:type="spellEnd"/>
-      <w:proofErr w:type="spellStart"/>
-      <w:proofErr w:type="spellEnd"/>
       <w:r>
         <w:t>This paper makes two contributions. First, we apply RDS and NSUM to the same survey instrument with the same respondents, eliciting ego-based and alter-based estimates of an identical set of five ILO-aligned indicators. This dual-method design lets the two estimators triangulate prevalence, and where they diverge, exposes the visibility gradient of different exploitation behaviours within workers' personal networks. Second, we operationalise modern slavery as a graded hierarchy of indicators rather than a binary condition, organised around the ILO's operational distinction (ILO 2012, 2017) between 'medium' indicators (multiple required to indicate forced labour: excessive working hours, pay-related issues, limited access to help) and 'strong' indicators (any one alone sufficient: threats and abuse, document and passport withholding). This hierarchy lets a single survey instrument capture exploitation across the full spectrum of severity and supports a continuous risk index for analyses that need one. We demonstrate the approach with a respondent-driven sample of 85 UK migrant domestic workers, the hardest realistic case for measurement in a developed-economy setting; the methodology generalises to other hidden populations relevant to SDG 8.7 monitoring.</w:t>
       </w:r>
@@ -299,31 +230,21 @@
           <w:lang w:val="en-US"/>
         </w:rPr>
       </w:pPr>
-      <w:proofErr w:type="spellStart"/>
-      <w:proofErr w:type="spellEnd"/>
-      <w:proofErr w:type="spellStart"/>
-      <w:proofErr w:type="spellEnd"/>
-      <w:proofErr w:type="spellStart"/>
-      <w:proofErr w:type="spellEnd"/>
-      <w:proofErr w:type="spellStart"/>
-      <w:proofErr w:type="spellEnd"/>
-      <w:proofErr w:type="spellStart"/>
-      <w:proofErr w:type="spellEnd"/>
-      <w:proofErr w:type="gramStart"/>
-      <w:proofErr w:type="gramEnd"/>
-      <w:proofErr w:type="spellStart"/>
-      <w:proofErr w:type="spellEnd"/>
-      <w:proofErr w:type="spellStart"/>
-      <w:proofErr w:type="spellEnd"/>
-      <w:proofErr w:type="spellStart"/>
-      <w:proofErr w:type="spellEnd"/>
-      <w:r>
-        <w:t>The International Labour Organization's eleven indicators of forced labour (ILO 2012, 2017) provide the canonical operational framework for measuring modern slavery. The ILO distinguishes two grades of indicator: 'medium' indicators (excessive overtime, wage withholding, debt bondage, restriction of movement, isolation, abusive working and living conditions, abuse of vulnerability, deception) whose presence individually is suggestive but not definitive of forced labour, and 'strong' indicators (intimidation and threats, physical and sexual violence, retention of identity documents) any one of which alone is sufficient to indicate forced labour. This medium/strong distinction is itself a graded hierarchy of evidentiary weight, not a binary. We measure five indicators across that hierarchy, chosen to span the ILO conceptual space efficiently within the constraints of a matched-instrument ego/alter survey design. Three are medium indicators — excessive working hours, pay-related issues (combining wage withholding with elements of debt bondage), and limited access to help (combining restriction of movement with isolation, as both manifest in the same observable behaviour in the domestic-work context). Two are strong indicators — threats and abuse (combining intimidation/threats with physical and sexual violence, which prior qualitative work suggests co-occur in this population: Yilmaz and Emberson 2023) and document and passport withholding. The remaining four ILO indicators — abuse of vulnerability, deception, induced addiction, and sale of a person — were not measured: the first two are too retrospective and judgemental to elicit reliably through a brief survey, and the last two are too rare in the UK domestic-work context to estimate meaningfully at our sample size (n=85). Where appropriate we note this scope limitation in the discussion of results.</w:t>
-      </w:r>
-    </w:p>
-    <w:p>
-      <w:r>
-        <w:t>The composite risk index we construct is a synthetic indicator in the sense of Mazziotta and Pareto (2013, 2016), aggregating five binary indicators of labour exploitation into a single continuous quality-of-life-relevant measure. The five indicators correspond to formative rather than reflective measurement: an individual is exploited if they are subject to any of these conditions, and the conditions are constitutive rather than reflective of an underlying latent severity (Diamantopoulos and Siguaw 2006; Diamantopoulos et al. 2008). We adopt a non-compensatory weighting scheme in which the presence of any indicator contributes positive weight to the index but no indicator can offset another, consistent with the ILO operational definition of forced labour (ILO 2012, 2017). Polarity is uniform — each indicator has the same direction with respect to the latent construct of exploitation severity. The choice of aggregation follows the guidance of Maggino (2017) and the SIR editorial team (Bartram et al. 2024): we use a weighted-additive index with the five ILO indicators given equal substantive weight (with a 0.35 weight assigned separately to NRM referral, reflecting its diagnostic priority in UK policy practice), and we conduct robustness assessment by perturbing the weights.</w:t>
+      <w:r>
+        <w:t xml:space="preserve">The International Labour Organization's eleven indicators of forced labour (ILO 2012, 2017) provide the canonical operational framework for measuring modern slavery. The ILO </w:t>
+      </w:r>
+      <w:r>
+        <w:lastRenderedPageBreak/>
+        <w:t>distinguishes two grades of indicator: 'medium' indicators (excessive overtime, wage withholding, debt bondage, restriction of movement, isolation, abusive working and living conditions, abuse of vulnerability, deception) whose presence individually is suggestive but not definitive of forced labour, and 'strong' indicators (intimidation and threats, physical and sexual violence, retention of identity documents) any one of which alone is sufficient to indicate forced labour. This medium/strong distinction is itself a graded hierarchy of evidentiary weight, not a binary. We measure five indicators across that hierarchy, chosen to span the ILO conceptual space efficiently within the constraints of a matched-instrument ego/alter survey design. Three are medium indicators — excessive working hours, pay-related issues (combining wage withholding with elements of debt bondage), and limited access to help (combining restriction of movement with isolation, as both manifest in the same observable behaviour in the domestic-work context). Two are strong indicators — threats and abuse (combining intimidation/threats with physical and sexual violence, which prior qualitative work suggests co-occur in this population: Yilmaz and Emberson 2023) and document and passport withholding. The remaining four ILO indicators — abuse of vulnerability, deception, induced addiction, and sale of a person — were not measured: the first two are too retrospective and judgemental to elicit reliably through a brief survey, and the last two are too rare in the UK domestic-work context to estimate meaningfully at our sample size (n=85). Where appropriate we note this scope limitation in the discussion of results.</w:t>
+      </w:r>
+    </w:p>
+    <w:p>
+      <w:r>
+        <w:t xml:space="preserve">The composite risk index we construct is a synthetic indicator in the sense of Mazziotta and Pareto (2013, 2016), aggregating five binary indicators of labour exploitation into a single continuous quality-of-life-relevant measure. The five indicators correspond to formative rather than reflective measurement: an individual is exploited if they are subject to any of these conditions, and the conditions are constitutive rather than reflective of an underlying latent severity (Diamantopoulos and Siguaw 2006; Diamantopoulos et al. 2008). We adopt a non-compensatory weighting scheme in which the presence of any indicator contributes positive weight to the index but no indicator can offset another, consistent with the ILO operational definition of forced labour (ILO 2012, 2017). Polarity is uniform — each indicator has the same direction with respect to the latent construct of exploitation severity. The choice of aggregation follows the guidance of Maggino (2017) and the SIR editorial team (Bartram et al. 2024): we use a weighted-additive index with the five ILO indicators given equal substantive </w:t>
+      </w:r>
+      <w:r>
+        <w:lastRenderedPageBreak/>
+        <w:t>weight (with a 0.35 weight assigned separately to NRM referral, reflecting its diagnostic priority in UK policy practice), and we conduct robustness assessment by perturbing the weights.</w:t>
       </w:r>
     </w:p>
     <w:p>
@@ -372,39 +293,7 @@
           <w:rFonts w:ascii="var(--bs-body-font-family)" w:hAnsi="var(--bs-body-font-family)"/>
           <w:lang w:val="en-US"/>
         </w:rPr>
-        <w:t xml:space="preserve">In our study, we </w:t>
-      </w:r>
-      <w:proofErr w:type="spellStart"/>
-      <w:r>
-        <w:rPr>
-          <w:rFonts w:ascii="var(--bs-body-font-family)" w:hAnsi="var(--bs-body-font-family)"/>
-          <w:lang w:val="en-US"/>
-        </w:rPr>
-        <w:t>conceptualise</w:t>
-      </w:r>
-      <w:proofErr w:type="spellEnd"/>
-      <w:r>
-        <w:rPr>
-          <w:rFonts w:ascii="var(--bs-body-font-family)" w:hAnsi="var(--bs-body-font-family)"/>
-          <w:lang w:val="en-US"/>
-        </w:rPr>
-        <w:t xml:space="preserve"> the risk of </w:t>
-      </w:r>
-      <w:proofErr w:type="spellStart"/>
-      <w:r>
-        <w:rPr>
-          <w:rFonts w:ascii="var(--bs-body-font-family)" w:hAnsi="var(--bs-body-font-family)"/>
-          <w:lang w:val="en-US"/>
-        </w:rPr>
-        <w:t>labour</w:t>
-      </w:r>
-      <w:proofErr w:type="spellEnd"/>
-      <w:r>
-        <w:rPr>
-          <w:rFonts w:ascii="var(--bs-body-font-family)" w:hAnsi="var(--bs-body-font-family)"/>
-          <w:lang w:val="en-US"/>
-        </w:rPr>
-        <w:t xml:space="preserve"> exploitation from the workers’ perspective.</w:t>
+        <w:t>In our study, we conceptualise the risk of labour exploitation from the workers’ perspective.</w:t>
       </w:r>
       <w:r>
         <w:rPr>
@@ -418,63 +307,7 @@
           <w:rFonts w:ascii="var(--bs-body-font-family)" w:hAnsi="var(--bs-body-font-family)"/>
           <w:lang w:val="en-US"/>
         </w:rPr>
-        <w:t xml:space="preserve">We conceive severe forms of </w:t>
-      </w:r>
-      <w:proofErr w:type="spellStart"/>
-      <w:r>
-        <w:rPr>
-          <w:rFonts w:ascii="var(--bs-body-font-family)" w:hAnsi="var(--bs-body-font-family)"/>
-          <w:lang w:val="en-US"/>
-        </w:rPr>
-        <w:t>labour</w:t>
-      </w:r>
-      <w:proofErr w:type="spellEnd"/>
-      <w:r>
-        <w:rPr>
-          <w:rFonts w:ascii="var(--bs-body-font-family)" w:hAnsi="var(--bs-body-font-family)"/>
-          <w:lang w:val="en-US"/>
-        </w:rPr>
-        <w:t xml:space="preserve"> exploitation such as forced </w:t>
-      </w:r>
-      <w:proofErr w:type="spellStart"/>
-      <w:r>
-        <w:rPr>
-          <w:rFonts w:ascii="var(--bs-body-font-family)" w:hAnsi="var(--bs-body-font-family)"/>
-          <w:lang w:val="en-US"/>
-        </w:rPr>
-        <w:t>labour</w:t>
-      </w:r>
-      <w:proofErr w:type="spellEnd"/>
-      <w:r>
-        <w:rPr>
-          <w:rFonts w:ascii="var(--bs-body-font-family)" w:hAnsi="var(--bs-body-font-family)"/>
-          <w:lang w:val="en-US"/>
-        </w:rPr>
-        <w:t xml:space="preserve"> as one </w:t>
-      </w:r>
-      <w:r>
-        <w:rPr>
-          <w:rFonts w:ascii="var(--bs-body-font-family)" w:hAnsi="var(--bs-body-font-family)"/>
-          <w:lang w:val="en-US"/>
-        </w:rPr>
-        <w:lastRenderedPageBreak/>
-        <w:t xml:space="preserve">end of a spectrum ranging from illegal employment practices that constitute </w:t>
-      </w:r>
-      <w:proofErr w:type="spellStart"/>
-      <w:r>
-        <w:rPr>
-          <w:rFonts w:ascii="var(--bs-body-font-family)" w:hAnsi="var(--bs-body-font-family)"/>
-          <w:lang w:val="en-US"/>
-        </w:rPr>
-        <w:t>labour</w:t>
-      </w:r>
-      <w:proofErr w:type="spellEnd"/>
-      <w:r>
-        <w:rPr>
-          <w:rFonts w:ascii="var(--bs-body-font-family)" w:hAnsi="var(--bs-body-font-family)"/>
-          <w:lang w:val="en-US"/>
-        </w:rPr>
-        <w:t xml:space="preserve"> abuse, such as wage</w:t>
+        <w:t>We conceive severe forms of labour exploitation such as forced labour as one end of a spectrum ranging from illegal employment practices that constitute labour abuse, such as wage</w:t>
       </w:r>
       <w:r>
         <w:rPr>
@@ -516,17 +349,8 @@
           <w:rFonts w:ascii="var(--bs-body-font-family)" w:hAnsi="var(--bs-body-font-family)"/>
           <w:lang w:val="en-US"/>
         </w:rPr>
-        <w:t xml:space="preserve">of this personal risk permits a degree of risk to be assigned to various clusters of forced </w:t>
-      </w:r>
-      <w:proofErr w:type="spellStart"/>
-      <w:r>
-        <w:rPr>
-          <w:rFonts w:ascii="var(--bs-body-font-family)" w:hAnsi="var(--bs-body-font-family)"/>
-          <w:lang w:val="en-US"/>
-        </w:rPr>
-        <w:t>labour</w:t>
-      </w:r>
-      <w:proofErr w:type="spellEnd"/>
+        <w:t>of this personal risk permits a degree of risk to be assigned to various clusters of forced labour</w:t>
+      </w:r>
       <w:r>
         <w:rPr>
           <w:rFonts w:ascii="var(--bs-body-font-family)" w:hAnsi="var(--bs-body-font-family)"/>
@@ -539,17 +363,8 @@
           <w:rFonts w:ascii="var(--bs-body-font-family)" w:hAnsi="var(--bs-body-font-family)"/>
           <w:lang w:val="en-US"/>
         </w:rPr>
-        <w:t xml:space="preserve">indicators with the more indicators present, the stronger the likelihood that the working conditions may be considered exploitative. Along with this novel conceptualization of </w:t>
-      </w:r>
-      <w:proofErr w:type="spellStart"/>
-      <w:r>
-        <w:rPr>
-          <w:rFonts w:ascii="var(--bs-body-font-family)" w:hAnsi="var(--bs-body-font-family)"/>
-          <w:lang w:val="en-US"/>
-        </w:rPr>
-        <w:t>labour</w:t>
-      </w:r>
-      <w:proofErr w:type="spellEnd"/>
+        <w:t>indicators with the more indicators present, the stronger the likelihood that the working conditions may be considered exploitative. Along with this novel conceptualization of labour</w:t>
+      </w:r>
       <w:r>
         <w:rPr>
           <w:rFonts w:ascii="var(--bs-body-font-family)" w:hAnsi="var(--bs-body-font-family)"/>
@@ -618,17 +433,8 @@
           <w:rFonts w:ascii="var(--bs-body-font-family)" w:hAnsi="var(--bs-body-font-family)"/>
           <w:lang w:val="en-US"/>
         </w:rPr>
-        <w:t xml:space="preserve">These indicators allowed us to </w:t>
-      </w:r>
-      <w:proofErr w:type="spellStart"/>
-      <w:r>
-        <w:rPr>
-          <w:rFonts w:ascii="var(--bs-body-font-family)" w:hAnsi="var(--bs-body-font-family)"/>
-          <w:lang w:val="en-US"/>
-        </w:rPr>
-        <w:t>operationalise</w:t>
-      </w:r>
-      <w:proofErr w:type="spellEnd"/>
+        <w:t>These indicators allowed us to operationalise</w:t>
+      </w:r>
       <w:r>
         <w:rPr>
           <w:rFonts w:ascii="var(--bs-body-font-family)" w:hAnsi="var(--bs-body-font-family)"/>
@@ -678,15 +484,7 @@
         <w:divId w:val="1975518704"/>
       </w:pPr>
       <w:r>
-        <w:t xml:space="preserve">Case Setting: Labour Exploitation Risk Among Transnational Migrant Domestic Workers </w:t>
-      </w:r>
-      <w:proofErr w:type="gramStart"/>
-      <w:r>
-        <w:t>In</w:t>
-      </w:r>
-      <w:proofErr w:type="gramEnd"/>
-      <w:r>
-        <w:t xml:space="preserve"> The UK</w:t>
+        <w:t>Case Setting: Labour Exploitation Risk Among Transnational Migrant Domestic Workers In The UK</w:t>
       </w:r>
     </w:p>
     <w:p>
@@ -802,23 +600,21 @@
         </w:rPr>
         <w:t xml:space="preserve">. </w:t>
       </w:r>
-      <w:proofErr w:type="spellStart"/>
       <w:r>
         <w:rPr>
           <w:rStyle w:val="citation"/>
           <w:rFonts w:ascii="var(--bs-body-font-family)" w:hAnsi="var(--bs-body-font-family)"/>
           <w:lang w:val="en-US"/>
         </w:rPr>
-        <w:t>Manoudi</w:t>
-      </w:r>
-      <w:proofErr w:type="spellEnd"/>
+        <w:t xml:space="preserve">Manoudi et al. </w:t>
+      </w:r>
       <w:r>
         <w:rPr>
           <w:rStyle w:val="citation"/>
-          <w:rFonts w:ascii="var(--bs-body-font-family)" w:hAnsi="var(--bs-body-font-family)"/>
-          <w:lang w:val="en-US"/>
-        </w:rPr>
-        <w:t xml:space="preserve"> et al. </w:t>
+          <w:rFonts w:ascii="var(--bs-body-font-family)" w:hAnsi="var(--bs-body-font-family)" w:hint="eastAsia"/>
+          <w:lang w:val="en-US"/>
+        </w:rPr>
+        <w:fldChar w:fldCharType="begin"/>
       </w:r>
       <w:r>
         <w:rPr>
@@ -826,7 +622,7 @@
           <w:rFonts w:ascii="var(--bs-body-font-family)" w:hAnsi="var(--bs-body-font-family)" w:hint="eastAsia"/>
           <w:lang w:val="en-US"/>
         </w:rPr>
-        <w:fldChar w:fldCharType="begin"/>
+        <w:instrText xml:space="preserve"> ADDIN ZOTERO_ITEM CSL_CITATION {"citationID":"E11lMN6R","properties":{"formattedCitation":"(2018)","plainCitation":"(2018)","noteIndex":0},"citationItems":[{"id":189,"uris":["http://zotero.org/users/local/nMxJkNMP/items/ZSZ626D9"],"itemData":{"id":189,"type":"report","genre":"Synthesis Report ECE Thematic Review","publisher":"European Commission","title":"An analysis of Personal and Household Services to support work life balance for working parents and carers - Google Search","URL":"https://www.google.com/search?q=An+analysis+of+Personal+and+Household+Services+to+support+work+life+balance+for+working+parents+and+carers&amp;rlz=1C1GCEB_enGB932GB935&amp;oq=An+analysis+of+Personal+and+Household+Services+to+support+work+life+balance+for+working+parents+and+carers&amp;gs_lcrp=EgZjaHJvbWUyBggAEEUYOdIBCDIzNjNqMGo3qAIAsAIA&amp;sourceid=chrome&amp;ie=UTF-8","author":[{"family":"Manoudi","given":"A."},{"family":"Weber","given":"T."},{"family":"Scott","given":"D."},{"family":"Hawley Woodall","given":"J."}],"accessed":{"date-parts":[["2024",10,28]]},"issued":{"date-parts":[["2018"]]}},"suppress-author":true}],"schema":"https://github.com/citation-style-language/schema/raw/master/csl-citation.json"} </w:instrText>
       </w:r>
       <w:r>
         <w:rPr>
@@ -834,7 +630,13 @@
           <w:rFonts w:ascii="var(--bs-body-font-family)" w:hAnsi="var(--bs-body-font-family)" w:hint="eastAsia"/>
           <w:lang w:val="en-US"/>
         </w:rPr>
-        <w:instrText xml:space="preserve"> ADDIN ZOTERO_ITEM CSL_CITATION {"citationID":"E11lMN6R","properties":{"formattedCitation":"(2018)","plainCitation":"(2018)","noteIndex":0},"citationItems":[{"id":189,"uris":["http://zotero.org/users/local/nMxJkNMP/items/ZSZ626D9"],"itemData":{"id":189,"type":"report","genre":"Synthesis Report ECE Thematic Review","publisher":"European Commission","title":"An analysis of Personal and Household Services to support work life balance for working parents and carers - Google Search","URL":"https://www.google.com/search?q=An+analysis+of+Personal+and+Household+Services+to+support+work+life+balance+for+working+parents+and+carers&amp;rlz=1C1GCEB_enGB932GB935&amp;oq=An+analysis+of+Personal+and+Household+Services+to+support+work+life+balance+for+working+parents+and+carers&amp;gs_lcrp=EgZjaHJvbWUyBggAEEUYOdIBCDIzNjNqMGo3qAIAsAIA&amp;sourceid=chrome&amp;ie=UTF-8","author":[{"family":"Manoudi","given":"A."},{"family":"Weber","given":"T."},{"family":"Scott","given":"D."},{"family":"Hawley Woodall","given":"J."}],"accessed":{"date-parts":[["2024",10,28]]},"issued":{"date-parts":[["2018"]]}},"suppress-author":true}],"schema":"https://github.com/citation-style-language/schema/raw/master/csl-citation.json"} </w:instrText>
+        <w:fldChar w:fldCharType="separate"/>
+      </w:r>
+      <w:r>
+        <w:rPr>
+          <w:rFonts w:ascii="var(--bs-body-font-family)" w:hAnsi="var(--bs-body-font-family)"/>
+        </w:rPr>
+        <w:t>(2018)</w:t>
       </w:r>
       <w:r>
         <w:rPr>
@@ -842,25 +644,11 @@
           <w:rFonts w:ascii="var(--bs-body-font-family)" w:hAnsi="var(--bs-body-font-family)" w:hint="eastAsia"/>
           <w:lang w:val="en-US"/>
         </w:rPr>
-        <w:fldChar w:fldCharType="separate"/>
-      </w:r>
-      <w:r>
-        <w:rPr>
-          <w:rFonts w:ascii="var(--bs-body-font-family)" w:hAnsi="var(--bs-body-font-family)"/>
-        </w:rPr>
-        <w:t>(2018)</w:t>
+        <w:fldChar w:fldCharType="end"/>
       </w:r>
       <w:r>
         <w:rPr>
           <w:rStyle w:val="citation"/>
-          <w:rFonts w:ascii="var(--bs-body-font-family)" w:hAnsi="var(--bs-body-font-family)" w:hint="eastAsia"/>
-          <w:lang w:val="en-US"/>
-        </w:rPr>
-        <w:fldChar w:fldCharType="end"/>
-      </w:r>
-      <w:r>
-        <w:rPr>
-          <w:rStyle w:val="citation"/>
           <w:rFonts w:ascii="var(--bs-body-font-family)" w:hAnsi="var(--bs-body-font-family)"/>
           <w:lang w:val="en-US"/>
         </w:rPr>
@@ -871,7 +659,7 @@
           <w:rFonts w:ascii="var(--bs-body-font-family)" w:hAnsi="var(--bs-body-font-family)"/>
           <w:lang w:val="en-US"/>
         </w:rPr>
-        <w:t xml:space="preserve">highlight that the PHS sector is dominated by women and migrants, with many undeclared foreign workers. Detailed statistics related to the country of origin of domestic workers migrating to work in PHS in the UK are difficult to isolate before 2019. Since that time, annual migration has fluctuated – falling sharply in 2021 due in part to the COVID-19 pandemic, before later rising again above pre-pandemic levels. In the year to December 2022, the </w:t>
+        <w:t xml:space="preserve">highlight </w:t>
       </w:r>
       <w:r>
         <w:rPr>
@@ -879,7 +667,7 @@
           <w:lang w:val="en-US"/>
         </w:rPr>
         <w:lastRenderedPageBreak/>
-        <w:t xml:space="preserve">UK Home Office reported that it had issued 18,533 Overseas Domestic Worker visas </w:t>
+        <w:t xml:space="preserve">that the PHS sector is dominated by women and migrants, with many undeclared foreign workers. Detailed statistics related to the country of origin of domestic workers migrating to work in PHS in the UK are difficult to isolate before 2019. Since that time, annual migration has fluctuated – falling sharply in 2021 due in part to the COVID-19 pandemic, before later rising again above pre-pandemic levels. In the year to December 2022, the UK Home Office reported that it had issued 18,533 Overseas Domestic Worker visas </w:t>
       </w:r>
       <w:r>
         <w:rPr>
@@ -952,23 +740,7 @@
           <w:rFonts w:ascii="var(--bs-body-font-family)" w:hAnsi="var(--bs-body-font-family)"/>
           <w:lang w:val="en-US"/>
         </w:rPr>
-        <w:t xml:space="preserve">a long history of reports of exploitation in the domestic work sector in the UK. In 2008, the civil society </w:t>
-      </w:r>
-      <w:proofErr w:type="spellStart"/>
-      <w:r>
-        <w:rPr>
-          <w:rFonts w:ascii="var(--bs-body-font-family)" w:hAnsi="var(--bs-body-font-family)"/>
-          <w:lang w:val="en-US"/>
-        </w:rPr>
-        <w:t>organisation</w:t>
-      </w:r>
-      <w:proofErr w:type="spellEnd"/>
-      <w:r>
-        <w:rPr>
-          <w:rFonts w:ascii="var(--bs-body-font-family)" w:hAnsi="var(--bs-body-font-family)"/>
-          <w:lang w:val="en-US"/>
-        </w:rPr>
-        <w:t xml:space="preserve"> Kalayaan, which was formed to campaign for the formal recognition of migrant domestic workers’ rights in the UK, reported on the impact of proposed changes to the UK immigration system on migrant domestic workers </w:t>
+        <w:t xml:space="preserve">a long history of reports of exploitation in the domestic work sector in the UK. In 2008, the civil society organisation Kalayaan, which was formed to campaign for the formal recognition of migrant domestic workers’ rights in the UK, reported on the impact of proposed changes to the UK immigration system on migrant domestic workers </w:t>
       </w:r>
       <w:r>
         <w:rPr>
@@ -1009,23 +781,7 @@
           <w:rFonts w:ascii="var(--bs-body-font-family)" w:hAnsi="var(--bs-body-font-family)"/>
           <w:lang w:val="en-US"/>
         </w:rPr>
-        <w:t xml:space="preserve">. At this stage, new policies, including the development of a </w:t>
-      </w:r>
-      <w:proofErr w:type="spellStart"/>
-      <w:r>
-        <w:rPr>
-          <w:rFonts w:ascii="var(--bs-body-font-family)" w:hAnsi="var(--bs-body-font-family)"/>
-          <w:lang w:val="en-US"/>
-        </w:rPr>
-        <w:t>specialised</w:t>
-      </w:r>
-      <w:proofErr w:type="spellEnd"/>
-      <w:r>
-        <w:rPr>
-          <w:rFonts w:ascii="var(--bs-body-font-family)" w:hAnsi="var(--bs-body-font-family)"/>
-          <w:lang w:val="en-US"/>
-        </w:rPr>
-        <w:t xml:space="preserve"> visa allowing domestic workers to change employer during their stay were introduced. However, in 2012, these visa conditions were modified, tying domestic workers to a single employer and restricting the length of time that they are permitted to remain in the country to a period of six months </w:t>
+        <w:t xml:space="preserve">. At this stage, new policies, including the development of a specialised visa allowing domestic workers to change employer during their stay were introduced. However, in 2012, these visa conditions were modified, tying domestic workers to a single employer and restricting the length of time that they are permitted to remain in the country to a period of six months </w:t>
       </w:r>
       <w:r>
         <w:rPr>
@@ -1135,39 +891,7 @@
           <w:rFonts w:ascii="var(--bs-body-font-family)" w:hAnsi="var(--bs-body-font-family)"/>
           <w:lang w:val="en-US"/>
         </w:rPr>
-        <w:t xml:space="preserve"> domestic workers are vulnerable to abuse ranging </w:t>
-      </w:r>
-      <w:proofErr w:type="gramStart"/>
-      <w:r>
-        <w:rPr>
-          <w:rFonts w:ascii="var(--bs-body-font-family)" w:hAnsi="var(--bs-body-font-family)"/>
-          <w:lang w:val="en-US"/>
-        </w:rPr>
-        <w:t>from minor breaches of employment and health and safety law,</w:t>
-      </w:r>
-      <w:proofErr w:type="gramEnd"/>
-      <w:r>
-        <w:rPr>
-          <w:rFonts w:ascii="var(--bs-body-font-family)" w:hAnsi="var(--bs-body-font-family)"/>
-          <w:lang w:val="en-US"/>
-        </w:rPr>
-        <w:t xml:space="preserve"> to physical and sexual violence, slavery, forced </w:t>
-      </w:r>
-      <w:proofErr w:type="spellStart"/>
-      <w:r>
-        <w:rPr>
-          <w:rFonts w:ascii="var(--bs-body-font-family)" w:hAnsi="var(--bs-body-font-family)"/>
-          <w:lang w:val="en-US"/>
-        </w:rPr>
-        <w:t>labour</w:t>
-      </w:r>
-      <w:proofErr w:type="spellEnd"/>
-      <w:r>
-        <w:rPr>
-          <w:rFonts w:ascii="var(--bs-body-font-family)" w:hAnsi="var(--bs-body-font-family)"/>
-          <w:lang w:val="en-US"/>
-        </w:rPr>
-        <w:t xml:space="preserve"> and trafficking.</w:t>
+        <w:t xml:space="preserve"> domestic workers are vulnerable to abuse ranging from minor breaches of employment and health and safety law, to physical and sexual violence, slavery, forced labour and trafficking.</w:t>
       </w:r>
     </w:p>
     <w:p>
@@ -1185,23 +909,8 @@
           <w:rFonts w:ascii="var(--bs-body-font-family)" w:hAnsi="var(--bs-body-font-family)"/>
           <w:lang w:val="en-US"/>
         </w:rPr>
-        <w:t xml:space="preserve">That these conditions may persist is evidenced by a report from another civil society </w:t>
-      </w:r>
-      <w:proofErr w:type="spellStart"/>
-      <w:r>
-        <w:rPr>
-          <w:rFonts w:ascii="var(--bs-body-font-family)" w:hAnsi="var(--bs-body-font-family)"/>
-          <w:lang w:val="en-US"/>
-        </w:rPr>
-        <w:t>organisation</w:t>
-      </w:r>
-      <w:proofErr w:type="spellEnd"/>
-      <w:r>
-        <w:rPr>
-          <w:rFonts w:ascii="var(--bs-body-font-family)" w:hAnsi="var(--bs-body-font-family)"/>
-          <w:lang w:val="en-US"/>
-        </w:rPr>
-        <w:t>, the Latin American Women’s Rights Service. This report depicts high levels of isolation, exploitation and abuse including a failure by employers to provide written contracts or pay</w:t>
+        <w:lastRenderedPageBreak/>
+        <w:t>That these conditions may persist is evidenced by a report from another civil society organisation, the Latin American Women’s Rights Service. This report depicts high levels of isolation, exploitation and abuse including a failure by employers to provide written contracts or pay</w:t>
       </w:r>
       <w:r>
         <w:rPr>
@@ -1215,31 +924,7 @@
           <w:rFonts w:ascii="var(--bs-body-font-family)" w:hAnsi="var(--bs-body-font-family)"/>
           <w:lang w:val="en-US"/>
         </w:rPr>
-        <w:t xml:space="preserve">slips; breaches of verbal agreements; a requirement to perform different tasks from those indicated during recruitment; increasing working hours with little or no time off; excessive work days; a lack of paid holiday; many domestic workers not </w:t>
-      </w:r>
-      <w:r>
-        <w:rPr>
-          <w:rFonts w:ascii="var(--bs-body-font-family)" w:hAnsi="var(--bs-body-font-family)"/>
-          <w:lang w:val="en-US"/>
-        </w:rPr>
-        <w:lastRenderedPageBreak/>
-        <w:t xml:space="preserve">registered with a GP; sexual harassment in the workplace; verbal or physical abuse; employer surveillance; a lack of opportunity to change working conditions; isolation and fear of seeking help; and high reported levels of trafficking for </w:t>
-      </w:r>
-      <w:proofErr w:type="spellStart"/>
-      <w:r>
-        <w:rPr>
-          <w:rFonts w:ascii="var(--bs-body-font-family)" w:hAnsi="var(--bs-body-font-family)"/>
-          <w:lang w:val="en-US"/>
-        </w:rPr>
-        <w:t>labour</w:t>
-      </w:r>
-      <w:proofErr w:type="spellEnd"/>
-      <w:r>
-        <w:rPr>
-          <w:rFonts w:ascii="var(--bs-body-font-family)" w:hAnsi="var(--bs-body-font-family)"/>
-          <w:lang w:val="en-US"/>
-        </w:rPr>
-        <w:t xml:space="preserve"> exploitation </w:t>
+        <w:t xml:space="preserve">slips; breaches of verbal agreements; a requirement to perform different tasks from those indicated during recruitment; increasing working hours with little or no time off; excessive work days; a lack of paid holiday; many domestic workers not registered with a GP; sexual harassment in the workplace; verbal or physical abuse; employer surveillance; a lack of opportunity to change working conditions; isolation and fear of seeking help; and high reported levels of trafficking for labour exploitation </w:t>
       </w:r>
       <w:r>
         <w:rPr>
@@ -1326,15 +1011,7 @@
           <w:rFonts w:ascii="var(--bs-body-font-family)" w:hAnsi="var(--bs-body-font-family)"/>
           <w:lang w:val="en-US"/>
         </w:rPr>
-        <w:t xml:space="preserve">orked with civil society </w:t>
-      </w:r>
-      <w:proofErr w:type="spellStart"/>
-      <w:r>
-        <w:rPr>
-          <w:rFonts w:ascii="var(--bs-body-font-family)" w:hAnsi="var(--bs-body-font-family)"/>
-          <w:lang w:val="en-US"/>
-        </w:rPr>
-        <w:t>organis</w:t>
+        <w:t>orked with civil society organis</w:t>
       </w:r>
       <w:r>
         <w:rPr>
@@ -1348,15 +1025,7 @@
           <w:rFonts w:ascii="var(--bs-body-font-family)" w:hAnsi="var(--bs-body-font-family)"/>
           <w:lang w:val="en-US"/>
         </w:rPr>
-        <w:t>tions</w:t>
-      </w:r>
-      <w:proofErr w:type="spellEnd"/>
-      <w:r>
-        <w:rPr>
-          <w:rFonts w:ascii="var(--bs-body-font-family)" w:hAnsi="var(--bs-body-font-family)"/>
-          <w:lang w:val="en-US"/>
-        </w:rPr>
-        <w:t xml:space="preserve"> to</w:t>
+        <w:t>tions to</w:t>
       </w:r>
       <w:r>
         <w:rPr>
@@ -1501,7 +1170,15 @@
           <w:rFonts w:ascii="var(--bs-body-font-family)" w:hAnsi="var(--bs-body-font-family)"/>
           <w:lang w:val="en-US"/>
         </w:rPr>
-        <w:t>. It combines chain-referral sampling with a statistical framework to produce population estimates that adjust for network structure and differential recruitment probabilities. The method begins with a set of initial participants (“seeds”), who recruit peers from their social networks. Recruits, in turn, recruit others, creating waves of participation. Each participant reports their network degree (the number of eligible contacts they know), which is used to adjust for selection bias—especially the oversampling of high-degree individuals.</w:t>
+        <w:t xml:space="preserve">. It combines chain-referral sampling with a statistical framework to produce population estimates that adjust for network structure and differential recruitment probabilities. The method begins with a set of initial participants (“seeds”), who recruit peers from their social networks. Recruits, in turn, recruit others, creating waves of participation. </w:t>
+      </w:r>
+      <w:r>
+        <w:rPr>
+          <w:rFonts w:ascii="var(--bs-body-font-family)" w:hAnsi="var(--bs-body-font-family)"/>
+          <w:lang w:val="en-US"/>
+        </w:rPr>
+        <w:lastRenderedPageBreak/>
+        <w:t>Each participant reports their network degree (the number of eligible contacts they know), which is used to adjust for selection bias—especially the oversampling of high-degree individuals.</w:t>
       </w:r>
     </w:p>
     <w:p>
@@ -1616,31 +1293,7 @@
           <w:rFonts w:ascii="var(--bs-body-font-family)" w:hAnsi="var(--bs-body-font-family)"/>
           <w:lang w:val="en-US"/>
         </w:rPr>
-        <w:t xml:space="preserve">, and network-based referrals have been described as the only viable method to reach </w:t>
-      </w:r>
-      <w:r>
-        <w:rPr>
-          <w:rFonts w:ascii="var(--bs-body-font-family)" w:hAnsi="var(--bs-body-font-family)"/>
-          <w:lang w:val="en-US"/>
-        </w:rPr>
-        <w:lastRenderedPageBreak/>
-        <w:t xml:space="preserve">many types of </w:t>
-      </w:r>
-      <w:proofErr w:type="spellStart"/>
-      <w:r>
-        <w:rPr>
-          <w:rFonts w:ascii="var(--bs-body-font-family)" w:hAnsi="var(--bs-body-font-family)"/>
-          <w:lang w:val="en-US"/>
-        </w:rPr>
-        <w:t>labour</w:t>
-      </w:r>
-      <w:proofErr w:type="spellEnd"/>
-      <w:r>
-        <w:rPr>
-          <w:rFonts w:ascii="var(--bs-body-font-family)" w:hAnsi="var(--bs-body-font-family)"/>
-          <w:lang w:val="en-US"/>
-        </w:rPr>
-        <w:t xml:space="preserve"> trafficking victims </w:t>
+        <w:t xml:space="preserve">, and network-based referrals have been described as the only viable method to reach many types of labour trafficking victims </w:t>
       </w:r>
       <w:r>
         <w:rPr>
@@ -1736,23 +1389,7 @@
           <w:rFonts w:ascii="var(--bs-body-font-family)" w:hAnsi="var(--bs-body-font-family)"/>
           <w:lang w:val="en-US"/>
         </w:rPr>
-        <w:t xml:space="preserve">, </w:t>
-      </w:r>
-      <w:proofErr w:type="spellStart"/>
-      <w:r>
-        <w:rPr>
-          <w:rFonts w:ascii="var(--bs-body-font-family)" w:hAnsi="var(--bs-body-font-family)"/>
-          <w:lang w:val="en-US"/>
-        </w:rPr>
-        <w:t>labour</w:t>
-      </w:r>
-      <w:proofErr w:type="spellEnd"/>
-      <w:r>
-        <w:rPr>
-          <w:rFonts w:ascii="var(--bs-body-font-family)" w:hAnsi="var(--bs-body-font-family)"/>
-          <w:lang w:val="en-US"/>
-        </w:rPr>
-        <w:t xml:space="preserve"> trafficking in migrant communities </w:t>
+        <w:t xml:space="preserve">, labour trafficking in migrant communities </w:t>
       </w:r>
       <w:r>
         <w:rPr>
@@ -1807,23 +1444,7 @@
           <w:rFonts w:ascii="var(--bs-body-font-family)" w:hAnsi="var(--bs-body-font-family)"/>
           <w:lang w:val="en-US"/>
         </w:rPr>
-        <w:t xml:space="preserve">, child </w:t>
-      </w:r>
-      <w:proofErr w:type="spellStart"/>
-      <w:r>
-        <w:rPr>
-          <w:rFonts w:ascii="var(--bs-body-font-family)" w:hAnsi="var(--bs-body-font-family)"/>
-          <w:lang w:val="en-US"/>
-        </w:rPr>
-        <w:t>labour</w:t>
-      </w:r>
-      <w:proofErr w:type="spellEnd"/>
-      <w:r>
-        <w:rPr>
-          <w:rFonts w:ascii="var(--bs-body-font-family)" w:hAnsi="var(--bs-body-font-family)"/>
-          <w:lang w:val="en-US"/>
-        </w:rPr>
-        <w:t xml:space="preserve"> in India </w:t>
+        <w:t xml:space="preserve">, child labour in India </w:t>
       </w:r>
       <w:r>
         <w:rPr>
@@ -2097,39 +1718,15 @@
           <w:rFonts w:ascii="var(--bs-body-font-family)" w:hAnsi="var(--bs-body-font-family)"/>
           <w:lang w:val="en-US"/>
         </w:rPr>
-        <w:t xml:space="preserve">We selected our first wave of participants nonrandomly by convenience sampling. Mobile phone numbers were used both to identify seed participants and to act as a unique identifier for those whom they referred. To avoid sample homophily, original sample members were selected from three distinct domestic worker communities facilitated by civil society </w:t>
-      </w:r>
-      <w:proofErr w:type="spellStart"/>
-      <w:r>
-        <w:rPr>
-          <w:rFonts w:ascii="var(--bs-body-font-family)" w:hAnsi="var(--bs-body-font-family)"/>
-          <w:lang w:val="en-US"/>
-        </w:rPr>
-        <w:t>organisations</w:t>
-      </w:r>
-      <w:proofErr w:type="spellEnd"/>
-      <w:r>
-        <w:rPr>
-          <w:rFonts w:ascii="var(--bs-body-font-family)" w:hAnsi="var(--bs-body-font-family)"/>
-          <w:lang w:val="en-US"/>
-        </w:rPr>
-        <w:t xml:space="preserve">. One was an exclusively online community of transnational domestic workers working in the UK, the second represented UK domestic workers of Filipino origin, and the third drew its membership from the Latin American community of domestic workers, also in the UK. Representatives from these </w:t>
-      </w:r>
-      <w:proofErr w:type="spellStart"/>
-      <w:r>
-        <w:rPr>
-          <w:rFonts w:ascii="var(--bs-body-font-family)" w:hAnsi="var(--bs-body-font-family)"/>
-          <w:lang w:val="en-US"/>
-        </w:rPr>
-        <w:t>organisations</w:t>
-      </w:r>
-      <w:proofErr w:type="spellEnd"/>
-      <w:r>
-        <w:rPr>
-          <w:rFonts w:ascii="var(--bs-body-font-family)" w:hAnsi="var(--bs-body-font-family)"/>
-          <w:lang w:val="en-US"/>
-        </w:rPr>
-        <w:t>, along with other academics with expertise in exploitation within domestic work, contributed to survey question design and facilitated piloting of an initial version of the survey, which was translated and made available in four languages: English, Spanish, Tagalog, and Portuguese.</w:t>
+        <w:t xml:space="preserve">We selected our first wave of participants nonrandomly by convenience sampling. Mobile phone numbers were used both to identify seed participants and to act as a unique identifier for those whom they referred. To avoid sample homophily, original sample members were selected from three distinct domestic worker communities facilitated by civil society organisations. One was an exclusively online community of transnational domestic workers working in the UK, the second represented UK domestic workers of Filipino origin, and the third drew its membership from the Latin American community </w:t>
+      </w:r>
+      <w:r>
+        <w:rPr>
+          <w:rFonts w:ascii="var(--bs-body-font-family)" w:hAnsi="var(--bs-body-font-family)"/>
+          <w:lang w:val="en-US"/>
+        </w:rPr>
+        <w:lastRenderedPageBreak/>
+        <w:t>of domestic workers, also in the UK. Representatives from these organisations, along with other academics with expertise in exploitation within domestic work, contributed to survey question design and facilitated piloting of an initial version of the survey, which was translated and made available in four languages: English, Spanish, Tagalog, and Portuguese.</w:t>
       </w:r>
     </w:p>
     <w:p>
@@ -2167,7 +1764,6 @@
           <w:rFonts w:ascii="var(--bs-body-font-family)" w:hAnsi="var(--bs-body-font-family)"/>
           <w:lang w:val="en-US"/>
         </w:rPr>
-        <w:lastRenderedPageBreak/>
         <w:t xml:space="preserve">A double incentive scheme rewarded respondents both for completing the questionnaire and for each referral who went on to engage with the survey. The challenge of incentive design is to set the incentive at a level that adequately rewards respondents’ time and participation, but that also avoids the risk of fraudulent participation due to too high a monetary gain </w:t>
       </w:r>
       <w:r>
@@ -2506,21 +2102,189 @@
           <w:rFonts w:ascii="var(--bs-body-font-family)" w:hAnsi="var(--bs-body-font-family)"/>
           <w:lang w:val="en-US"/>
         </w:rPr>
-        <w:t xml:space="preserve">Singer and </w:t>
-      </w:r>
-      <w:proofErr w:type="spellStart"/>
+        <w:t>Singer and Bossarte</w:t>
+      </w:r>
       <w:r>
         <w:rPr>
           <w:rStyle w:val="citation"/>
           <w:rFonts w:ascii="var(--bs-body-font-family)" w:hAnsi="var(--bs-body-font-family)"/>
           <w:lang w:val="en-US"/>
         </w:rPr>
-        <w:t>Bossarte</w:t>
-      </w:r>
-      <w:proofErr w:type="spellEnd"/>
+        <w:t xml:space="preserve"> </w:t>
+      </w:r>
       <w:r>
         <w:rPr>
           <w:rStyle w:val="citation"/>
+          <w:rFonts w:ascii="var(--bs-body-font-family)" w:hAnsi="var(--bs-body-font-family)" w:hint="eastAsia"/>
+          <w:lang w:val="en-US"/>
+        </w:rPr>
+        <w:fldChar w:fldCharType="begin"/>
+      </w:r>
+      <w:r>
+        <w:rPr>
+          <w:rStyle w:val="citation"/>
+          <w:rFonts w:ascii="var(--bs-body-font-family)" w:hAnsi="var(--bs-body-font-family)" w:hint="eastAsia"/>
+          <w:lang w:val="en-US"/>
+        </w:rPr>
+        <w:instrText xml:space="preserve"> ADDIN ZOTERO_ITEM CSL_CITATION {"citationID":"nXTfPqTa","properties":{"formattedCitation":"(2006)","plainCitation":"(2006)","noteIndex":0},"citationItems":[{"id":68,"uris":["http://zotero.org/users/local/nMxJkNMP/items/42XBX9VD"],"itemData":{"id":68,"type":"article-journal","container-title":"American journal of preventive medicine","issue":"5","language":"en","note":"number: 5","page":"411</w:instrText>
+      </w:r>
+      <w:r>
+        <w:rPr>
+          <w:rStyle w:val="citation"/>
+          <w:rFonts w:ascii="var(--bs-body-font-family)" w:hAnsi="var(--bs-body-font-family)" w:hint="eastAsia"/>
+          <w:lang w:val="en-US"/>
+        </w:rPr>
+        <w:instrText>–</w:instrText>
+      </w:r>
+      <w:r>
+        <w:rPr>
+          <w:rStyle w:val="citation"/>
+          <w:rFonts w:ascii="var(--bs-body-font-family)" w:hAnsi="var(--bs-body-font-family)" w:hint="eastAsia"/>
+          <w:lang w:val="en-US"/>
+        </w:rPr>
+        <w:instrText xml:space="preserve">418","title":"Incentives for survey participation: when are they </w:instrText>
+      </w:r>
+      <w:r>
+        <w:rPr>
+          <w:rStyle w:val="citation"/>
+          <w:rFonts w:ascii="var(--bs-body-font-family)" w:hAnsi="var(--bs-body-font-family)" w:hint="eastAsia"/>
+          <w:lang w:val="en-US"/>
+        </w:rPr>
+        <w:instrText>“</w:instrText>
+      </w:r>
+      <w:r>
+        <w:rPr>
+          <w:rStyle w:val="citation"/>
+          <w:rFonts w:ascii="var(--bs-body-font-family)" w:hAnsi="var(--bs-body-font-family)" w:hint="eastAsia"/>
+          <w:lang w:val="en-US"/>
+        </w:rPr>
+        <w:instrText>coercive</w:instrText>
+      </w:r>
+      <w:r>
+        <w:rPr>
+          <w:rStyle w:val="citation"/>
+          <w:rFonts w:ascii="var(--bs-body-font-family)" w:hAnsi="var(--bs-body-font-family)" w:hint="eastAsia"/>
+          <w:lang w:val="en-US"/>
+        </w:rPr>
+        <w:instrText>”</w:instrText>
+      </w:r>
+      <w:r>
+        <w:rPr>
+          <w:rStyle w:val="citation"/>
+          <w:rFonts w:ascii="var(--bs-body-font-family)" w:hAnsi="var(--bs-body-font-family)" w:hint="eastAsia"/>
+          <w:lang w:val="en-US"/>
+        </w:rPr>
+        <w:instrText xml:space="preserve">?","volume":"31","author":[{"family":"Singer","given":"E."},{"family":"Bossarte","given":"R.M."}],"issued":{"date-parts":[["2006"]]}},"suppress-author":true}],"schema":"https://github.com/citation-style-language/schema/raw/master/csl-citation.json"} </w:instrText>
+      </w:r>
+      <w:r>
+        <w:rPr>
+          <w:rStyle w:val="citation"/>
+          <w:rFonts w:ascii="var(--bs-body-font-family)" w:hAnsi="var(--bs-body-font-family)" w:hint="eastAsia"/>
+          <w:lang w:val="en-US"/>
+        </w:rPr>
+        <w:fldChar w:fldCharType="separate"/>
+      </w:r>
+      <w:r>
+        <w:rPr>
+          <w:rFonts w:ascii="var(--bs-body-font-family)" w:hAnsi="var(--bs-body-font-family)"/>
+        </w:rPr>
+        <w:t>(2006)</w:t>
+      </w:r>
+      <w:r>
+        <w:rPr>
+          <w:rStyle w:val="citation"/>
+          <w:rFonts w:ascii="var(--bs-body-font-family)" w:hAnsi="var(--bs-body-font-family)" w:hint="eastAsia"/>
+          <w:lang w:val="en-US"/>
+        </w:rPr>
+        <w:fldChar w:fldCharType="end"/>
+      </w:r>
+      <w:r>
+        <w:rPr>
+          <w:rFonts w:ascii="var(--bs-body-font-family)" w:hAnsi="var(--bs-body-font-family)"/>
+          <w:lang w:val="en-US"/>
+        </w:rPr>
+        <w:t xml:space="preserve">; </w:t>
+      </w:r>
+      <w:r>
+        <w:rPr>
+          <w:rStyle w:val="citation"/>
+          <w:rFonts w:ascii="var(--bs-body-font-family)" w:hAnsi="var(--bs-body-font-family)"/>
+          <w:lang w:val="en-US"/>
+        </w:rPr>
+        <w:t xml:space="preserve">DeJong et al. </w:t>
+      </w:r>
+      <w:r>
+        <w:rPr>
+          <w:rStyle w:val="citation"/>
+          <w:rFonts w:ascii="var(--bs-body-font-family)" w:hAnsi="var(--bs-body-font-family)" w:hint="eastAsia"/>
+          <w:lang w:val="en-US"/>
+        </w:rPr>
+        <w:fldChar w:fldCharType="begin"/>
+      </w:r>
+      <w:r>
+        <w:rPr>
+          <w:rStyle w:val="citation"/>
+          <w:rFonts w:ascii="var(--bs-body-font-family)" w:hAnsi="var(--bs-body-font-family)" w:hint="eastAsia"/>
+          <w:lang w:val="en-US"/>
+        </w:rPr>
+        <w:instrText xml:space="preserve"> ADDIN ZOTERO_ITEM CSL_CITATION {"citationID":"guih9I1Z","properties":{"formattedCitation":"(2009)","plainCitation":"(2009)","noteIndex":0},"citationItems":[{"id":38,"uris":["http://zotero.org/users/local/nMxJkNMP/items/DVVDNC9X"],"itemData":{"id":38,"type":"article-journal","container-title":"American Journal of Public Health","issue":"9","language":"en","note":"number: 9","page":"1562</w:instrText>
+      </w:r>
+      <w:r>
+        <w:rPr>
+          <w:rStyle w:val="citation"/>
+          <w:rFonts w:ascii="var(--bs-body-font-family)" w:hAnsi="var(--bs-body-font-family)" w:hint="eastAsia"/>
+          <w:lang w:val="en-US"/>
+        </w:rPr>
+        <w:instrText>–</w:instrText>
+      </w:r>
+      <w:r>
+        <w:rPr>
+          <w:rStyle w:val="citation"/>
+          <w:rFonts w:ascii="var(--bs-body-font-family)" w:hAnsi="var(--bs-body-font-family)" w:hint="eastAsia"/>
+          <w:lang w:val="en-US"/>
+        </w:rPr>
+        <w:instrText xml:space="preserve">1567","title":"Ethical considerations in HIV/AIDS biobehavioral surveys that use respondent-driven sampling: illustrations from Lebanon","volume":"99","author":[{"family":"DeJong","given":"J."},{"family":"Mahfoud","given":"Z."},{"family":"Khoury","given":"D."},{"family":"Barbir","given":"F."},{"family":"Afifi","given":"R.A."}],"issued":{"date-parts":[["2009"]]}},"suppress-author":true}],"schema":"https://github.com/citation-style-language/schema/raw/master/csl-citation.json"} </w:instrText>
+      </w:r>
+      <w:r>
+        <w:rPr>
+          <w:rStyle w:val="citation"/>
+          <w:rFonts w:ascii="var(--bs-body-font-family)" w:hAnsi="var(--bs-body-font-family)" w:hint="eastAsia"/>
+          <w:lang w:val="en-US"/>
+        </w:rPr>
+        <w:fldChar w:fldCharType="separate"/>
+      </w:r>
+      <w:r>
+        <w:rPr>
+          <w:rFonts w:ascii="var(--bs-body-font-family)" w:hAnsi="var(--bs-body-font-family)"/>
+        </w:rPr>
+        <w:t>(2009)</w:t>
+      </w:r>
+      <w:r>
+        <w:rPr>
+          <w:rStyle w:val="citation"/>
+          <w:rFonts w:ascii="var(--bs-body-font-family)" w:hAnsi="var(--bs-body-font-family)" w:hint="eastAsia"/>
+          <w:lang w:val="en-US"/>
+        </w:rPr>
+        <w:fldChar w:fldCharType="end"/>
+      </w:r>
+      <w:r>
+        <w:rPr>
+          <w:rFonts w:ascii="var(--bs-body-font-family)" w:hAnsi="var(--bs-body-font-family)"/>
+          <w:lang w:val="en-US"/>
+        </w:rPr>
+        <w:t xml:space="preserve">; </w:t>
+      </w:r>
+      <w:r>
+        <w:rPr>
+          <w:rStyle w:val="citation"/>
+          <w:rFonts w:ascii="var(--bs-body-font-family)" w:hAnsi="var(--bs-body-font-family)"/>
+          <w:lang w:val="en-US"/>
+        </w:rPr>
+        <w:t>Semaan et al.</w:t>
+      </w:r>
+      <w:r>
+        <w:rPr>
+          <w:rStyle w:val="citation"/>
           <w:rFonts w:ascii="var(--bs-body-font-family)" w:hAnsi="var(--bs-body-font-family)"/>
           <w:lang w:val="en-US"/>
         </w:rPr>
@@ -2540,7 +2304,7 @@
           <w:rFonts w:ascii="var(--bs-body-font-family)" w:hAnsi="var(--bs-body-font-family)" w:hint="eastAsia"/>
           <w:lang w:val="en-US"/>
         </w:rPr>
-        <w:instrText xml:space="preserve"> ADDIN ZOTERO_ITEM CSL_CITATION {"citationID":"nXTfPqTa","properties":{"formattedCitation":"(2006)","plainCitation":"(2006)","noteIndex":0},"citationItems":[{"id":68,"uris":["http://zotero.org/users/local/nMxJkNMP/items/42XBX9VD"],"itemData":{"id":68,"type":"article-journal","container-title":"American journal of preventive medicine","issue":"5","language":"en","note":"number: 5","page":"411</w:instrText>
+        <w:instrText xml:space="preserve"> ADDIN ZOTERO_ITEM CSL_CITATION {"citationID":"FtYwv80C","properties":{"formattedCitation":"(2009)","plainCitation":"(2009)","noteIndex":0},"citationItems":[{"id":66,"uris":["http://zotero.org/users/local/nMxJkNMP/items/4NIEDF6L"],"itemData":{"id":66,"type":"article-journal","container-title":"International Journal of Drug Policy","issue":"1","language":"en","note":"number: 1","page":"14</w:instrText>
       </w:r>
       <w:r>
         <w:rPr>
@@ -2556,7 +2320,7 @@
           <w:rFonts w:ascii="var(--bs-body-font-family)" w:hAnsi="var(--bs-body-font-family)" w:hint="eastAsia"/>
           <w:lang w:val="en-US"/>
         </w:rPr>
-        <w:instrText xml:space="preserve">418","title":"Incentives for survey participation: when are they </w:instrText>
+        <w:instrText xml:space="preserve">27","title":"Ethical and regulatory considerations in HIV prevention studies employing respondent-driven sampling","volume":"20","author":[{"family":"Semaan","given":"S."},{"family":"Santibanez","given":"S."},{"family":"Garfein","given":"R.S."},{"family":"Heckathorn","given":"D.D."},{"family":"Jarlais","given":"D.C."}],"issued":{"date-parts":[["2009"]]}},"suppress-author":true}],"schema":"https://github.com/citation-style-language/schema/raw/master/csl-citation.json"} </w:instrText>
       </w:r>
       <w:r>
         <w:rPr>
@@ -2564,7 +2328,13 @@
           <w:rFonts w:ascii="var(--bs-body-font-family)" w:hAnsi="var(--bs-body-font-family)" w:hint="eastAsia"/>
           <w:lang w:val="en-US"/>
         </w:rPr>
-        <w:instrText>“</w:instrText>
+        <w:fldChar w:fldCharType="separate"/>
+      </w:r>
+      <w:r>
+        <w:rPr>
+          <w:rFonts w:ascii="var(--bs-body-font-family)" w:hAnsi="var(--bs-body-font-family)"/>
+        </w:rPr>
+        <w:t>(2009)</w:t>
       </w:r>
       <w:r>
         <w:rPr>
@@ -2572,11 +2342,351 @@
           <w:rFonts w:ascii="var(--bs-body-font-family)" w:hAnsi="var(--bs-body-font-family)" w:hint="eastAsia"/>
           <w:lang w:val="en-US"/>
         </w:rPr>
-        <w:instrText>coercive</w:instrText>
+        <w:fldChar w:fldCharType="end"/>
+      </w:r>
+      <w:r>
+        <w:rPr>
+          <w:rFonts w:ascii="var(--bs-body-font-family)" w:hAnsi="var(--bs-body-font-family)"/>
+          <w:lang w:val="en-US"/>
+        </w:rPr>
+        <w:t xml:space="preserve">; </w:t>
       </w:r>
       <w:r>
         <w:rPr>
           <w:rStyle w:val="citation"/>
+          <w:rFonts w:ascii="var(--bs-body-font-family)" w:hAnsi="var(--bs-body-font-family)"/>
+          <w:lang w:val="en-US"/>
+        </w:rPr>
+        <w:t>Brunovskis and Surtees</w:t>
+      </w:r>
+      <w:r>
+        <w:rPr>
+          <w:rStyle w:val="citation"/>
+          <w:rFonts w:ascii="var(--bs-body-font-family)" w:hAnsi="var(--bs-body-font-family)"/>
+          <w:lang w:val="en-US"/>
+        </w:rPr>
+        <w:t xml:space="preserve"> </w:t>
+      </w:r>
+      <w:r>
+        <w:rPr>
+          <w:rStyle w:val="citation"/>
+          <w:rFonts w:ascii="var(--bs-body-font-family)" w:hAnsi="var(--bs-body-font-family)" w:hint="eastAsia"/>
+          <w:lang w:val="en-US"/>
+        </w:rPr>
+        <w:fldChar w:fldCharType="begin"/>
+      </w:r>
+      <w:r>
+        <w:rPr>
+          <w:rStyle w:val="citation"/>
+          <w:rFonts w:ascii="var(--bs-body-font-family)" w:hAnsi="var(--bs-body-font-family)" w:hint="eastAsia"/>
+          <w:lang w:val="en-US"/>
+        </w:rPr>
+        <w:instrText xml:space="preserve"> ADDIN ZOTERO_ITEM CSL_CITATION {"citationID":"M8qMm8jf","properties":{"formattedCitation":"(2010)","plainCitation":"(2010)","noteIndex":0},"citationItems":[{"id":36,"uris":["http://zotero.org/users/local/nMxJkNMP/items/98MI22VS"],"itemData":{"id":36,"type":"article-journal","container-title":"International Migration","issue":"4","language":"en","note":"number: 4","page":"1</w:instrText>
+      </w:r>
+      <w:r>
+        <w:rPr>
+          <w:rStyle w:val="citation"/>
+          <w:rFonts w:ascii="var(--bs-body-font-family)" w:hAnsi="var(--bs-body-font-family)" w:hint="eastAsia"/>
+          <w:lang w:val="en-US"/>
+        </w:rPr>
+        <w:instrText>–</w:instrText>
+      </w:r>
+      <w:r>
+        <w:rPr>
+          <w:rStyle w:val="citation"/>
+          <w:rFonts w:ascii="var(--bs-body-font-family)" w:hAnsi="var(--bs-body-font-family)" w:hint="eastAsia"/>
+          <w:lang w:val="en-US"/>
+        </w:rPr>
+        <w:instrText xml:space="preserve">37","title":"Untold stories: biases and selection effects in research with victims of trafficking for sexual exploitation","volume":"48","author":[{"family":"Brunovskis","given":"A."},{"family":"Surtees","given":"R."}],"issued":{"date-parts":[["2010"]]}},"suppress-author":true}],"schema":"https://github.com/citation-style-language/schema/raw/master/csl-citation.json"} </w:instrText>
+      </w:r>
+      <w:r>
+        <w:rPr>
+          <w:rStyle w:val="citation"/>
+          <w:rFonts w:ascii="var(--bs-body-font-family)" w:hAnsi="var(--bs-body-font-family)" w:hint="eastAsia"/>
+          <w:lang w:val="en-US"/>
+        </w:rPr>
+        <w:fldChar w:fldCharType="separate"/>
+      </w:r>
+      <w:r>
+        <w:rPr>
+          <w:rFonts w:ascii="var(--bs-body-font-family)" w:hAnsi="var(--bs-body-font-family)"/>
+        </w:rPr>
+        <w:t>(2010)</w:t>
+      </w:r>
+      <w:r>
+        <w:rPr>
+          <w:rStyle w:val="citation"/>
+          <w:rFonts w:ascii="var(--bs-body-font-family)" w:hAnsi="var(--bs-body-font-family)" w:hint="eastAsia"/>
+          <w:lang w:val="en-US"/>
+        </w:rPr>
+        <w:fldChar w:fldCharType="end"/>
+      </w:r>
+      <w:r>
+        <w:rPr>
+          <w:rFonts w:ascii="var(--bs-body-font-family)" w:hAnsi="var(--bs-body-font-family)"/>
+          <w:lang w:val="en-US"/>
+        </w:rPr>
+        <w:t xml:space="preserve">; </w:t>
+      </w:r>
+      <w:r>
+        <w:rPr>
+          <w:rStyle w:val="citation"/>
+          <w:rFonts w:ascii="var(--bs-body-font-family)" w:hAnsi="var(--bs-body-font-family)"/>
+          <w:lang w:val="en-US"/>
+        </w:rPr>
+        <w:t>Semaan</w:t>
+      </w:r>
+      <w:r>
+        <w:rPr>
+          <w:rStyle w:val="citation"/>
+          <w:rFonts w:ascii="var(--bs-body-font-family)" w:hAnsi="var(--bs-body-font-family)"/>
+          <w:lang w:val="en-US"/>
+        </w:rPr>
+        <w:t xml:space="preserve"> </w:t>
+      </w:r>
+      <w:r>
+        <w:rPr>
+          <w:rStyle w:val="citation"/>
+          <w:rFonts w:ascii="var(--bs-body-font-family)" w:hAnsi="var(--bs-body-font-family)" w:hint="eastAsia"/>
+          <w:lang w:val="en-US"/>
+        </w:rPr>
+        <w:fldChar w:fldCharType="begin"/>
+      </w:r>
+      <w:r>
+        <w:rPr>
+          <w:rStyle w:val="citation"/>
+          <w:rFonts w:ascii="var(--bs-body-font-family)" w:hAnsi="var(--bs-body-font-family)" w:hint="eastAsia"/>
+          <w:lang w:val="en-US"/>
+        </w:rPr>
+        <w:instrText xml:space="preserve"> ADDIN ZOTERO_ITEM CSL_CITATION {"citationID":"XdhIv4CM","properties":{"formattedCitation":"(2010)","plainCitation":"(2010)","noteIndex":0},"citationItems":[{"id":67,"uris":["http://zotero.org/users/local/nMxJkNMP/items/FTZHW8IZ"],"itemData":{"id":67,"type":"article-journal","container-title":"Methodological Innovations Online","issue":"2","language":"en","note":"number: 2","page":"60</w:instrText>
+      </w:r>
+      <w:r>
+        <w:rPr>
+          <w:rStyle w:val="citation"/>
+          <w:rFonts w:ascii="var(--bs-body-font-family)" w:hAnsi="var(--bs-body-font-family)" w:hint="eastAsia"/>
+          <w:lang w:val="en-US"/>
+        </w:rPr>
+        <w:instrText>–</w:instrText>
+      </w:r>
+      <w:r>
+        <w:rPr>
+          <w:rStyle w:val="citation"/>
+          <w:rFonts w:ascii="var(--bs-body-font-family)" w:hAnsi="var(--bs-body-font-family)" w:hint="eastAsia"/>
+          <w:lang w:val="en-US"/>
+        </w:rPr>
+        <w:instrText xml:space="preserve">75","title":"Time-space sampling and respondent-driven sampling with hard-to-reach populations","volume":"5","author":[{"family":"Semaan","given":"S."}],"issued":{"date-parts":[["2010"]]}},"suppress-author":true}],"schema":"https://github.com/citation-style-language/schema/raw/master/csl-citation.json"} </w:instrText>
+      </w:r>
+      <w:r>
+        <w:rPr>
+          <w:rStyle w:val="citation"/>
+          <w:rFonts w:ascii="var(--bs-body-font-family)" w:hAnsi="var(--bs-body-font-family)" w:hint="eastAsia"/>
+          <w:lang w:val="en-US"/>
+        </w:rPr>
+        <w:fldChar w:fldCharType="separate"/>
+      </w:r>
+      <w:r>
+        <w:rPr>
+          <w:rFonts w:ascii="var(--bs-body-font-family)" w:hAnsi="var(--bs-body-font-family)"/>
+        </w:rPr>
+        <w:t>(2010)</w:t>
+      </w:r>
+      <w:r>
+        <w:rPr>
+          <w:rStyle w:val="citation"/>
+          <w:rFonts w:ascii="var(--bs-body-font-family)" w:hAnsi="var(--bs-body-font-family)" w:hint="eastAsia"/>
+          <w:lang w:val="en-US"/>
+        </w:rPr>
+        <w:fldChar w:fldCharType="end"/>
+      </w:r>
+      <w:r>
+        <w:rPr>
+          <w:rFonts w:ascii="var(--bs-body-font-family)" w:hAnsi="var(--bs-body-font-family)"/>
+          <w:lang w:val="en-US"/>
+        </w:rPr>
+        <w:t xml:space="preserve">; </w:t>
+      </w:r>
+      <w:r>
+        <w:rPr>
+          <w:rStyle w:val="citation"/>
+          <w:rFonts w:ascii="var(--bs-body-font-family)" w:hAnsi="var(--bs-body-font-family)"/>
+          <w:lang w:val="en-US"/>
+        </w:rPr>
+        <w:t xml:space="preserve">Platt, Luthra, and Frere-Smith </w:t>
+      </w:r>
+      <w:r>
+        <w:rPr>
+          <w:rStyle w:val="citation"/>
+          <w:rFonts w:ascii="var(--bs-body-font-family)" w:hAnsi="var(--bs-body-font-family)" w:hint="eastAsia"/>
+          <w:lang w:val="en-US"/>
+        </w:rPr>
+        <w:fldChar w:fldCharType="begin"/>
+      </w:r>
+      <w:r>
+        <w:rPr>
+          <w:rStyle w:val="citation"/>
+          <w:rFonts w:ascii="var(--bs-body-font-family)" w:hAnsi="var(--bs-body-font-family)" w:hint="eastAsia"/>
+          <w:lang w:val="en-US"/>
+        </w:rPr>
+        <w:instrText xml:space="preserve"> ADDIN ZOTERO_ITEM CSL_CITATION {"citationID":"15H4e1oH","properties":{"formattedCitation":"(2015)","plainCitation":"(2015)","noteIndex":0},"citationItems":[{"id":63,"uris":["http://zotero.org/users/local/nMxJkNMP/items/4SLFC6UU"],"itemData":{"id":63,"type":"article-journal","container-title":"Demographic Research","language":"en","page":"665</w:instrText>
+      </w:r>
+      <w:r>
+        <w:rPr>
+          <w:rStyle w:val="citation"/>
+          <w:rFonts w:ascii="var(--bs-body-font-family)" w:hAnsi="var(--bs-body-font-family)" w:hint="eastAsia"/>
+          <w:lang w:val="en-US"/>
+        </w:rPr>
+        <w:instrText>–</w:instrText>
+      </w:r>
+      <w:r>
+        <w:rPr>
+          <w:rStyle w:val="citation"/>
+          <w:rFonts w:ascii="var(--bs-body-font-family)" w:hAnsi="var(--bs-body-font-family)" w:hint="eastAsia"/>
+          <w:lang w:val="en-US"/>
+        </w:rPr>
+        <w:instrText xml:space="preserve">700","title":"Adapting chain referral methods to sample new migrants: Possibilities and limitations","volume":"33","author":[{"family":"Platt","given":"L."},{"family":"Luthra","given":"R."},{"family":"Frere-Smith","given":"T."}],"issued":{"date-parts":[["2015"]]}},"suppress-author":true}],"schema":"https://github.com/citation-style-language/schema/raw/master/csl-citation.json"} </w:instrText>
+      </w:r>
+      <w:r>
+        <w:rPr>
+          <w:rStyle w:val="citation"/>
+          <w:rFonts w:ascii="var(--bs-body-font-family)" w:hAnsi="var(--bs-body-font-family)" w:hint="eastAsia"/>
+          <w:lang w:val="en-US"/>
+        </w:rPr>
+        <w:fldChar w:fldCharType="separate"/>
+      </w:r>
+      <w:r>
+        <w:rPr>
+          <w:rFonts w:ascii="var(--bs-body-font-family)" w:hAnsi="var(--bs-body-font-family)"/>
+        </w:rPr>
+        <w:t>(2015)</w:t>
+      </w:r>
+      <w:r>
+        <w:rPr>
+          <w:rStyle w:val="citation"/>
+          <w:rFonts w:ascii="var(--bs-body-font-family)" w:hAnsi="var(--bs-body-font-family)" w:hint="eastAsia"/>
+          <w:lang w:val="en-US"/>
+        </w:rPr>
+        <w:fldChar w:fldCharType="end"/>
+      </w:r>
+      <w:r>
+        <w:rPr>
+          <w:rFonts w:ascii="var(--bs-body-font-family)" w:hAnsi="var(--bs-body-font-family)"/>
+          <w:lang w:val="en-US"/>
+        </w:rPr>
+        <w:t>, including the specificities of incentive use within web-based surveys</w:t>
+      </w:r>
+      <w:r>
+        <w:rPr>
+          <w:rFonts w:ascii="var(--bs-body-font-family)" w:hAnsi="var(--bs-body-font-family)"/>
+          <w:lang w:val="en-US"/>
+        </w:rPr>
+        <w:t xml:space="preserve"> </w:t>
+      </w:r>
+      <w:r>
+        <w:rPr>
+          <w:rFonts w:ascii="var(--bs-body-font-family)" w:hAnsi="var(--bs-body-font-family)" w:hint="eastAsia"/>
+          <w:lang w:val="en-US"/>
+        </w:rPr>
+        <w:fldChar w:fldCharType="begin"/>
+      </w:r>
+      <w:r>
+        <w:rPr>
+          <w:rFonts w:ascii="var(--bs-body-font-family)" w:hAnsi="var(--bs-body-font-family)" w:hint="eastAsia"/>
+          <w:lang w:val="en-US"/>
+        </w:rPr>
+        <w:instrText xml:space="preserve"> ADDIN ZOTERO_ITEM CSL_CITATION {"citationID":"FJM9XK9W","properties":{"formattedCitation":"(Cobanoglu and Cobanoglu, 2003)","plainCitation":"(Cobanoglu and Cobanoglu, 2003)","noteIndex":0},"citationItems":[{"id":37,"uris":["http://zotero.org/users/local/nMxJkNMP/items/4296TQE7"],"itemData":{"id":37,"type":"article-journal","container-title":"International Journal of Market Research","issue":"4","language":"en","note":"number: 4","page":"1</w:instrText>
+      </w:r>
+      <w:r>
+        <w:rPr>
+          <w:rFonts w:ascii="var(--bs-body-font-family)" w:hAnsi="var(--bs-body-font-family)" w:hint="eastAsia"/>
+          <w:lang w:val="en-US"/>
+        </w:rPr>
+        <w:instrText>–</w:instrText>
+      </w:r>
+      <w:r>
+        <w:rPr>
+          <w:rFonts w:ascii="var(--bs-body-font-family)" w:hAnsi="var(--bs-body-font-family)" w:hint="eastAsia"/>
+          <w:lang w:val="en-US"/>
+        </w:rPr>
+        <w:instrText xml:space="preserve">13","title":"The effect of incentives in web surveys: application and ethical considerations","volume":"45","author":[{"family":"Cobanoglu","given":"C."},{"family":"Cobanoglu","given":"N."}],"issued":{"date-parts":[["2003"]]}}}],"schema":"https://github.com/citation-style-language/schema/raw/master/csl-citation.json"} </w:instrText>
+      </w:r>
+      <w:r>
+        <w:rPr>
+          <w:rFonts w:ascii="var(--bs-body-font-family)" w:hAnsi="var(--bs-body-font-family)" w:hint="eastAsia"/>
+          <w:lang w:val="en-US"/>
+        </w:rPr>
+        <w:fldChar w:fldCharType="separate"/>
+      </w:r>
+      <w:r>
+        <w:rPr>
+          <w:rFonts w:ascii="var(--bs-body-font-family)" w:hAnsi="var(--bs-body-font-family)"/>
+        </w:rPr>
+        <w:t>(Cobanoglu and Cobanoglu, 2003)</w:t>
+      </w:r>
+      <w:r>
+        <w:rPr>
+          <w:rFonts w:ascii="var(--bs-body-font-family)" w:hAnsi="var(--bs-body-font-family)" w:hint="eastAsia"/>
+          <w:lang w:val="en-US"/>
+        </w:rPr>
+        <w:fldChar w:fldCharType="end"/>
+      </w:r>
+      <w:r>
+        <w:rPr>
+          <w:rFonts w:ascii="var(--bs-body-font-family)" w:hAnsi="var(--bs-body-font-family)"/>
+          <w:lang w:val="en-US"/>
+        </w:rPr>
+        <w:t xml:space="preserve">. Following the principles of lottery use established by </w:t>
+      </w:r>
+      <w:r>
+        <w:rPr>
+          <w:rStyle w:val="citation"/>
+          <w:rFonts w:ascii="var(--bs-body-font-family)" w:hAnsi="var(--bs-body-font-family)"/>
+          <w:lang w:val="en-US"/>
+        </w:rPr>
+        <w:t>Brown, Schonfeld, and Gordon</w:t>
+      </w:r>
+      <w:r>
+        <w:rPr>
+          <w:rStyle w:val="citation"/>
+          <w:rFonts w:ascii="var(--bs-body-font-family)" w:hAnsi="var(--bs-body-font-family)"/>
+          <w:lang w:val="en-US"/>
+        </w:rPr>
+        <w:t xml:space="preserve"> </w:t>
+      </w:r>
+      <w:r>
+        <w:rPr>
+          <w:rStyle w:val="citation"/>
+          <w:rFonts w:ascii="var(--bs-body-font-family)" w:hAnsi="var(--bs-body-font-family)" w:hint="eastAsia"/>
+          <w:lang w:val="en-US"/>
+        </w:rPr>
+        <w:fldChar w:fldCharType="begin"/>
+      </w:r>
+      <w:r>
+        <w:rPr>
+          <w:rStyle w:val="citation"/>
+          <w:rFonts w:ascii="var(--bs-body-font-family)" w:hAnsi="var(--bs-body-font-family)" w:hint="eastAsia"/>
+          <w:lang w:val="en-US"/>
+        </w:rPr>
+        <w:instrText xml:space="preserve"> ADDIN ZOTERO_ITEM CSL_CITATION {"citationID":"mqx0sWoY","properties":{"formattedCitation":"(2006)","plainCitation":"(2006)","noteIndex":0},"citationItems":[{"id":35,"uris":["http://zotero.org/users/local/nMxJkNMP/items/UR9F5PNF"],"itemData":{"id":35,"type":"article-journal","container-title":"IRB: Ethics &amp; Human Research","issue":"1","language":"en","note":"number: 1","page":"12</w:instrText>
+      </w:r>
+      <w:r>
+        <w:rPr>
+          <w:rStyle w:val="citation"/>
+          <w:rFonts w:ascii="var(--bs-body-font-family)" w:hAnsi="var(--bs-body-font-family)" w:hint="eastAsia"/>
+          <w:lang w:val="en-US"/>
+        </w:rPr>
+        <w:instrText>–</w:instrText>
+      </w:r>
+      <w:r>
+        <w:rPr>
+          <w:rStyle w:val="citation"/>
+          <w:rFonts w:ascii="var(--bs-body-font-family)" w:hAnsi="var(--bs-body-font-family)" w:hint="eastAsia"/>
+          <w:lang w:val="en-US"/>
+        </w:rPr>
+        <w:instrText>16","title":"You may have already won...</w:instrText>
+      </w:r>
+      <w:r>
+        <w:rPr>
+          <w:rStyle w:val="citation"/>
           <w:rFonts w:ascii="var(--bs-body-font-family)" w:hAnsi="var(--bs-body-font-family)" w:hint="eastAsia"/>
           <w:lang w:val="en-US"/>
         </w:rPr>
@@ -2588,7 +2698,7 @@
           <w:rFonts w:ascii="var(--bs-body-font-family)" w:hAnsi="var(--bs-body-font-family)" w:hint="eastAsia"/>
           <w:lang w:val="en-US"/>
         </w:rPr>
-        <w:instrText xml:space="preserve">?","volume":"31","author":[{"family":"Singer","given":"E."},{"family":"Bossarte","given":"R.M."}],"issued":{"date-parts":[["2006"]]}},"suppress-author":true}],"schema":"https://github.com/citation-style-language/schema/raw/master/csl-citation.json"} </w:instrText>
+        <w:instrText xml:space="preserve">: An examination of the use of lottery payments in research","volume":"28","author":[{"family":"Brown","given":"J.S."},{"family":"Schonfeld","given":"T.L."},{"family":"Gordon","given":"B.G."}],"issued":{"date-parts":[["2006"]]}},"suppress-author":true}],"schema":"https://github.com/citation-style-language/schema/raw/master/csl-citation.json"} </w:instrText>
       </w:r>
       <w:r>
         <w:rPr>
@@ -2614,22 +2724,30 @@
       </w:r>
       <w:r>
         <w:rPr>
-          <w:rFonts w:ascii="var(--bs-body-font-family)" w:hAnsi="var(--bs-body-font-family)"/>
-          <w:lang w:val="en-US"/>
-        </w:rPr>
-        <w:t xml:space="preserve">; </w:t>
-      </w:r>
-      <w:r>
-        <w:rPr>
           <w:rStyle w:val="citation"/>
           <w:rFonts w:ascii="var(--bs-body-font-family)" w:hAnsi="var(--bs-body-font-family)"/>
           <w:lang w:val="en-US"/>
         </w:rPr>
-        <w:t xml:space="preserve">DeJong et al. </w:t>
+        <w:t xml:space="preserve"> </w:t>
+      </w:r>
+      <w:r>
+        <w:rPr>
+          <w:rFonts w:ascii="var(--bs-body-font-family)" w:hAnsi="var(--bs-body-font-family)"/>
+          <w:lang w:val="en-US"/>
+        </w:rPr>
+        <w:t xml:space="preserve">and </w:t>
       </w:r>
       <w:r>
         <w:rPr>
           <w:rStyle w:val="citation"/>
+          <w:rFonts w:ascii="var(--bs-body-font-family)" w:hAnsi="var(--bs-body-font-family)"/>
+          <w:lang w:val="en-US"/>
+        </w:rPr>
+        <w:t xml:space="preserve">Laguilles, Williams, and Saunders </w:t>
+      </w:r>
+      <w:r>
+        <w:rPr>
+          <w:rStyle w:val="citation"/>
           <w:rFonts w:ascii="var(--bs-body-font-family)" w:hAnsi="var(--bs-body-font-family)" w:hint="eastAsia"/>
           <w:lang w:val="en-US"/>
         </w:rPr>
@@ -2641,7 +2759,7 @@
           <w:rFonts w:ascii="var(--bs-body-font-family)" w:hAnsi="var(--bs-body-font-family)" w:hint="eastAsia"/>
           <w:lang w:val="en-US"/>
         </w:rPr>
-        <w:instrText xml:space="preserve"> ADDIN ZOTERO_ITEM CSL_CITATION {"citationID":"guih9I1Z","properties":{"formattedCitation":"(2009)","plainCitation":"(2009)","noteIndex":0},"citationItems":[{"id":38,"uris":["http://zotero.org/users/local/nMxJkNMP/items/DVVDNC9X"],"itemData":{"id":38,"type":"article-journal","container-title":"American Journal of Public Health","issue":"9","language":"en","note":"number: 9","page":"1562</w:instrText>
+        <w:instrText xml:space="preserve"> ADDIN ZOTERO_ITEM CSL_CITATION {"citationID":"ScupYhjp","properties":{"formattedCitation":"(2011)","plainCitation":"(2011)","noteIndex":0},"citationItems":[{"id":56,"uris":["http://zotero.org/users/local/nMxJkNMP/items/KX8WBVV2"],"itemData":{"id":56,"type":"article-journal","container-title":"Research in Higher Education","issue":"5","language":"en","note":"number: 5","page":"537</w:instrText>
       </w:r>
       <w:r>
         <w:rPr>
@@ -2657,7 +2775,7 @@
           <w:rFonts w:ascii="var(--bs-body-font-family)" w:hAnsi="var(--bs-body-font-family)" w:hint="eastAsia"/>
           <w:lang w:val="en-US"/>
         </w:rPr>
-        <w:instrText xml:space="preserve">1567","title":"Ethical considerations in HIV/AIDS biobehavioral surveys that use respondent-driven sampling: illustrations from Lebanon","volume":"99","author":[{"family":"DeJong","given":"J."},{"family":"Mahfoud","given":"Z."},{"family":"Khoury","given":"D."},{"family":"Barbir","given":"F."},{"family":"Afifi","given":"R.A."}],"issued":{"date-parts":[["2009"]]}},"suppress-author":true}],"schema":"https://github.com/citation-style-language/schema/raw/master/csl-citation.json"} </w:instrText>
+        <w:instrText xml:space="preserve">553","title":"Can lottery incentives boost web survey response rates? Findings from four experiments","volume":"52","author":[{"family":"Laguilles","given":"J.S."},{"family":"Williams","given":"E.A."},{"family":"Saunders","given":"D.B."}],"issued":{"date-parts":[["2011"]]}},"suppress-author":true}],"schema":"https://github.com/citation-style-language/schema/raw/master/csl-citation.json"} </w:instrText>
       </w:r>
       <w:r>
         <w:rPr>
@@ -2671,7 +2789,7 @@
         <w:rPr>
           <w:rFonts w:ascii="var(--bs-body-font-family)" w:hAnsi="var(--bs-body-font-family)"/>
         </w:rPr>
-        <w:t>(2009)</w:t>
+        <w:t>(2011)</w:t>
       </w:r>
       <w:r>
         <w:rPr>
@@ -2686,19 +2804,128 @@
           <w:rFonts w:ascii="var(--bs-body-font-family)" w:hAnsi="var(--bs-body-font-family)"/>
           <w:lang w:val="en-US"/>
         </w:rPr>
-        <w:t xml:space="preserve">; </w:t>
-      </w:r>
-      <w:r>
-        <w:rPr>
-          <w:rStyle w:val="citation"/>
-          <w:rFonts w:ascii="var(--bs-body-font-family)" w:hAnsi="var(--bs-body-font-family)"/>
-          <w:lang w:val="en-US"/>
-        </w:rPr>
-        <w:t>Semaan et al.</w:t>
-      </w:r>
-      <w:r>
-        <w:rPr>
-          <w:rStyle w:val="citation"/>
+        <w:t xml:space="preserve">, we also designed our survey to encourage the maximum extent of participation by entering all respondents completing the questionnaire into a free prize </w:t>
+      </w:r>
+      <w:r>
+        <w:rPr>
+          <w:rFonts w:ascii="var(--bs-body-font-family)" w:hAnsi="var(--bs-body-font-family)"/>
+          <w:lang w:val="en-US"/>
+        </w:rPr>
+        <w:lastRenderedPageBreak/>
+        <w:t xml:space="preserve">draw for £150. Research suggests that a high lottery provides the most cost-effective incentive for obtaining complete responses </w:t>
+      </w:r>
+      <w:r>
+        <w:rPr>
+          <w:rFonts w:ascii="var(--bs-body-font-family)" w:hAnsi="var(--bs-body-font-family)" w:hint="eastAsia"/>
+          <w:lang w:val="en-US"/>
+        </w:rPr>
+        <w:fldChar w:fldCharType="begin"/>
+      </w:r>
+      <w:r>
+        <w:rPr>
+          <w:rFonts w:ascii="var(--bs-body-font-family)" w:hAnsi="var(--bs-body-font-family)" w:hint="eastAsia"/>
+          <w:lang w:val="en-US"/>
+        </w:rPr>
+        <w:instrText xml:space="preserve"> ADDIN ZOTERO_ITEM CSL_CITATION {"citationID":"MLB1mM2K","properties":{"formattedCitation":"(Gajic, Cameron and Hurley, 2012)","plainCitation":"(Gajic, Cameron and Hurley, 2012)","noteIndex":0},"citationItems":[{"id":40,"uris":["http://zotero.org/users/local/nMxJkNMP/items/EB6EIWTZ"],"itemData":{"id":40,"type":"article-journal","container-title":"The European Journal of Health Economics","issue":"6","language":"en","note":"number: 6","page":"789</w:instrText>
+      </w:r>
+      <w:r>
+        <w:rPr>
+          <w:rFonts w:ascii="var(--bs-body-font-family)" w:hAnsi="var(--bs-body-font-family)" w:hint="eastAsia"/>
+          <w:lang w:val="en-US"/>
+        </w:rPr>
+        <w:instrText>–</w:instrText>
+      </w:r>
+      <w:r>
+        <w:rPr>
+          <w:rFonts w:ascii="var(--bs-body-font-family)" w:hAnsi="var(--bs-body-font-family)" w:hint="eastAsia"/>
+          <w:lang w:val="en-US"/>
+        </w:rPr>
+        <w:instrText xml:space="preserve">799","title":"The cost-effectiveness of cash versus lottery incentives for a web-based, stated-preference community survey","volume":"13","author":[{"family":"Gajic","given":"A."},{"family":"Cameron","given":"D."},{"family":"Hurley","given":"J."}],"issued":{"date-parts":[["2012"]]}}}],"schema":"https://github.com/citation-style-language/schema/raw/master/csl-citation.json"} </w:instrText>
+      </w:r>
+      <w:r>
+        <w:rPr>
+          <w:rFonts w:ascii="var(--bs-body-font-family)" w:hAnsi="var(--bs-body-font-family)" w:hint="eastAsia"/>
+          <w:lang w:val="en-US"/>
+        </w:rPr>
+        <w:fldChar w:fldCharType="separate"/>
+      </w:r>
+      <w:r>
+        <w:rPr>
+          <w:rFonts w:ascii="var(--bs-body-font-family)" w:hAnsi="var(--bs-body-font-family)"/>
+        </w:rPr>
+        <w:t>(Gajic, Cameron and Hurley, 2012)</w:t>
+      </w:r>
+      <w:r>
+        <w:rPr>
+          <w:rFonts w:ascii="var(--bs-body-font-family)" w:hAnsi="var(--bs-body-font-family)" w:hint="eastAsia"/>
+          <w:lang w:val="en-US"/>
+        </w:rPr>
+        <w:fldChar w:fldCharType="end"/>
+      </w:r>
+      <w:r>
+        <w:rPr>
+          <w:rFonts w:ascii="var(--bs-body-font-family)" w:hAnsi="var(--bs-body-font-family)"/>
+          <w:lang w:val="en-US"/>
+        </w:rPr>
+        <w:t xml:space="preserve">. While using incentives to encourage participation would seem to be desirable, it is worth noting the potential downside of respondents fabricating responses to increase their remuneration </w:t>
+      </w:r>
+      <w:r>
+        <w:rPr>
+          <w:rFonts w:ascii="var(--bs-body-font-family)" w:hAnsi="var(--bs-body-font-family)" w:hint="eastAsia"/>
+          <w:lang w:val="en-US"/>
+        </w:rPr>
+        <w:fldChar w:fldCharType="begin"/>
+      </w:r>
+      <w:r>
+        <w:rPr>
+          <w:rFonts w:ascii="var(--bs-body-font-family)" w:hAnsi="var(--bs-body-font-family)" w:hint="eastAsia"/>
+          <w:lang w:val="en-US"/>
+        </w:rPr>
+        <w:instrText xml:space="preserve"> ADDIN ZOTERO_ITEM CSL_CITATION {"citationID":"5eJGO10c","properties":{"formattedCitation":"(Robinson, 2014)","plainCitation":"(Robinson, 2014)","noteIndex":0},"citationItems":[{"id":64,"uris":["http://zotero.org/users/local/nMxJkNMP/items/U5Z2QYDU"],"itemData":{"id":64,"type":"article-journal","container-title":"Qualitative research in psychology","issue":"1","language":"en","note":"number: 1","page":"25</w:instrText>
+      </w:r>
+      <w:r>
+        <w:rPr>
+          <w:rFonts w:ascii="var(--bs-body-font-family)" w:hAnsi="var(--bs-body-font-family)" w:hint="eastAsia"/>
+          <w:lang w:val="en-US"/>
+        </w:rPr>
+        <w:instrText>–</w:instrText>
+      </w:r>
+      <w:r>
+        <w:rPr>
+          <w:rFonts w:ascii="var(--bs-body-font-family)" w:hAnsi="var(--bs-body-font-family)" w:hint="eastAsia"/>
+          <w:lang w:val="en-US"/>
+        </w:rPr>
+        <w:instrText xml:space="preserve">41","title":"Sampling in interview-based qualitative research: A theoretical and practical guide","volume":"11","author":[{"family":"Robinson","given":"O.C."}],"issued":{"date-parts":[["2014"]]}}}],"schema":"https://github.com/citation-style-language/schema/raw/master/csl-citation.json"} </w:instrText>
+      </w:r>
+      <w:r>
+        <w:rPr>
+          <w:rFonts w:ascii="var(--bs-body-font-family)" w:hAnsi="var(--bs-body-font-family)" w:hint="eastAsia"/>
+          <w:lang w:val="en-US"/>
+        </w:rPr>
+        <w:fldChar w:fldCharType="separate"/>
+      </w:r>
+      <w:r>
+        <w:rPr>
+          <w:rFonts w:ascii="var(--bs-body-font-family)" w:hAnsi="var(--bs-body-font-family)"/>
+        </w:rPr>
+        <w:t>(Robinson, 2014)</w:t>
+      </w:r>
+      <w:r>
+        <w:rPr>
+          <w:rFonts w:ascii="var(--bs-body-font-family)" w:hAnsi="var(--bs-body-font-family)" w:hint="eastAsia"/>
+          <w:lang w:val="en-US"/>
+        </w:rPr>
+        <w:fldChar w:fldCharType="end"/>
+      </w:r>
+      <w:r>
+        <w:rPr>
+          <w:rFonts w:ascii="var(--bs-body-font-family)" w:hAnsi="var(--bs-body-font-family)"/>
+          <w:lang w:val="en-US"/>
+        </w:rPr>
+        <w:t>. To minimise this risk, mobile phone numbers for each respondent and those whom they referred were collated, and each of these numbers was called by one of the authors of the paper to ascertain the veracity of the respondent as a migrant domestic worker.</w:t>
+      </w:r>
+      <w:r>
+        <w:rPr>
           <w:rFonts w:ascii="var(--bs-body-font-family)" w:hAnsi="var(--bs-body-font-family)"/>
           <w:lang w:val="en-US"/>
         </w:rPr>
@@ -2706,703 +2933,10 @@
       </w:r>
       <w:r>
         <w:rPr>
-          <w:rStyle w:val="citation"/>
-          <w:rFonts w:ascii="var(--bs-body-font-family)" w:hAnsi="var(--bs-body-font-family)" w:hint="eastAsia"/>
-          <w:lang w:val="en-US"/>
-        </w:rPr>
-        <w:fldChar w:fldCharType="begin"/>
-      </w:r>
-      <w:r>
-        <w:rPr>
-          <w:rStyle w:val="citation"/>
-          <w:rFonts w:ascii="var(--bs-body-font-family)" w:hAnsi="var(--bs-body-font-family)" w:hint="eastAsia"/>
-          <w:lang w:val="en-US"/>
-        </w:rPr>
-        <w:instrText xml:space="preserve"> ADDIN ZOTERO_ITEM CSL_CITATION {"citationID":"FtYwv80C","properties":{"formattedCitation":"(2009)","plainCitation":"(2009)","noteIndex":0},"citationItems":[{"id":66,"uris":["http://zotero.org/users/local/nMxJkNMP/items/4NIEDF6L"],"itemData":{"id":66,"type":"article-journal","container-title":"International Journal of Drug Policy","issue":"1","language":"en","note":"number: 1","page":"14</w:instrText>
-      </w:r>
-      <w:r>
-        <w:rPr>
-          <w:rStyle w:val="citation"/>
-          <w:rFonts w:ascii="var(--bs-body-font-family)" w:hAnsi="var(--bs-body-font-family)" w:hint="eastAsia"/>
-          <w:lang w:val="en-US"/>
-        </w:rPr>
-        <w:instrText>–</w:instrText>
-      </w:r>
-      <w:r>
-        <w:rPr>
-          <w:rStyle w:val="citation"/>
-          <w:rFonts w:ascii="var(--bs-body-font-family)" w:hAnsi="var(--bs-body-font-family)" w:hint="eastAsia"/>
-          <w:lang w:val="en-US"/>
-        </w:rPr>
-        <w:instrText xml:space="preserve">27","title":"Ethical and regulatory considerations in HIV prevention studies employing respondent-driven sampling","volume":"20","author":[{"family":"Semaan","given":"S."},{"family":"Santibanez","given":"S."},{"family":"Garfein","given":"R.S."},{"family":"Heckathorn","given":"D.D."},{"family":"Jarlais","given":"D.C."}],"issued":{"date-parts":[["2009"]]}},"suppress-author":true}],"schema":"https://github.com/citation-style-language/schema/raw/master/csl-citation.json"} </w:instrText>
-      </w:r>
-      <w:r>
-        <w:rPr>
-          <w:rStyle w:val="citation"/>
-          <w:rFonts w:ascii="var(--bs-body-font-family)" w:hAnsi="var(--bs-body-font-family)" w:hint="eastAsia"/>
-          <w:lang w:val="en-US"/>
-        </w:rPr>
-        <w:fldChar w:fldCharType="separate"/>
-      </w:r>
-      <w:r>
-        <w:rPr>
-          <w:rFonts w:ascii="var(--bs-body-font-family)" w:hAnsi="var(--bs-body-font-family)"/>
-        </w:rPr>
-        <w:t>(2009)</w:t>
-      </w:r>
-      <w:r>
-        <w:rPr>
-          <w:rStyle w:val="citation"/>
-          <w:rFonts w:ascii="var(--bs-body-font-family)" w:hAnsi="var(--bs-body-font-family)" w:hint="eastAsia"/>
-          <w:lang w:val="en-US"/>
-        </w:rPr>
-        <w:fldChar w:fldCharType="end"/>
-      </w:r>
-      <w:r>
-        <w:rPr>
-          <w:rFonts w:ascii="var(--bs-body-font-family)" w:hAnsi="var(--bs-body-font-family)"/>
-          <w:lang w:val="en-US"/>
-        </w:rPr>
-        <w:t xml:space="preserve">; </w:t>
-      </w:r>
-      <w:proofErr w:type="spellStart"/>
-      <w:r>
-        <w:rPr>
-          <w:rStyle w:val="citation"/>
-          <w:rFonts w:ascii="var(--bs-body-font-family)" w:hAnsi="var(--bs-body-font-family)"/>
-          <w:lang w:val="en-US"/>
-        </w:rPr>
-        <w:t>Brunovskis</w:t>
-      </w:r>
-      <w:proofErr w:type="spellEnd"/>
-      <w:r>
-        <w:rPr>
-          <w:rStyle w:val="citation"/>
-          <w:rFonts w:ascii="var(--bs-body-font-family)" w:hAnsi="var(--bs-body-font-family)"/>
-          <w:lang w:val="en-US"/>
-        </w:rPr>
-        <w:t xml:space="preserve"> and Surtees</w:t>
-      </w:r>
-      <w:r>
-        <w:rPr>
-          <w:rStyle w:val="citation"/>
-          <w:rFonts w:ascii="var(--bs-body-font-family)" w:hAnsi="var(--bs-body-font-family)"/>
-          <w:lang w:val="en-US"/>
-        </w:rPr>
-        <w:t xml:space="preserve"> </w:t>
-      </w:r>
-      <w:r>
-        <w:rPr>
-          <w:rStyle w:val="citation"/>
-          <w:rFonts w:ascii="var(--bs-body-font-family)" w:hAnsi="var(--bs-body-font-family)" w:hint="eastAsia"/>
-          <w:lang w:val="en-US"/>
-        </w:rPr>
-        <w:fldChar w:fldCharType="begin"/>
-      </w:r>
-      <w:r>
-        <w:rPr>
-          <w:rStyle w:val="citation"/>
-          <w:rFonts w:ascii="var(--bs-body-font-family)" w:hAnsi="var(--bs-body-font-family)" w:hint="eastAsia"/>
-          <w:lang w:val="en-US"/>
-        </w:rPr>
-        <w:instrText xml:space="preserve"> ADDIN ZOTERO_ITEM CSL_CITATION {"citationID":"M8qMm8jf","properties":{"formattedCitation":"(2010)","plainCitation":"(2010)","noteIndex":0},"citationItems":[{"id":36,"uris":["http://zotero.org/users/local/nMxJkNMP/items/98MI22VS"],"itemData":{"id":36,"type":"article-journal","container-title":"International Migration","issue":"4","language":"en","note":"number: 4","page":"1</w:instrText>
-      </w:r>
-      <w:r>
-        <w:rPr>
-          <w:rStyle w:val="citation"/>
-          <w:rFonts w:ascii="var(--bs-body-font-family)" w:hAnsi="var(--bs-body-font-family)" w:hint="eastAsia"/>
-          <w:lang w:val="en-US"/>
-        </w:rPr>
-        <w:instrText>–</w:instrText>
-      </w:r>
-      <w:r>
-        <w:rPr>
-          <w:rStyle w:val="citation"/>
-          <w:rFonts w:ascii="var(--bs-body-font-family)" w:hAnsi="var(--bs-body-font-family)" w:hint="eastAsia"/>
-          <w:lang w:val="en-US"/>
-        </w:rPr>
-        <w:instrText xml:space="preserve">37","title":"Untold stories: biases and selection effects in research with victims of trafficking for sexual exploitation","volume":"48","author":[{"family":"Brunovskis","given":"A."},{"family":"Surtees","given":"R."}],"issued":{"date-parts":[["2010"]]}},"suppress-author":true}],"schema":"https://github.com/citation-style-language/schema/raw/master/csl-citation.json"} </w:instrText>
-      </w:r>
-      <w:r>
-        <w:rPr>
-          <w:rStyle w:val="citation"/>
-          <w:rFonts w:ascii="var(--bs-body-font-family)" w:hAnsi="var(--bs-body-font-family)" w:hint="eastAsia"/>
-          <w:lang w:val="en-US"/>
-        </w:rPr>
-        <w:fldChar w:fldCharType="separate"/>
-      </w:r>
-      <w:r>
-        <w:rPr>
-          <w:rFonts w:ascii="var(--bs-body-font-family)" w:hAnsi="var(--bs-body-font-family)"/>
-        </w:rPr>
-        <w:t>(2010)</w:t>
-      </w:r>
-      <w:r>
-        <w:rPr>
-          <w:rStyle w:val="citation"/>
-          <w:rFonts w:ascii="var(--bs-body-font-family)" w:hAnsi="var(--bs-body-font-family)" w:hint="eastAsia"/>
-          <w:lang w:val="en-US"/>
-        </w:rPr>
-        <w:fldChar w:fldCharType="end"/>
-      </w:r>
-      <w:r>
-        <w:rPr>
-          <w:rFonts w:ascii="var(--bs-body-font-family)" w:hAnsi="var(--bs-body-font-family)"/>
-          <w:lang w:val="en-US"/>
-        </w:rPr>
-        <w:t xml:space="preserve">; </w:t>
-      </w:r>
-      <w:r>
-        <w:rPr>
-          <w:rStyle w:val="citation"/>
-          <w:rFonts w:ascii="var(--bs-body-font-family)" w:hAnsi="var(--bs-body-font-family)"/>
-          <w:lang w:val="en-US"/>
-        </w:rPr>
-        <w:t>Semaan</w:t>
-      </w:r>
-      <w:r>
-        <w:rPr>
-          <w:rStyle w:val="citation"/>
-          <w:rFonts w:ascii="var(--bs-body-font-family)" w:hAnsi="var(--bs-body-font-family)"/>
-          <w:lang w:val="en-US"/>
-        </w:rPr>
-        <w:t xml:space="preserve"> </w:t>
-      </w:r>
-      <w:r>
-        <w:rPr>
-          <w:rStyle w:val="citation"/>
-          <w:rFonts w:ascii="var(--bs-body-font-family)" w:hAnsi="var(--bs-body-font-family)" w:hint="eastAsia"/>
-          <w:lang w:val="en-US"/>
-        </w:rPr>
-        <w:fldChar w:fldCharType="begin"/>
-      </w:r>
-      <w:r>
-        <w:rPr>
-          <w:rStyle w:val="citation"/>
-          <w:rFonts w:ascii="var(--bs-body-font-family)" w:hAnsi="var(--bs-body-font-family)" w:hint="eastAsia"/>
-          <w:lang w:val="en-US"/>
-        </w:rPr>
-        <w:instrText xml:space="preserve"> ADDIN ZOTERO_ITEM CSL_CITATION {"citationID":"XdhIv4CM","properties":{"formattedCitation":"(2010)","plainCitation":"(2010)","noteIndex":0},"citationItems":[{"id":67,"uris":["http://zotero.org/users/local/nMxJkNMP/items/FTZHW8IZ"],"itemData":{"id":67,"type":"article-journal","container-title":"Methodological Innovations Online","issue":"2","language":"en","note":"number: 2","page":"60</w:instrText>
-      </w:r>
-      <w:r>
-        <w:rPr>
-          <w:rStyle w:val="citation"/>
-          <w:rFonts w:ascii="var(--bs-body-font-family)" w:hAnsi="var(--bs-body-font-family)" w:hint="eastAsia"/>
-          <w:lang w:val="en-US"/>
-        </w:rPr>
-        <w:instrText>–</w:instrText>
-      </w:r>
-      <w:r>
-        <w:rPr>
-          <w:rStyle w:val="citation"/>
-          <w:rFonts w:ascii="var(--bs-body-font-family)" w:hAnsi="var(--bs-body-font-family)" w:hint="eastAsia"/>
-          <w:lang w:val="en-US"/>
-        </w:rPr>
-        <w:instrText xml:space="preserve">75","title":"Time-space sampling and respondent-driven sampling with hard-to-reach populations","volume":"5","author":[{"family":"Semaan","given":"S."}],"issued":{"date-parts":[["2010"]]}},"suppress-author":true}],"schema":"https://github.com/citation-style-language/schema/raw/master/csl-citation.json"} </w:instrText>
-      </w:r>
-      <w:r>
-        <w:rPr>
-          <w:rStyle w:val="citation"/>
-          <w:rFonts w:ascii="var(--bs-body-font-family)" w:hAnsi="var(--bs-body-font-family)" w:hint="eastAsia"/>
-          <w:lang w:val="en-US"/>
-        </w:rPr>
-        <w:fldChar w:fldCharType="separate"/>
-      </w:r>
-      <w:r>
-        <w:rPr>
-          <w:rFonts w:ascii="var(--bs-body-font-family)" w:hAnsi="var(--bs-body-font-family)"/>
-        </w:rPr>
-        <w:t>(2010)</w:t>
-      </w:r>
-      <w:r>
-        <w:rPr>
-          <w:rStyle w:val="citation"/>
-          <w:rFonts w:ascii="var(--bs-body-font-family)" w:hAnsi="var(--bs-body-font-family)" w:hint="eastAsia"/>
-          <w:lang w:val="en-US"/>
-        </w:rPr>
-        <w:fldChar w:fldCharType="end"/>
-      </w:r>
-      <w:r>
-        <w:rPr>
-          <w:rFonts w:ascii="var(--bs-body-font-family)" w:hAnsi="var(--bs-body-font-family)"/>
-          <w:lang w:val="en-US"/>
-        </w:rPr>
-        <w:t xml:space="preserve">; </w:t>
-      </w:r>
-      <w:r>
-        <w:rPr>
-          <w:rStyle w:val="citation"/>
-          <w:rFonts w:ascii="var(--bs-body-font-family)" w:hAnsi="var(--bs-body-font-family)"/>
-          <w:lang w:val="en-US"/>
-        </w:rPr>
-        <w:t xml:space="preserve">Platt, Luthra, and Frere-Smith </w:t>
-      </w:r>
-      <w:r>
-        <w:rPr>
-          <w:rStyle w:val="citation"/>
-          <w:rFonts w:ascii="var(--bs-body-font-family)" w:hAnsi="var(--bs-body-font-family)" w:hint="eastAsia"/>
-          <w:lang w:val="en-US"/>
-        </w:rPr>
-        <w:fldChar w:fldCharType="begin"/>
-      </w:r>
-      <w:r>
-        <w:rPr>
-          <w:rStyle w:val="citation"/>
-          <w:rFonts w:ascii="var(--bs-body-font-family)" w:hAnsi="var(--bs-body-font-family)" w:hint="eastAsia"/>
-          <w:lang w:val="en-US"/>
-        </w:rPr>
-        <w:instrText xml:space="preserve"> ADDIN ZOTERO_ITEM CSL_CITATION {"citationID":"15H4e1oH","properties":{"formattedCitation":"(2015)","plainCitation":"(2015)","noteIndex":0},"citationItems":[{"id":63,"uris":["http://zotero.org/users/local/nMxJkNMP/items/4SLFC6UU"],"itemData":{"id":63,"type":"article-journal","container-title":"Demographic Research","language":"en","page":"665</w:instrText>
-      </w:r>
-      <w:r>
-        <w:rPr>
-          <w:rStyle w:val="citation"/>
-          <w:rFonts w:ascii="var(--bs-body-font-family)" w:hAnsi="var(--bs-body-font-family)" w:hint="eastAsia"/>
-          <w:lang w:val="en-US"/>
-        </w:rPr>
-        <w:instrText>–</w:instrText>
-      </w:r>
-      <w:r>
-        <w:rPr>
-          <w:rStyle w:val="citation"/>
-          <w:rFonts w:ascii="var(--bs-body-font-family)" w:hAnsi="var(--bs-body-font-family)" w:hint="eastAsia"/>
-          <w:lang w:val="en-US"/>
-        </w:rPr>
-        <w:instrText xml:space="preserve">700","title":"Adapting chain referral methods to sample new migrants: Possibilities and limitations","volume":"33","author":[{"family":"Platt","given":"L."},{"family":"Luthra","given":"R."},{"family":"Frere-Smith","given":"T."}],"issued":{"date-parts":[["2015"]]}},"suppress-author":true}],"schema":"https://github.com/citation-style-language/schema/raw/master/csl-citation.json"} </w:instrText>
-      </w:r>
-      <w:r>
-        <w:rPr>
-          <w:rStyle w:val="citation"/>
-          <w:rFonts w:ascii="var(--bs-body-font-family)" w:hAnsi="var(--bs-body-font-family)" w:hint="eastAsia"/>
-          <w:lang w:val="en-US"/>
-        </w:rPr>
-        <w:fldChar w:fldCharType="separate"/>
-      </w:r>
-      <w:r>
-        <w:rPr>
-          <w:rFonts w:ascii="var(--bs-body-font-family)" w:hAnsi="var(--bs-body-font-family)"/>
-        </w:rPr>
-        <w:t>(2015)</w:t>
-      </w:r>
-      <w:r>
-        <w:rPr>
-          <w:rStyle w:val="citation"/>
-          <w:rFonts w:ascii="var(--bs-body-font-family)" w:hAnsi="var(--bs-body-font-family)" w:hint="eastAsia"/>
-          <w:lang w:val="en-US"/>
-        </w:rPr>
-        <w:fldChar w:fldCharType="end"/>
-      </w:r>
-      <w:r>
-        <w:rPr>
-          <w:rFonts w:ascii="var(--bs-body-font-family)" w:hAnsi="var(--bs-body-font-family)"/>
-          <w:lang w:val="en-US"/>
-        </w:rPr>
-        <w:t>, including the specificities of incentive use within web-based surveys</w:t>
-      </w:r>
-      <w:r>
-        <w:rPr>
-          <w:rFonts w:ascii="var(--bs-body-font-family)" w:hAnsi="var(--bs-body-font-family)"/>
-          <w:lang w:val="en-US"/>
-        </w:rPr>
-        <w:t xml:space="preserve"> </w:t>
-      </w:r>
-      <w:r>
-        <w:rPr>
-          <w:rFonts w:ascii="var(--bs-body-font-family)" w:hAnsi="var(--bs-body-font-family)" w:hint="eastAsia"/>
-          <w:lang w:val="en-US"/>
-        </w:rPr>
-        <w:fldChar w:fldCharType="begin"/>
-      </w:r>
-      <w:r>
-        <w:rPr>
-          <w:rFonts w:ascii="var(--bs-body-font-family)" w:hAnsi="var(--bs-body-font-family)" w:hint="eastAsia"/>
-          <w:lang w:val="en-US"/>
-        </w:rPr>
-        <w:instrText xml:space="preserve"> ADDIN ZOTERO_ITEM CSL_CITATION {"citationID":"FJM9XK9W","properties":{"formattedCitation":"(Cobanoglu and Cobanoglu, 2003)","plainCitation":"(Cobanoglu and Cobanoglu, 2003)","noteIndex":0},"citationItems":[{"id":37,"uris":["http://zotero.org/users/local/nMxJkNMP/items/4296TQE7"],"itemData":{"id":37,"type":"article-journal","container-title":"International Journal of Market Research","issue":"4","language":"en","note":"number: 4","page":"1</w:instrText>
-      </w:r>
-      <w:r>
-        <w:rPr>
-          <w:rFonts w:ascii="var(--bs-body-font-family)" w:hAnsi="var(--bs-body-font-family)" w:hint="eastAsia"/>
-          <w:lang w:val="en-US"/>
-        </w:rPr>
-        <w:instrText>–</w:instrText>
-      </w:r>
-      <w:r>
-        <w:rPr>
-          <w:rFonts w:ascii="var(--bs-body-font-family)" w:hAnsi="var(--bs-body-font-family)" w:hint="eastAsia"/>
-          <w:lang w:val="en-US"/>
-        </w:rPr>
-        <w:instrText xml:space="preserve">13","title":"The effect of incentives in web surveys: application and ethical considerations","volume":"45","author":[{"family":"Cobanoglu","given":"C."},{"family":"Cobanoglu","given":"N."}],"issued":{"date-parts":[["2003"]]}}}],"schema":"https://github.com/citation-style-language/schema/raw/master/csl-citation.json"} </w:instrText>
-      </w:r>
-      <w:r>
-        <w:rPr>
-          <w:rFonts w:ascii="var(--bs-body-font-family)" w:hAnsi="var(--bs-body-font-family)" w:hint="eastAsia"/>
-          <w:lang w:val="en-US"/>
-        </w:rPr>
-        <w:fldChar w:fldCharType="separate"/>
-      </w:r>
-      <w:r>
-        <w:rPr>
-          <w:rFonts w:ascii="var(--bs-body-font-family)" w:hAnsi="var(--bs-body-font-family)"/>
-        </w:rPr>
-        <w:t>(Cobanoglu and Cobanoglu, 2003)</w:t>
-      </w:r>
-      <w:r>
-        <w:rPr>
-          <w:rFonts w:ascii="var(--bs-body-font-family)" w:hAnsi="var(--bs-body-font-family)" w:hint="eastAsia"/>
-          <w:lang w:val="en-US"/>
-        </w:rPr>
-        <w:fldChar w:fldCharType="end"/>
-      </w:r>
-      <w:r>
-        <w:rPr>
-          <w:rFonts w:ascii="var(--bs-body-font-family)" w:hAnsi="var(--bs-body-font-family)"/>
-          <w:lang w:val="en-US"/>
-        </w:rPr>
-        <w:t xml:space="preserve">. Following the principles of lottery use established by </w:t>
-      </w:r>
-      <w:r>
-        <w:rPr>
-          <w:rStyle w:val="citation"/>
-          <w:rFonts w:ascii="var(--bs-body-font-family)" w:hAnsi="var(--bs-body-font-family)"/>
-          <w:lang w:val="en-US"/>
-        </w:rPr>
-        <w:t>Brown, Schonfeld, and Gordon</w:t>
-      </w:r>
-      <w:r>
-        <w:rPr>
-          <w:rStyle w:val="citation"/>
-          <w:rFonts w:ascii="var(--bs-body-font-family)" w:hAnsi="var(--bs-body-font-family)"/>
-          <w:lang w:val="en-US"/>
-        </w:rPr>
-        <w:t xml:space="preserve"> </w:t>
-      </w:r>
-      <w:r>
-        <w:rPr>
-          <w:rStyle w:val="citation"/>
-          <w:rFonts w:ascii="var(--bs-body-font-family)" w:hAnsi="var(--bs-body-font-family)" w:hint="eastAsia"/>
-          <w:lang w:val="en-US"/>
-        </w:rPr>
-        <w:fldChar w:fldCharType="begin"/>
-      </w:r>
-      <w:r>
-        <w:rPr>
-          <w:rStyle w:val="citation"/>
-          <w:rFonts w:ascii="var(--bs-body-font-family)" w:hAnsi="var(--bs-body-font-family)" w:hint="eastAsia"/>
-          <w:lang w:val="en-US"/>
-        </w:rPr>
-        <w:instrText xml:space="preserve"> ADDIN ZOTERO_ITEM CSL_CITATION {"citationID":"mqx0sWoY","properties":{"formattedCitation":"(2006)","plainCitation":"(2006)","noteIndex":0},"citationItems":[{"id":35,"uris":["http://zotero.org/users/local/nMxJkNMP/items/UR9F5PNF"],"itemData":{"id":35,"type":"article-journal","container-title":"IRB: Ethics &amp; Human Research","issue":"1","language":"en","note":"number: 1","page":"12</w:instrText>
-      </w:r>
-      <w:r>
-        <w:rPr>
-          <w:rStyle w:val="citation"/>
-          <w:rFonts w:ascii="var(--bs-body-font-family)" w:hAnsi="var(--bs-body-font-family)" w:hint="eastAsia"/>
-          <w:lang w:val="en-US"/>
-        </w:rPr>
-        <w:instrText>–</w:instrText>
-      </w:r>
-      <w:r>
-        <w:rPr>
-          <w:rStyle w:val="citation"/>
-          <w:rFonts w:ascii="var(--bs-body-font-family)" w:hAnsi="var(--bs-body-font-family)" w:hint="eastAsia"/>
-          <w:lang w:val="en-US"/>
-        </w:rPr>
-        <w:instrText>16","title":"You may have already won...</w:instrText>
-      </w:r>
-      <w:r>
-        <w:rPr>
-          <w:rStyle w:val="citation"/>
-          <w:rFonts w:ascii="var(--bs-body-font-family)" w:hAnsi="var(--bs-body-font-family)" w:hint="eastAsia"/>
-          <w:lang w:val="en-US"/>
-        </w:rPr>
-        <w:instrText>”</w:instrText>
-      </w:r>
-      <w:r>
-        <w:rPr>
-          <w:rStyle w:val="citation"/>
-          <w:rFonts w:ascii="var(--bs-body-font-family)" w:hAnsi="var(--bs-body-font-family)" w:hint="eastAsia"/>
-          <w:lang w:val="en-US"/>
-        </w:rPr>
-        <w:instrText xml:space="preserve">: An examination of the use of lottery payments in research","volume":"28","author":[{"family":"Brown","given":"J.S."},{"family":"Schonfeld","given":"T.L."},{"family":"Gordon","given":"B.G."}],"issued":{"date-parts":[["2006"]]}},"suppress-author":true}],"schema":"https://github.com/citation-style-language/schema/raw/master/csl-citation.json"} </w:instrText>
-      </w:r>
-      <w:r>
-        <w:rPr>
-          <w:rStyle w:val="citation"/>
-          <w:rFonts w:ascii="var(--bs-body-font-family)" w:hAnsi="var(--bs-body-font-family)" w:hint="eastAsia"/>
-          <w:lang w:val="en-US"/>
-        </w:rPr>
-        <w:fldChar w:fldCharType="separate"/>
-      </w:r>
-      <w:r>
-        <w:rPr>
-          <w:rFonts w:ascii="var(--bs-body-font-family)" w:hAnsi="var(--bs-body-font-family)"/>
-        </w:rPr>
-        <w:t>(2006)</w:t>
-      </w:r>
-      <w:r>
-        <w:rPr>
-          <w:rStyle w:val="citation"/>
-          <w:rFonts w:ascii="var(--bs-body-font-family)" w:hAnsi="var(--bs-body-font-family)" w:hint="eastAsia"/>
-          <w:lang w:val="en-US"/>
-        </w:rPr>
-        <w:fldChar w:fldCharType="end"/>
-      </w:r>
-      <w:r>
-        <w:rPr>
-          <w:rStyle w:val="citation"/>
-          <w:rFonts w:ascii="var(--bs-body-font-family)" w:hAnsi="var(--bs-body-font-family)"/>
-          <w:lang w:val="en-US"/>
-        </w:rPr>
-        <w:t xml:space="preserve"> </w:t>
-      </w:r>
-      <w:r>
-        <w:rPr>
-          <w:rFonts w:ascii="var(--bs-body-font-family)" w:hAnsi="var(--bs-body-font-family)"/>
-          <w:lang w:val="en-US"/>
-        </w:rPr>
-        <w:t xml:space="preserve">and </w:t>
-      </w:r>
-      <w:proofErr w:type="spellStart"/>
-      <w:r>
-        <w:rPr>
-          <w:rStyle w:val="citation"/>
-          <w:rFonts w:ascii="var(--bs-body-font-family)" w:hAnsi="var(--bs-body-font-family)"/>
-          <w:lang w:val="en-US"/>
-        </w:rPr>
-        <w:t>Laguilles</w:t>
-      </w:r>
-      <w:proofErr w:type="spellEnd"/>
-      <w:r>
-        <w:rPr>
-          <w:rStyle w:val="citation"/>
-          <w:rFonts w:ascii="var(--bs-body-font-family)" w:hAnsi="var(--bs-body-font-family)"/>
-          <w:lang w:val="en-US"/>
-        </w:rPr>
-        <w:t xml:space="preserve">, Williams, and Saunders </w:t>
-      </w:r>
-      <w:r>
-        <w:rPr>
-          <w:rStyle w:val="citation"/>
-          <w:rFonts w:ascii="var(--bs-body-font-family)" w:hAnsi="var(--bs-body-font-family)" w:hint="eastAsia"/>
-          <w:lang w:val="en-US"/>
-        </w:rPr>
-        <w:fldChar w:fldCharType="begin"/>
-      </w:r>
-      <w:r>
-        <w:rPr>
-          <w:rStyle w:val="citation"/>
-          <w:rFonts w:ascii="var(--bs-body-font-family)" w:hAnsi="var(--bs-body-font-family)" w:hint="eastAsia"/>
-          <w:lang w:val="en-US"/>
-        </w:rPr>
-        <w:instrText xml:space="preserve"> ADDIN ZOTERO_ITEM CSL_CITATION {"citationID":"ScupYhjp","properties":{"formattedCitation":"(2011)","plainCitation":"(2011)","noteIndex":0},"citationItems":[{"id":56,"uris":["http://zotero.org/users/local/nMxJkNMP/items/KX8WBVV2"],"itemData":{"id":56,"type":"article-journal","container-title":"Research in Higher Education","issue":"5","language":"en","note":"number: 5","page":"537</w:instrText>
-      </w:r>
-      <w:r>
-        <w:rPr>
-          <w:rStyle w:val="citation"/>
-          <w:rFonts w:ascii="var(--bs-body-font-family)" w:hAnsi="var(--bs-body-font-family)" w:hint="eastAsia"/>
-          <w:lang w:val="en-US"/>
-        </w:rPr>
-        <w:instrText>–</w:instrText>
-      </w:r>
-      <w:r>
-        <w:rPr>
-          <w:rStyle w:val="citation"/>
-          <w:rFonts w:ascii="var(--bs-body-font-family)" w:hAnsi="var(--bs-body-font-family)" w:hint="eastAsia"/>
-          <w:lang w:val="en-US"/>
-        </w:rPr>
-        <w:instrText xml:space="preserve">553","title":"Can lottery incentives boost web survey response rates? Findings from four experiments","volume":"52","author":[{"family":"Laguilles","given":"J.S."},{"family":"Williams","given":"E.A."},{"family":"Saunders","given":"D.B."}],"issued":{"date-parts":[["2011"]]}},"suppress-author":true}],"schema":"https://github.com/citation-style-language/schema/raw/master/csl-citation.json"} </w:instrText>
-      </w:r>
-      <w:r>
-        <w:rPr>
-          <w:rStyle w:val="citation"/>
-          <w:rFonts w:ascii="var(--bs-body-font-family)" w:hAnsi="var(--bs-body-font-family)" w:hint="eastAsia"/>
-          <w:lang w:val="en-US"/>
-        </w:rPr>
-        <w:fldChar w:fldCharType="separate"/>
-      </w:r>
-      <w:r>
-        <w:rPr>
-          <w:rFonts w:ascii="var(--bs-body-font-family)" w:hAnsi="var(--bs-body-font-family)"/>
-        </w:rPr>
-        <w:t>(2011)</w:t>
-      </w:r>
-      <w:r>
-        <w:rPr>
-          <w:rStyle w:val="citation"/>
-          <w:rFonts w:ascii="var(--bs-body-font-family)" w:hAnsi="var(--bs-body-font-family)" w:hint="eastAsia"/>
-          <w:lang w:val="en-US"/>
-        </w:rPr>
-        <w:fldChar w:fldCharType="end"/>
-      </w:r>
-      <w:r>
-        <w:rPr>
-          <w:rFonts w:ascii="var(--bs-body-font-family)" w:hAnsi="var(--bs-body-font-family)"/>
-          <w:lang w:val="en-US"/>
-        </w:rPr>
-        <w:t xml:space="preserve">, we also designed our survey to encourage the maximum extent of participation by entering all respondents completing the questionnaire into a free prize draw for £150. Research suggests that a high lottery provides the most cost-effective incentive for obtaining complete responses </w:t>
-      </w:r>
-      <w:r>
-        <w:rPr>
-          <w:rFonts w:ascii="var(--bs-body-font-family)" w:hAnsi="var(--bs-body-font-family)" w:hint="eastAsia"/>
-          <w:lang w:val="en-US"/>
-        </w:rPr>
-        <w:fldChar w:fldCharType="begin"/>
-      </w:r>
-      <w:r>
-        <w:rPr>
-          <w:rFonts w:ascii="var(--bs-body-font-family)" w:hAnsi="var(--bs-body-font-family)" w:hint="eastAsia"/>
-          <w:lang w:val="en-US"/>
-        </w:rPr>
-        <w:instrText xml:space="preserve"> ADDIN ZOTERO_ITEM CSL_CITATION {"citationID":"MLB1mM2K","properties":{"formattedCitation":"(Gajic, Cameron and Hurley, 2012)","plainCitation":"(Gajic, Cameron and Hurley, 2012)","noteIndex":0},"citationItems":[{"id":40,"uris":["http://zotero.org/users/local/nMxJkNMP/items/EB6EIWTZ"],"itemData":{"id":40,"type":"article-journal","container-title":"The European Journal of Health Economics","issue":"6","language":"en","note":"number: 6","page":"789</w:instrText>
-      </w:r>
-      <w:r>
-        <w:rPr>
-          <w:rFonts w:ascii="var(--bs-body-font-family)" w:hAnsi="var(--bs-body-font-family)" w:hint="eastAsia"/>
-          <w:lang w:val="en-US"/>
-        </w:rPr>
-        <w:instrText>–</w:instrText>
-      </w:r>
-      <w:r>
-        <w:rPr>
-          <w:rFonts w:ascii="var(--bs-body-font-family)" w:hAnsi="var(--bs-body-font-family)" w:hint="eastAsia"/>
-          <w:lang w:val="en-US"/>
-        </w:rPr>
-        <w:instrText xml:space="preserve">799","title":"The cost-effectiveness of cash versus lottery incentives for a web-based, stated-preference community survey","volume":"13","author":[{"family":"Gajic","given":"A."},{"family":"Cameron","given":"D."},{"family":"Hurley","given":"J."}],"issued":{"date-parts":[["2012"]]}}}],"schema":"https://github.com/citation-style-language/schema/raw/master/csl-citation.json"} </w:instrText>
-      </w:r>
-      <w:r>
-        <w:rPr>
-          <w:rFonts w:ascii="var(--bs-body-font-family)" w:hAnsi="var(--bs-body-font-family)" w:hint="eastAsia"/>
-          <w:lang w:val="en-US"/>
-        </w:rPr>
-        <w:fldChar w:fldCharType="separate"/>
-      </w:r>
-      <w:r>
-        <w:rPr>
-          <w:rFonts w:ascii="var(--bs-body-font-family)" w:hAnsi="var(--bs-body-font-family)"/>
-        </w:rPr>
-        <w:t>(Gajic, Cameron and Hurley, 2012)</w:t>
-      </w:r>
-      <w:r>
-        <w:rPr>
-          <w:rFonts w:ascii="var(--bs-body-font-family)" w:hAnsi="var(--bs-body-font-family)" w:hint="eastAsia"/>
-          <w:lang w:val="en-US"/>
-        </w:rPr>
-        <w:fldChar w:fldCharType="end"/>
-      </w:r>
-      <w:r>
-        <w:rPr>
-          <w:rFonts w:ascii="var(--bs-body-font-family)" w:hAnsi="var(--bs-body-font-family)"/>
-          <w:lang w:val="en-US"/>
-        </w:rPr>
-        <w:t xml:space="preserve">. While using incentives to encourage participation would seem to be desirable, it is worth noting the potential downside of respondents fabricating responses to increase their remuneration </w:t>
-      </w:r>
-      <w:r>
-        <w:rPr>
-          <w:rFonts w:ascii="var(--bs-body-font-family)" w:hAnsi="var(--bs-body-font-family)" w:hint="eastAsia"/>
-          <w:lang w:val="en-US"/>
-        </w:rPr>
-        <w:fldChar w:fldCharType="begin"/>
-      </w:r>
-      <w:r>
-        <w:rPr>
-          <w:rFonts w:ascii="var(--bs-body-font-family)" w:hAnsi="var(--bs-body-font-family)" w:hint="eastAsia"/>
-          <w:lang w:val="en-US"/>
-        </w:rPr>
-        <w:instrText xml:space="preserve"> ADDIN ZOTERO_ITEM CSL_CITATION {"citationID":"5eJGO10c","properties":{"formattedCitation":"(Robinson, 2014)","plainCitation":"(Robinson, 2014)","noteIndex":0},"citationItems":[{"id":64,"uris":["http://zotero.org/users/local/nMxJkNMP/items/U5Z2QYDU"],"itemData":{"id":64,"type":"article-journal","container-title":"Qualitative research in psychology","issue":"1","language":"en","note":"number: 1","page":"25</w:instrText>
-      </w:r>
-      <w:r>
-        <w:rPr>
-          <w:rFonts w:ascii="var(--bs-body-font-family)" w:hAnsi="var(--bs-body-font-family)" w:hint="eastAsia"/>
-          <w:lang w:val="en-US"/>
-        </w:rPr>
-        <w:instrText>–</w:instrText>
-      </w:r>
-      <w:r>
-        <w:rPr>
-          <w:rFonts w:ascii="var(--bs-body-font-family)" w:hAnsi="var(--bs-body-font-family)" w:hint="eastAsia"/>
-          <w:lang w:val="en-US"/>
-        </w:rPr>
-        <w:instrText xml:space="preserve">41","title":"Sampling in interview-based qualitative research: A theoretical and practical guide","volume":"11","author":[{"family":"Robinson","given":"O.C."}],"issued":{"date-parts":[["2014"]]}}}],"schema":"https://github.com/citation-style-language/schema/raw/master/csl-citation.json"} </w:instrText>
-      </w:r>
-      <w:r>
-        <w:rPr>
-          <w:rFonts w:ascii="var(--bs-body-font-family)" w:hAnsi="var(--bs-body-font-family)" w:hint="eastAsia"/>
-          <w:lang w:val="en-US"/>
-        </w:rPr>
-        <w:fldChar w:fldCharType="separate"/>
-      </w:r>
-      <w:r>
-        <w:rPr>
-          <w:rFonts w:ascii="var(--bs-body-font-family)" w:hAnsi="var(--bs-body-font-family)"/>
-        </w:rPr>
-        <w:t>(Robinson, 2014)</w:t>
-      </w:r>
-      <w:r>
-        <w:rPr>
-          <w:rFonts w:ascii="var(--bs-body-font-family)" w:hAnsi="var(--bs-body-font-family)" w:hint="eastAsia"/>
-          <w:lang w:val="en-US"/>
-        </w:rPr>
-        <w:fldChar w:fldCharType="end"/>
-      </w:r>
-      <w:r>
-        <w:rPr>
-          <w:rFonts w:ascii="var(--bs-body-font-family)" w:hAnsi="var(--bs-body-font-family)"/>
-          <w:lang w:val="en-US"/>
-        </w:rPr>
-        <w:t xml:space="preserve">. To </w:t>
-      </w:r>
-      <w:proofErr w:type="spellStart"/>
-      <w:r>
-        <w:rPr>
-          <w:rFonts w:ascii="var(--bs-body-font-family)" w:hAnsi="var(--bs-body-font-family)"/>
-          <w:lang w:val="en-US"/>
-        </w:rPr>
-        <w:t>minimise</w:t>
-      </w:r>
-      <w:proofErr w:type="spellEnd"/>
-      <w:r>
-        <w:rPr>
-          <w:rFonts w:ascii="var(--bs-body-font-family)" w:hAnsi="var(--bs-body-font-family)"/>
-          <w:lang w:val="en-US"/>
-        </w:rPr>
-        <w:t xml:space="preserve"> this risk, mobile phone numbers for each respondent and those whom they referred were collated, and each of these numbers was </w:t>
-      </w:r>
-      <w:r>
-        <w:rPr>
-          <w:rFonts w:ascii="var(--bs-body-font-family)" w:hAnsi="var(--bs-body-font-family)"/>
-          <w:lang w:val="en-US"/>
-        </w:rPr>
-        <w:lastRenderedPageBreak/>
-        <w:t>called by one of the authors of the paper to ascertain the veracity of the respondent as a migrant domestic worker.</w:t>
-      </w:r>
-      <w:r>
-        <w:rPr>
-          <w:rFonts w:ascii="var(--bs-body-font-family)" w:hAnsi="var(--bs-body-font-family)"/>
-          <w:lang w:val="en-US"/>
-        </w:rPr>
-        <w:t xml:space="preserve"> </w:t>
-      </w:r>
-      <w:r>
-        <w:rPr>
-          <w:rFonts w:ascii="var(--bs-body-font-family)" w:hAnsi="var(--bs-body-font-family)"/>
-          <w:lang w:val="en-US"/>
-        </w:rPr>
-        <w:t xml:space="preserve">The data collection that underpins the analysis presented in this paper was given </w:t>
-      </w:r>
-      <w:proofErr w:type="spellStart"/>
-      <w:r>
-        <w:rPr>
-          <w:rFonts w:ascii="var(--bs-body-font-family)" w:hAnsi="var(--bs-body-font-family)"/>
-          <w:lang w:val="en-US"/>
-        </w:rPr>
-        <w:t>favourable</w:t>
-      </w:r>
-      <w:proofErr w:type="spellEnd"/>
-      <w:r>
-        <w:rPr>
-          <w:rFonts w:ascii="var(--bs-body-font-family)" w:hAnsi="var(--bs-body-font-family)"/>
-          <w:lang w:val="en-US"/>
-        </w:rPr>
-        <w:t xml:space="preserve"> ethical approval by the lead author’s School Research Ethics Committee in January 2023. All participants were informed about the aims of the study, provided informed consent, and were assured that participation was voluntary and confidential.</w:t>
+          <w:rFonts w:ascii="var(--bs-body-font-family)" w:hAnsi="var(--bs-body-font-family)"/>
+          <w:lang w:val="en-US"/>
+        </w:rPr>
+        <w:t>The data collection that underpins the analysis presented in this paper was given favourable ethical approval by the lead author’s School Research Ethics Committee in January 2023. All participants were informed about the aims of the study, provided informed consent, and were assured that participation was voluntary and confidential.</w:t>
       </w:r>
     </w:p>
     <w:p>
@@ -3456,23 +2990,7 @@
           <w:rFonts w:ascii="var(--bs-body-font-family)" w:hAnsi="var(--bs-body-font-family)"/>
           <w:lang w:val="en-US"/>
         </w:rPr>
-        <w:t xml:space="preserve">The survey instrument was designed to capture both egocentric (ego-based) and </w:t>
-      </w:r>
-      <w:proofErr w:type="spellStart"/>
-      <w:r>
-        <w:rPr>
-          <w:rFonts w:ascii="var(--bs-body-font-family)" w:hAnsi="var(--bs-body-font-family)"/>
-          <w:lang w:val="en-US"/>
-        </w:rPr>
-        <w:t>altercentric</w:t>
-      </w:r>
-      <w:proofErr w:type="spellEnd"/>
-      <w:r>
-        <w:rPr>
-          <w:rFonts w:ascii="var(--bs-body-font-family)" w:hAnsi="var(--bs-body-font-family)"/>
-          <w:lang w:val="en-US"/>
-        </w:rPr>
-        <w:t xml:space="preserve"> (alter-based) network information, enabling the application of both RDS and NSUM estimation methods</w:t>
+        <w:t>The survey instrument was designed to capture both egocentric (ego-based) and altercentric (alter-based) network information, enabling the application of both RDS and NSUM estimation methods</w:t>
       </w:r>
       <w:r>
         <w:rPr>
@@ -3493,55 +3011,7 @@
           <w:rFonts w:ascii="var(--bs-body-font-family)" w:hAnsi="var(--bs-body-font-family)"/>
           <w:lang w:val="en-US"/>
         </w:rPr>
-        <w:t xml:space="preserve">Composite measures to quantify the extent to which respondents were at risk of </w:t>
-      </w:r>
-      <w:proofErr w:type="spellStart"/>
-      <w:r>
-        <w:rPr>
-          <w:rFonts w:ascii="var(--bs-body-font-family)" w:hAnsi="var(--bs-body-font-family)"/>
-          <w:lang w:val="en-US"/>
-        </w:rPr>
-        <w:t>labour</w:t>
-      </w:r>
-      <w:proofErr w:type="spellEnd"/>
-      <w:r>
-        <w:rPr>
-          <w:rFonts w:ascii="var(--bs-body-font-family)" w:hAnsi="var(--bs-body-font-family)"/>
-          <w:lang w:val="en-US"/>
-        </w:rPr>
-        <w:t xml:space="preserve"> exploitation, including severe forms of exploitation such as forced </w:t>
-      </w:r>
-      <w:proofErr w:type="spellStart"/>
-      <w:r>
-        <w:rPr>
-          <w:rFonts w:ascii="var(--bs-body-font-family)" w:hAnsi="var(--bs-body-font-family)"/>
-          <w:lang w:val="en-US"/>
-        </w:rPr>
-        <w:t>labour</w:t>
-      </w:r>
-      <w:proofErr w:type="spellEnd"/>
-      <w:r>
-        <w:rPr>
-          <w:rFonts w:ascii="var(--bs-body-font-family)" w:hAnsi="var(--bs-body-font-family)"/>
-          <w:lang w:val="en-US"/>
-        </w:rPr>
-        <w:t xml:space="preserve">, were constructed from existing exploitation typologies, notably the ILO’s Indicators of Forced </w:t>
-      </w:r>
-      <w:proofErr w:type="spellStart"/>
-      <w:r>
-        <w:rPr>
-          <w:rFonts w:ascii="var(--bs-body-font-family)" w:hAnsi="var(--bs-body-font-family)"/>
-          <w:lang w:val="en-US"/>
-        </w:rPr>
-        <w:t>Labour</w:t>
-      </w:r>
-      <w:proofErr w:type="spellEnd"/>
-      <w:r>
-        <w:rPr>
-          <w:rFonts w:ascii="var(--bs-body-font-family)" w:hAnsi="var(--bs-body-font-family)"/>
-          <w:lang w:val="en-US"/>
-        </w:rPr>
-        <w:t xml:space="preserve"> </w:t>
+        <w:t xml:space="preserve">Composite measures to quantify the extent to which respondents were at risk of labour exploitation, including severe forms of exploitation such as forced labour, were constructed from existing exploitation typologies, notably the ILO’s Indicators of Forced Labour </w:t>
       </w:r>
       <w:r>
         <w:rPr>
@@ -3600,7 +3070,15 @@
           <w:rFonts w:ascii="var(--bs-body-font-family)" w:hAnsi="var(--bs-body-font-family)"/>
           <w:lang w:val="en"/>
         </w:rPr>
-        <w:t>The survey consisted of 11 composite indicators and included questions related to domestic workers’ level of job satisfaction, employment conditions, and demographic data such as nationality, age, and gender. Based on these indicators, we operationalize exploitation in two ways: (1) five dichotomous (binary) indicators classifying respondents as exploited or not exploited based on threshold criteria, and (2) one continuous risk index designed to capture gradations of vulnerability across the full sample.</w:t>
+        <w:t xml:space="preserve">The survey consisted of 11 composite indicators and included questions related to domestic workers’ level of job satisfaction, employment conditions, and demographic data such as nationality, age, and gender. Based on these indicators, we operationalize exploitation in two ways: (1) five dichotomous (binary) indicators classifying respondents as exploited or not exploited based on threshold criteria, and (2) one </w:t>
+      </w:r>
+      <w:r>
+        <w:rPr>
+          <w:rFonts w:ascii="var(--bs-body-font-family)" w:hAnsi="var(--bs-body-font-family)"/>
+          <w:lang w:val="en"/>
+        </w:rPr>
+        <w:lastRenderedPageBreak/>
+        <w:t>continuous risk index designed to capture gradations of vulnerability across the full sample.</w:t>
       </w:r>
     </w:p>
     <w:p>
@@ -3625,15 +3103,7 @@
           <w:rFonts w:ascii="var(--bs-body-font-family)" w:hAnsi="var(--bs-body-font-family)"/>
           <w:lang w:val="en"/>
         </w:rPr>
-        <w:t xml:space="preserve">Online </w:t>
-      </w:r>
-      <w:r>
-        <w:rPr>
-          <w:rFonts w:ascii="var(--bs-body-font-family)" w:hAnsi="var(--bs-body-font-family)"/>
-          <w:lang w:val="en"/>
-        </w:rPr>
-        <w:lastRenderedPageBreak/>
-        <w:t xml:space="preserve">Resource </w:t>
+        <w:t xml:space="preserve">Online Resource </w:t>
       </w:r>
       <w:r>
         <w:rPr>
@@ -3844,21 +3314,7 @@
         <w:rPr>
           <w:lang w:val="en-US"/>
         </w:rPr>
-        <w:t xml:space="preserve"> provide valid population estimates even for modest sample sizes, particularly when uncertainty is appropriately quantified through resampling or posterior distributions. In this study, we additionally employ a </w:t>
-      </w:r>
-      <w:proofErr w:type="spellStart"/>
-      <w:r>
-        <w:rPr>
-          <w:lang w:val="en-US"/>
-        </w:rPr>
-        <w:t>neighbourhood</w:t>
-      </w:r>
-      <w:proofErr w:type="spellEnd"/>
-      <w:r>
-        <w:rPr>
-          <w:lang w:val="en-US"/>
-        </w:rPr>
-        <w:t xml:space="preserve"> bootstrap procedure that propagates sampling and network uncertainty, providing robust confidence intervals consistent with small-sample design-based inference </w:t>
+        <w:t xml:space="preserve"> provide valid population estimates even for modest sample sizes, particularly when uncertainty is appropriately quantified through resampling or posterior distributions. In this study, we additionally employ a neighbourhood bootstrap procedure that propagates sampling and network uncertainty, providing robust confidence intervals consistent with small-sample design-based inference </w:t>
       </w:r>
       <w:r>
         <w:rPr>
@@ -3909,31 +3365,8 @@
           <w:rFonts w:ascii="var(--bs-body-font-family)" w:hAnsi="var(--bs-body-font-family)"/>
           <w:lang w:val="en-US"/>
         </w:rPr>
-        <w:t xml:space="preserve">Of the 97 initial respondents, 90 identified themselves as transnational migrants. Forty-five percent regarded themselves as self-employed, 39% identified themselves as employees, and 16% </w:t>
-      </w:r>
-      <w:proofErr w:type="spellStart"/>
-      <w:r>
-        <w:rPr>
-          <w:rFonts w:ascii="var(--bs-body-font-family)" w:hAnsi="var(--bs-body-font-family)"/>
-          <w:lang w:val="en-US"/>
-        </w:rPr>
-        <w:t>categorised</w:t>
-      </w:r>
-      <w:proofErr w:type="spellEnd"/>
-      <w:r>
-        <w:rPr>
-          <w:rFonts w:ascii="var(--bs-body-font-family)" w:hAnsi="var(--bs-body-font-family)"/>
-          <w:lang w:val="en-US"/>
-        </w:rPr>
-        <w:t xml:space="preserve"> their employment status as that of a worker. The largest single nationality group, comprising 64 respondents (66% of the total), reported a Filipina background. Other nationalities represented included Dominican, Brazilian, </w:t>
-      </w:r>
-      <w:r>
-        <w:rPr>
-          <w:rFonts w:ascii="var(--bs-body-font-family)" w:hAnsi="var(--bs-body-font-family)"/>
-          <w:lang w:val="en-US"/>
-        </w:rPr>
         <w:lastRenderedPageBreak/>
-        <w:t>Spanish, Colombian, Bolivian, Venezuelan, Cuban, and Panamanian. Female domestic workers made up 97% of the sample, with 3% of the sample comprised of male domestic workers. The age structure of the domestic workers was skewed towards those over 45 years old, with such workers representing over half of the sample (see Table 1).</w:t>
+        <w:t>Of the 97 initial respondents, 90 identified themselves as transnational migrants. Forty-five percent regarded themselves as self-employed, 39% identified themselves as employees, and 16% categorised their employment status as that of a worker. The largest single nationality group, comprising 64 respondents (66% of the total), reported a Filipina background. Other nationalities represented included Dominican, Brazilian, Spanish, Colombian, Bolivian, Venezuelan, Cuban, and Panamanian. Female domestic workers made up 97% of the sample, with 3% of the sample comprised of male domestic workers. The age structure of the domestic workers was skewed towards those over 45 years old, with such workers representing over half of the sample (see Table 1).</w:t>
       </w:r>
     </w:p>
     <w:p>
@@ -3944,37 +3377,6 @@
           <w:lang w:val="en"/>
         </w:rPr>
       </w:pPr>
-      <w:r>
-        <w:rPr>
-          <w:rFonts w:ascii="var(--bs-body-font-family)" w:eastAsia="Times New Roman" w:hAnsi="var(--bs-body-font-family)"/>
-          <w:lang w:val="en"/>
-        </w:rPr>
-      </w:r>
-      <w:r>
-        <w:rPr>
-          <w:rFonts w:ascii="var(--bs-body-font-family)" w:eastAsia="Times New Roman" w:hAnsi="var(--bs-body-font-family)"/>
-          <w:lang w:val="en"/>
-        </w:rPr>
-      </w:r>
-      <w:r>
-        <w:rPr>
-          <w:rFonts w:ascii="var(--bs-body-font-family)" w:eastAsia="Times New Roman" w:hAnsi="var(--bs-body-font-family)"/>
-          <w:lang w:val="en"/>
-        </w:rPr>
-      </w:r>
-      <w:r>
-        <w:rPr>
-          <w:rFonts w:ascii="var(--bs-body-font-family)" w:eastAsia="Times New Roman" w:hAnsi="var(--bs-body-font-family)"/>
-          <w:noProof/>
-          <w:lang w:val="en"/>
-        </w:rPr>
-      </w:r>
-      <w:r>
-        <w:rPr>
-          <w:rFonts w:ascii="var(--bs-body-font-family)" w:eastAsia="Times New Roman" w:hAnsi="var(--bs-body-font-family)"/>
-          <w:lang w:val="en"/>
-        </w:rPr>
-      </w:r>
       <w:r>
         <w:rPr>
           <w:i/>
@@ -3989,22 +3391,26 @@
         <w:jc w:val="center"/>
       </w:pPr>
       <w:r>
+        <w:rPr>
+          <w:noProof/>
+        </w:rPr>
         <w:drawing>
-          <wp:inline xmlns:a="http://schemas.openxmlformats.org/drawingml/2006/main" xmlns:pic="http://schemas.openxmlformats.org/drawingml/2006/picture">
+          <wp:inline distT="0" distB="0" distL="0" distR="0" wp14:anchorId="7A099597" wp14:editId="5CBCBAA3">
             <wp:extent cx="5486400" cy="3918857"/>
+            <wp:effectExtent l="0" t="0" r="0" b="0"/>
             <wp:docPr id="7" name="Picture 7"/>
             <wp:cNvGraphicFramePr>
-              <a:graphicFrameLocks noChangeAspect="1"/>
+              <a:graphicFrameLocks xmlns:a="http://schemas.openxmlformats.org/drawingml/2006/main" noChangeAspect="1"/>
             </wp:cNvGraphicFramePr>
-            <a:graphic>
+            <a:graphic xmlns:a="http://schemas.openxmlformats.org/drawingml/2006/main">
               <a:graphicData uri="http://schemas.openxmlformats.org/drawingml/2006/picture">
-                <pic:pic>
+                <pic:pic xmlns:pic="http://schemas.openxmlformats.org/drawingml/2006/picture">
                   <pic:nvPicPr>
                     <pic:cNvPr id="0" name="main_fig1_recruitment_network.png"/>
                     <pic:cNvPicPr/>
                   </pic:nvPicPr>
                   <pic:blipFill>
-                    <a:blip r:embed="rId17"/>
+                    <a:blip r:embed="rId8"/>
                     <a:stretch>
                       <a:fillRect/>
                     </a:stretch>
@@ -4014,7 +3420,9 @@
                       <a:off x="0" y="0"/>
                       <a:ext cx="5486400" cy="3918857"/>
                     </a:xfrm>
-                    <a:prstGeom prst="rect"/>
+                    <a:prstGeom prst="rect">
+                      <a:avLst/>
+                    </a:prstGeom>
                   </pic:spPr>
                 </pic:pic>
               </a:graphicData>
@@ -4054,12 +3462,6 @@
       </w:pPr>
       <w:r>
         <w:rPr>
-          <w:rFonts w:ascii="var(--bs-body-font-family)" w:eastAsia="Times New Roman" w:hAnsi="var(--bs-body-font-family)"/>
-          <w:lang w:val="en"/>
-        </w:rPr>
-      </w:r>
-      <w:r>
-        <w:rPr>
           <w:i/>
           <w:color w:val="999999"/>
           <w:sz w:val="18"/>
@@ -4072,22 +3474,27 @@
         <w:jc w:val="center"/>
       </w:pPr>
       <w:r>
+        <w:rPr>
+          <w:noProof/>
+        </w:rPr>
+        <w:lastRenderedPageBreak/>
         <w:drawing>
-          <wp:inline xmlns:a="http://schemas.openxmlformats.org/drawingml/2006/main" xmlns:pic="http://schemas.openxmlformats.org/drawingml/2006/picture">
+          <wp:inline distT="0" distB="0" distL="0" distR="0" wp14:anchorId="4F50F7EC" wp14:editId="70440A79">
             <wp:extent cx="4182058" cy="771633"/>
+            <wp:effectExtent l="0" t="0" r="0" b="0"/>
             <wp:docPr id="5" name="Picture 5"/>
             <wp:cNvGraphicFramePr>
-              <a:graphicFrameLocks noChangeAspect="1"/>
+              <a:graphicFrameLocks xmlns:a="http://schemas.openxmlformats.org/drawingml/2006/main" noChangeAspect="1"/>
             </wp:cNvGraphicFramePr>
-            <a:graphic>
+            <a:graphic xmlns:a="http://schemas.openxmlformats.org/drawingml/2006/main">
               <a:graphicData uri="http://schemas.openxmlformats.org/drawingml/2006/picture">
-                <pic:pic>
+                <pic:pic xmlns:pic="http://schemas.openxmlformats.org/drawingml/2006/picture">
                   <pic:nvPicPr>
                     <pic:cNvPr id="0" name="tmp8zzulf3t.png"/>
                     <pic:cNvPicPr/>
                   </pic:nvPicPr>
                   <pic:blipFill>
-                    <a:blip r:embed="rId15"/>
+                    <a:blip r:embed="rId9"/>
                     <a:stretch>
                       <a:fillRect/>
                     </a:stretch>
@@ -4097,7 +3504,9 @@
                       <a:off x="0" y="0"/>
                       <a:ext cx="4182058" cy="771633"/>
                     </a:xfrm>
-                    <a:prstGeom prst="rect"/>
+                    <a:prstGeom prst="rect">
+                      <a:avLst/>
+                    </a:prstGeom>
                   </pic:spPr>
                 </pic:pic>
               </a:graphicData>
@@ -4112,10 +3521,10 @@
       </w:pPr>
       <w:r>
         <w:rPr>
+          <w:i/>
           <w:sz w:val="20"/>
-          <w:i/>
-        </w:rPr>
-        <w:t xml:space="preserve">Table 1 RDS Sample Characteristics by Nationality Cluster and Recruitment Wave. Source: Authors’ Own Work.</w:t>
+        </w:rPr>
+        <w:t>Table 1 RDS Sample Characteristics by Nationality Cluster and Recruitment Wave. Source: Authors’ Own Work.</w:t>
       </w:r>
     </w:p>
     <w:p>
@@ -4184,23 +3593,7 @@
           <w:rFonts w:ascii="var(--bs-body-font-family)" w:hAnsi="var(--bs-body-font-family)"/>
           <w:lang w:val="en-US"/>
         </w:rPr>
-        <w:t xml:space="preserve">We </w:t>
-      </w:r>
-      <w:proofErr w:type="spellStart"/>
-      <w:r>
-        <w:rPr>
-          <w:rFonts w:ascii="var(--bs-body-font-family)" w:hAnsi="var(--bs-body-font-family)"/>
-          <w:lang w:val="en-US"/>
-        </w:rPr>
-        <w:t>analysed</w:t>
-      </w:r>
-      <w:proofErr w:type="spellEnd"/>
-      <w:r>
-        <w:rPr>
-          <w:rFonts w:ascii="var(--bs-body-font-family)" w:hAnsi="var(--bs-body-font-family)"/>
-          <w:lang w:val="en-US"/>
-        </w:rPr>
-        <w:t xml:space="preserve"> the survey sample using multiple estimation models to assess robustness and conduct sensitivity analyses (see </w:t>
+        <w:t xml:space="preserve">We analysed the survey sample using multiple estimation models to assess robustness and conduct sensitivity analyses (see </w:t>
       </w:r>
       <w:r>
         <w:rPr>
@@ -4393,69 +3786,70 @@
         <w:rPr>
           <w:rFonts w:ascii="var(--bs-body-font-family)" w:hAnsi="var(--bs-body-font-family)"/>
         </w:rPr>
-        <w:t xml:space="preserve">(Volz and </w:t>
-      </w:r>
-      <w:r>
-        <w:rPr>
-          <w:rFonts w:ascii="var(--bs-body-font-family)" w:hAnsi="var(--bs-body-font-family)"/>
+        <w:t>(Volz and Heckathorn, 2008)</w:t>
+      </w:r>
+      <w:r>
+        <w:rPr>
+          <w:rFonts w:ascii="var(--bs-body-font-family)" w:hAnsi="var(--bs-body-font-family)" w:hint="eastAsia"/>
+          <w:lang w:val="en-US"/>
+        </w:rPr>
+        <w:fldChar w:fldCharType="end"/>
+      </w:r>
+      <w:r>
+        <w:rPr>
+          <w:rFonts w:ascii="var(--bs-body-font-family)" w:hAnsi="var(--bs-body-font-family)"/>
+          <w:lang w:val="en-US"/>
+        </w:rPr>
+        <w:t xml:space="preserve">, and Gile’s Successive Sampling (RDS-SS) estimator </w:t>
+      </w:r>
+      <w:r>
+        <w:rPr>
+          <w:rFonts w:ascii="var(--bs-body-font-family)" w:hAnsi="var(--bs-body-font-family)" w:hint="eastAsia"/>
+          <w:lang w:val="en-US"/>
+        </w:rPr>
+        <w:fldChar w:fldCharType="begin"/>
+      </w:r>
+      <w:r>
+        <w:rPr>
+          <w:rFonts w:ascii="var(--bs-body-font-family)" w:hAnsi="var(--bs-body-font-family)" w:hint="eastAsia"/>
+          <w:lang w:val="en-US"/>
+        </w:rPr>
+        <w:instrText xml:space="preserve"> ADDIN ZOTERO_ITEM CSL_CITATION {"citationID":"6L9SjSU1","properties":{"formattedCitation":"(Gile, 2011)","plainCitation":"(Gile, 2011)","noteIndex":0},"citationItems":[{"id":699,"uris":["http://zotero.org/users/local/nMxJkNMP/items/3NVXGXZB"],"itemData":{"id":699,"type":"article-journal","abstract":"Respondent-driven sampling is a form of link-tracing network sampling, which is widely used to study hard-to-reach populations, often to estimate population proportions. Previous treatments of this process have used a with-replacement approximation, which we show induces bias in estimates for large sample fractions and differential network connectedness by characteristic of interest. We present a treatment of respondent-driven sampling as a successive sampling process. Unlike existing representations, our approach respects the essential without-replacement feature of the process, while converging to an existing with-replacement representation for small sample fractions, and to the sample mean for a full-population sample. We present a successive-sampling based estimator for population means based on respondent-driven sampling data, and demonstrate its superior performance when the size of the hidden population is known. We present sensitivity analyses for unknown population sizes. In addition, we note that like other existing estimators, our new estimator is subject to bias induced by the selection of the initial sample. Using data collected among three populations in two countries, we illustrate the application of this approach to populations with varying characteristics. We conclude that the successive sampling estimator improves on existing estimators, and can also be used as a diagnostic tool when population size is not known. This article has supplementary material online.","container-title":"Journal of the American Statistical Association","DOI":"10.1198/jasa.2011.ap09475","ISSN":"0162-1459","issue":"493","note":"publisher: Taylor &amp; Francis\n_eprint: https://doi.org/10.1198/jasa.2011.ap09475","page":"135-146","source":"Taylor and Francis+NEJM","title":"Improved Inference for Respondent-Driven Sampling Data With Application to HIV Prevalence Estimation","URL":"https://doi.org/10.1198/jasa.2011.ap09475","volume":"106","author":[{"family":"Gile","given":"Krista J."}],"accessed":{"date-parts":[["2025",12,19]]},"issued":{"date-parts":[["2011",3,1]]}}}],"schema":"https://github.com/citation-style-language/schema/raw/master/csl-citation.json"} </w:instrText>
+      </w:r>
+      <w:r>
+        <w:rPr>
+          <w:rFonts w:ascii="var(--bs-body-font-family)" w:hAnsi="var(--bs-body-font-family)" w:hint="eastAsia"/>
+          <w:lang w:val="en-US"/>
+        </w:rPr>
+        <w:fldChar w:fldCharType="separate"/>
+      </w:r>
+      <w:r>
+        <w:rPr>
+          <w:rFonts w:ascii="var(--bs-body-font-family)" w:hAnsi="var(--bs-body-font-family)"/>
+        </w:rPr>
+        <w:t>(Gile, 2011)</w:t>
+      </w:r>
+      <w:r>
+        <w:rPr>
+          <w:rFonts w:ascii="var(--bs-body-font-family)" w:hAnsi="var(--bs-body-font-family)" w:hint="eastAsia"/>
+          <w:lang w:val="en-US"/>
+        </w:rPr>
+        <w:fldChar w:fldCharType="end"/>
+      </w:r>
+      <w:r>
+        <w:rPr>
+          <w:rFonts w:ascii="var(--bs-body-font-family)" w:hAnsi="var(--bs-body-font-family)"/>
+          <w:lang w:val="en-US"/>
+        </w:rPr>
+        <w:t xml:space="preserve">. Given our small sample (85 respondents) and non-negligible sampling fraction, RDS-SS serves as our primary estimator for binary outcomes because it accounts for finite population </w:t>
+      </w:r>
+      <w:r>
+        <w:rPr>
+          <w:rFonts w:ascii="var(--bs-body-font-family)" w:hAnsi="var(--bs-body-font-family)"/>
+          <w:lang w:val="en-US"/>
         </w:rPr>
         <w:lastRenderedPageBreak/>
-        <w:t>Heckathorn, 2008)</w:t>
-      </w:r>
-      <w:r>
-        <w:rPr>
-          <w:rFonts w:ascii="var(--bs-body-font-family)" w:hAnsi="var(--bs-body-font-family)" w:hint="eastAsia"/>
-          <w:lang w:val="en-US"/>
-        </w:rPr>
-        <w:fldChar w:fldCharType="end"/>
-      </w:r>
-      <w:r>
-        <w:rPr>
-          <w:rFonts w:ascii="var(--bs-body-font-family)" w:hAnsi="var(--bs-body-font-family)"/>
-          <w:lang w:val="en-US"/>
-        </w:rPr>
-        <w:t xml:space="preserve">, and Gile’s Successive Sampling (RDS-SS) estimator </w:t>
-      </w:r>
-      <w:r>
-        <w:rPr>
-          <w:rFonts w:ascii="var(--bs-body-font-family)" w:hAnsi="var(--bs-body-font-family)" w:hint="eastAsia"/>
-          <w:lang w:val="en-US"/>
-        </w:rPr>
-        <w:fldChar w:fldCharType="begin"/>
-      </w:r>
-      <w:r>
-        <w:rPr>
-          <w:rFonts w:ascii="var(--bs-body-font-family)" w:hAnsi="var(--bs-body-font-family)" w:hint="eastAsia"/>
-          <w:lang w:val="en-US"/>
-        </w:rPr>
-        <w:instrText xml:space="preserve"> ADDIN ZOTERO_ITEM CSL_CITATION {"citationID":"6L9SjSU1","properties":{"formattedCitation":"(Gile, 2011)","plainCitation":"(Gile, 2011)","noteIndex":0},"citationItems":[{"id":699,"uris":["http://zotero.org/users/local/nMxJkNMP/items/3NVXGXZB"],"itemData":{"id":699,"type":"article-journal","abstract":"Respondent-driven sampling is a form of link-tracing network sampling, which is widely used to study hard-to-reach populations, often to estimate population proportions. Previous treatments of this process have used a with-replacement approximation, which we show induces bias in estimates for large sample fractions and differential network connectedness by characteristic of interest. We present a treatment of respondent-driven sampling as a successive sampling process. Unlike existing representations, our approach respects the essential without-replacement feature of the process, while converging to an existing with-replacement representation for small sample fractions, and to the sample mean for a full-population sample. We present a successive-sampling based estimator for population means based on respondent-driven sampling data, and demonstrate its superior performance when the size of the hidden population is known. We present sensitivity analyses for unknown population sizes. In addition, we note that like other existing estimators, our new estimator is subject to bias induced by the selection of the initial sample. Using data collected among three populations in two countries, we illustrate the application of this approach to populations with varying characteristics. We conclude that the successive sampling estimator improves on existing estimators, and can also be used as a diagnostic tool when population size is not known. This article has supplementary material online.","container-title":"Journal of the American Statistical Association","DOI":"10.1198/jasa.2011.ap09475","ISSN":"0162-1459","issue":"493","note":"publisher: Taylor &amp; Francis\n_eprint: https://doi.org/10.1198/jasa.2011.ap09475","page":"135-146","source":"Taylor and Francis+NEJM","title":"Improved Inference for Respondent-Driven Sampling Data With Application to HIV Prevalence Estimation","URL":"https://doi.org/10.1198/jasa.2011.ap09475","volume":"106","author":[{"family":"Gile","given":"Krista J."}],"accessed":{"date-parts":[["2025",12,19]]},"issued":{"date-parts":[["2011",3,1]]}}}],"schema":"https://github.com/citation-style-language/schema/raw/master/csl-citation.json"} </w:instrText>
-      </w:r>
-      <w:r>
-        <w:rPr>
-          <w:rFonts w:ascii="var(--bs-body-font-family)" w:hAnsi="var(--bs-body-font-family)" w:hint="eastAsia"/>
-          <w:lang w:val="en-US"/>
-        </w:rPr>
-        <w:fldChar w:fldCharType="separate"/>
-      </w:r>
-      <w:r>
-        <w:rPr>
-          <w:rFonts w:ascii="var(--bs-body-font-family)" w:hAnsi="var(--bs-body-font-family)"/>
-        </w:rPr>
-        <w:t>(Gile, 2011)</w:t>
-      </w:r>
-      <w:r>
-        <w:rPr>
-          <w:rFonts w:ascii="var(--bs-body-font-family)" w:hAnsi="var(--bs-body-font-family)" w:hint="eastAsia"/>
-          <w:lang w:val="en-US"/>
-        </w:rPr>
-        <w:fldChar w:fldCharType="end"/>
-      </w:r>
-      <w:r>
-        <w:rPr>
-          <w:rFonts w:ascii="var(--bs-body-font-family)" w:hAnsi="var(--bs-body-font-family)"/>
-          <w:lang w:val="en-US"/>
-        </w:rPr>
-        <w:t>. Given our small sample (85 respondents) and non-negligible sampling fraction, RDS-SS serves as our primary estimator for binary outcomes because it accounts for finite population effects. RDS-I, which performs poorly in small samples and is highly sensitive to seed dependence, is retained as a historical benchmark.</w:t>
+        <w:t>effects. RDS-I, which performs poorly in small samples and is highly sensitive to seed dependence, is retained as a historical benchmark.</w:t>
       </w:r>
     </w:p>
     <w:p>
@@ -4665,7 +4059,11 @@
         <w:t xml:space="preserve">people they know in the hidden population and that all members are equally likely to be known. These assumptions often fail due to stigma, recall issues, or social barriers. </w:t>
       </w:r>
       <w:r>
-        <w:t xml:space="preserve"> Modified Basic Scale-Up (MBSU; Feehan and Salganik, 2016) addresses these failures through two multiplicative adjustment factors applied to the unadjusted scale-up estimate: δ_F, the ratio of the average hidden-population network size to the average frame-population network size (values &lt; 1 indicate the hidden population has smaller networks, biasing the unadjusted estimate downward); and τ_F, the true-positive rate of respondents' reports about hidden-population alters (values &lt; 1 indicate underreporting due to stigma, lack of awareness, or social distance). The adjusted estimate is N_H = N_H_basic × (1/δ_F) × (1/τ_F).</w:t>
+        <w:t xml:space="preserve"> Modified Basic Scale-Up (MBSU; Feehan and Salganik, 2016) addresses these failures through two multiplicative adjustment factors applied to the unadjusted scale-up </w:t>
+      </w:r>
+      <w:r>
+        <w:lastRenderedPageBreak/>
+        <w:t>estimate: δ_F, the ratio of the average hidden-population network size to the average frame-population network size (values &lt; 1 indicate the hidden population has smaller networks, biasing the unadjusted estimate downward); and τ_F, the true-positive rate of respondents' reports about hidden-population alters (values &lt; 1 indicate underreporting due to stigma, lack of awareness, or social distance). The adjusted estimate is N_H = N_H_basic × (1/δ_F) × (1/τ_F).</w:t>
       </w:r>
     </w:p>
     <w:p>
@@ -4739,7 +4137,15 @@
           <w:rFonts w:ascii="var(--bs-body-font-family)" w:hAnsi="var(--bs-body-font-family)"/>
           <w:lang w:val="en-US"/>
         </w:rPr>
-        <w:t>RDS and NSUM both exploit social network structures but use fundamentally different information for inference. RDS uses ego-based information: respondents report their own characteristics and network degree, which are combined with recruitment wave to adjust for unequal inclusion probabilities. The underlying logic is that individuals with larger networks are more likely to be recruited, creating bias toward highly connected respondents. RDS estimators explicitly correct for this by weighting observations according to network degree and recruitment path.</w:t>
+        <w:t xml:space="preserve">RDS and NSUM both exploit social network structures but use fundamentally different information for inference. RDS uses ego-based information: respondents report their own characteristics and network degree, which are combined with recruitment wave to adjust for unequal inclusion probabilities. The underlying logic is that individuals with larger networks are more likely to be recruited, creating bias toward highly connected </w:t>
+      </w:r>
+      <w:r>
+        <w:rPr>
+          <w:rFonts w:ascii="var(--bs-body-font-family)" w:hAnsi="var(--bs-body-font-family)"/>
+          <w:lang w:val="en-US"/>
+        </w:rPr>
+        <w:lastRenderedPageBreak/>
+        <w:t>respondents. RDS estimators explicitly correct for this by weighting observations according to network degree and recruitment path.</w:t>
       </w:r>
     </w:p>
     <w:p>
@@ -4779,12 +4185,16 @@
       </w:r>
     </w:p>
     <w:p>
-      <w:pPr/>
       <w:r>
         <w:rPr>
           <w:b/>
         </w:rPr>
         <w:t>3.6</w:t>
+      </w:r>
+      <w:r>
+        <w:rPr>
+          <w:b/>
+        </w:rPr>
         <w:tab/>
         <w:t>Choice of population size and the invariance of prevalence</w:t>
       </w:r>
@@ -4806,7 +4216,11 @@
     </w:p>
     <w:p>
       <w:r>
-        <w:t>Why, then, are different N values used in different parts of the analysis? RDS and NSUM headline estimates use N = 980,000, the EU baseline estimate for UK domestic workers; this is the value most readers will expect to see and against which any absolute-count reporting should be benchmarked. The MA-RDS Bayesian analysis (ESM_4) uses N = 50,000, chosen purely for computational tractability: the MA algorithm must instantiate and simulate a network of size N at each iteration, and at N = 980,000 a single MA call takes hours; the full 8-indicator × 3-seed-selection sensitivity at that scale would take weeks. At N = 50,000 the same sensitivity runs overnight. Because prevalence is N-invariant in the asymptotic regime as established above, the two N's produce equivalent prevalence stories and the choice is one of computation rather than substance. Where the paper reports absolute counts (rather than prevalence), the count is computed by multiplying the prevalence by the headline N = 980,000 regardless of which N was used to compute the prevalence.</w:t>
+        <w:t xml:space="preserve">Why, then, are different N values used in different parts of the analysis? RDS and NSUM headline estimates use N = 980,000, the EU baseline estimate for UK domestic workers; this is the value most readers will expect to see and against which any absolute-count reporting </w:t>
+      </w:r>
+      <w:r>
+        <w:lastRenderedPageBreak/>
+        <w:t>should be benchmarked. The MA-RDS Bayesian analysis (ESM_4) uses N = 50,000, chosen purely for computational tractability: the MA algorithm must instantiate and simulate a network of size N at each iteration, and at N = 980,000 a single MA call takes hours; the full 8-indicator × 3-seed-selection sensitivity at that scale would take weeks. At N = 50,000 the same sensitivity runs overnight. Because prevalence is N-invariant in the asymptotic regime as established above, the two N's produce equivalent prevalence stories and the choice is one of computation rather than substance. Where the paper reports absolute counts (rather than prevalence), the count is computed by multiplying the prevalence by the headline N = 980,000 regardless of which N was used to compute the prevalence.</w:t>
       </w:r>
     </w:p>
     <w:p>
@@ -4821,6 +4235,8 @@
       </w:pPr>
       <w:r>
         <w:t>3.7</w:t>
+      </w:r>
+      <w:r>
         <w:tab/>
         <w:t>Bootstrap and Sensitivity Procedures</w:t>
       </w:r>
@@ -4835,12 +4251,6 @@
           <w:lang w:val="en-US"/>
         </w:rPr>
       </w:pPr>
-      <w:proofErr w:type="spellStart"/>
-      <w:proofErr w:type="spellEnd"/>
-      <w:proofErr w:type="spellStart"/>
-      <w:proofErr w:type="spellEnd"/>
-      <w:proofErr w:type="gramStart"/>
-      <w:proofErr w:type="gramEnd"/>
       <w:r>
         <w:t xml:space="preserve">To appropriately characterise uncertainty in NSUM estimates, we implement a three-step bootstrap procedure. This approach resamples respondents, their reported alters, and the exploitation classifications simultaneously, thereby capturing uncertainty at each stage of the inference process. This procedure provides more realistic confidence intervals than those generated by conventional variance estimators, particularly for small samples such as ours. Details of the bootstrap implementation and diagnostic checks are provided in Online Resource ESM_3. Several of the estimation procedures implemented here adopt Bayesian or model-assisted frameworks, which are particularly appropriate for modest sample sizes because they incorporate uncertainty directly into the estimation process (Gile et al., 2018). Our custom neighbourhood bootstrap procedure similarly quantifies uncertainty by repeatedly resampling ego and alter information, producing empirically grounded confidence intervals rather than relying on asymptotic approximations that assume large samples. </w:t>
       </w:r>
@@ -5020,6 +4430,7 @@
         </w:rPr>
       </w:pPr>
       <w:r>
+        <w:lastRenderedPageBreak/>
         <w:t>The authors used a Large Language Model assistant (Anthropic Claude) for textual editing and for code-review support during R script development; all final analysis decisions, statistical interpretations, and prose are the authors' own. No generative models were used to simulate or augment data.</w:t>
       </w:r>
     </w:p>
@@ -5097,8 +4508,15 @@
           <w:rFonts w:ascii="var(--bs-body-font-family)" w:hAnsi="var(--bs-body-font-family)"/>
           <w:lang w:val="en-US"/>
         </w:rPr>
+        <w:t xml:space="preserve">Sample characteristics are presented in Table 1 and Fig1. In total, 97 respondents completed the survey, of whom 85 had non-zero network degree and were included in RDS analysis. The analytical sample comprised 90 transnational migrants (93%), with the largest nationality cluster being Filipino (66%). Female domestic workers constituted </w:t>
+      </w:r>
+      <w:r>
+        <w:rPr>
+          <w:rFonts w:ascii="var(--bs-body-font-family)" w:hAnsi="var(--bs-body-font-family)"/>
+          <w:lang w:val="en-US"/>
+        </w:rPr>
         <w:lastRenderedPageBreak/>
-        <w:t>Sample characteristics are presented in Table 1 and Fig1. In total, 97 respondents completed the survey, of whom 85 had non-zero network degree and were included in RDS analysis. The analytical sample comprised 90 transnational migrants (93%), with the largest nationality cluster being Filipino (66%). Female domestic workers constituted 97% of the sample, with over half aged 45 or older. Self-employment status was reported by 45% of respondents.</w:t>
+        <w:t>97% of the sample, with over half aged 45 or older. Self-employment status was reported by 45% of respondents.</w:t>
       </w:r>
     </w:p>
     <w:p>
@@ -5113,6 +4531,8 @@
       </w:pPr>
       <w:r>
         <w:t>4.2</w:t>
+      </w:r>
+      <w:r>
         <w:tab/>
         <w:t>Continuous Risk Index: RDS-SS Estimates</w:t>
       </w:r>
@@ -5127,12 +4547,6 @@
           <w:lang w:val="en-US"/>
         </w:rPr>
       </w:pPr>
-      <w:proofErr w:type="spellStart"/>
-      <w:proofErr w:type="spellEnd"/>
-      <w:proofErr w:type="spellStart"/>
-      <w:proofErr w:type="spellEnd"/>
-      <w:proofErr w:type="spellStart"/>
-      <w:proofErr w:type="spellEnd"/>
       <w:r>
         <w:t>One of the central contributions of this study is the introduction of a continuous risk index measuring degree of exposure to labour exploitation. The index is constructed from the five binary ILO-aligned indicators (Section 2), weighted equally with an additional 0.35 weight for NRM referral reflecting its diagnostic priority in UK policy practice. Rather than treating exploitation as a dichotomy, the risk index conceptualises every domestic worker as facing some degree of potential exploitation, varying continuously in intensity from low to high.</w:t>
       </w:r>
@@ -5161,44 +4575,6 @@
       </w:pPr>
       <w:r>
         <w:rPr>
-          <w:rFonts w:ascii="var(--bs-body-font-family)" w:eastAsia="Times New Roman" w:hAnsi="var(--bs-body-font-family)"/>
-          <w:lang w:val="en"/>
-        </w:rPr>
-      </w:r>
-      <w:r>
-        <w:rPr>
-          <w:rFonts w:ascii="var(--bs-body-font-family)" w:eastAsia="Times New Roman" w:hAnsi="var(--bs-body-font-family)"/>
-          <w:lang w:val="en"/>
-        </w:rPr>
-      </w:r>
-      <w:r>
-        <w:rPr>
-          <w:rFonts w:ascii="var(--bs-body-font-family)" w:eastAsia="Times New Roman" w:hAnsi="var(--bs-body-font-family)"/>
-          <w:lang w:val="en"/>
-        </w:rPr>
-      </w:r>
-      <w:r>
-        <w:rPr>
-          <w:rFonts w:ascii="var(--bs-body-font-family)" w:eastAsia="Times New Roman" w:hAnsi="var(--bs-body-font-family)"/>
-          <w:noProof/>
-          <w:lang w:val="en"/>
-        </w:rPr>
-      </w:r>
-      <w:r>
-        <w:rPr>
-          <w:rFonts w:ascii="var(--bs-body-font-family)" w:eastAsia="Times New Roman" w:hAnsi="var(--bs-body-font-family)"/>
-          <w:noProof/>
-          <w:lang w:val="en"/>
-        </w:rPr>
-      </w:r>
-      <w:r>
-        <w:rPr>
-          <w:rFonts w:ascii="var(--bs-body-font-family)" w:eastAsia="Times New Roman" w:hAnsi="var(--bs-body-font-family)"/>
-          <w:lang w:val="en"/>
-        </w:rPr>
-      </w:r>
-      <w:r>
-        <w:rPr>
           <w:i/>
           <w:color w:val="999999"/>
           <w:sz w:val="18"/>
@@ -5211,22 +4587,27 @@
         <w:jc w:val="center"/>
       </w:pPr>
       <w:r>
+        <w:rPr>
+          <w:noProof/>
+        </w:rPr>
+        <w:lastRenderedPageBreak/>
         <w:drawing>
-          <wp:inline xmlns:a="http://schemas.openxmlformats.org/drawingml/2006/main" xmlns:pic="http://schemas.openxmlformats.org/drawingml/2006/picture">
+          <wp:inline distT="0" distB="0" distL="0" distR="0" wp14:anchorId="7D52B9D1" wp14:editId="69AF7C7C">
             <wp:extent cx="5486400" cy="2438400"/>
+            <wp:effectExtent l="0" t="0" r="0" b="0"/>
             <wp:docPr id="8" name="Picture 8"/>
             <wp:cNvGraphicFramePr>
-              <a:graphicFrameLocks noChangeAspect="1"/>
+              <a:graphicFrameLocks xmlns:a="http://schemas.openxmlformats.org/drawingml/2006/main" noChangeAspect="1"/>
             </wp:cNvGraphicFramePr>
-            <a:graphic>
+            <a:graphic xmlns:a="http://schemas.openxmlformats.org/drawingml/2006/main">
               <a:graphicData uri="http://schemas.openxmlformats.org/drawingml/2006/picture">
-                <pic:pic>
+                <pic:pic xmlns:pic="http://schemas.openxmlformats.org/drawingml/2006/picture">
                   <pic:nvPicPr>
                     <pic:cNvPr id="0" name="main_fig2_composite_risk_comparison.png"/>
                     <pic:cNvPicPr/>
                   </pic:nvPicPr>
                   <pic:blipFill>
-                    <a:blip r:embed="rId18"/>
+                    <a:blip r:embed="rId10"/>
                     <a:stretch>
                       <a:fillRect/>
                     </a:stretch>
@@ -5236,7 +4617,9 @@
                       <a:off x="0" y="0"/>
                       <a:ext cx="5486400" cy="2438400"/>
                     </a:xfrm>
-                    <a:prstGeom prst="rect"/>
+                    <a:prstGeom prst="rect">
+                      <a:avLst/>
+                    </a:prstGeom>
                   </pic:spPr>
                 </pic:pic>
               </a:graphicData>
@@ -5276,7 +4659,6 @@
           <w:lang w:val="en-US"/>
         </w:rPr>
       </w:pPr>
-      <w:r/>
     </w:p>
     <w:p>
       <w:pPr>
@@ -5290,6 +4672,8 @@
       </w:pPr>
       <w:r>
         <w:t>4.3</w:t>
+      </w:r>
+      <w:r>
         <w:tab/>
         <w:t>Binary Exploitation Indicators: Preferred Prevalence Estimates</w:t>
       </w:r>
@@ -5304,8 +4688,6 @@
           <w:lang w:val="en-US"/>
         </w:rPr>
       </w:pPr>
-      <w:proofErr w:type="spellStart"/>
-      <w:proofErr w:type="spellEnd"/>
       <w:r>
         <w:t>Table 2 reports the preferred prevalence estimates for each of the five binary ILO-aligned indicators in the UK domestic-worker population, presenting both RDS-SS (ego-based; Salganik-Heckathorn and Gile's Successive Sampling lineage) and MBSU NSUM (alter-based; Feehan and Salganik 2016) estimates side by side. Figure 4 shows the RDS-SS estimates with per-method bootstrap confidence intervals for visual comparison with the RDS-I estimator.</w:t>
       </w:r>
@@ -5320,10 +4702,12 @@
           <w:lang w:val="en-US"/>
         </w:rPr>
       </w:pPr>
-      <w:proofErr w:type="gramStart"/>
-      <w:proofErr w:type="gramEnd"/>
-      <w:r>
-        <w:t>Prevalence is high for most indicators in this hidden population. RDS-SS estimates range from 35.4% for document withholding to 84.2% for excessive working hours; MBSU Moderate NSUM estimates range from 1.08% (document withholding) to 2.98% (excessive hours). The order-of-magnitude difference between RDS and NSUM is itself a substantive finding (Section 4.4), reflecting the difference between ego-based reports (the respondent's own experience) and alter-based reports (what the respondent observes in their network). Within methods, the ordering of indicators by prevalence is remarkably stable: excessive working hours consistently the highest, followed by threats and abuse and pay-related issues, with document withholding the lowest. This consistency across methods, even where absolute levels differ, is a robustness signal for the indicator hierarchy itself.</w:t>
+      <w:r>
+        <w:t xml:space="preserve">Prevalence is high for most indicators in this hidden population. RDS-SS estimates range from 35.4% for document withholding to 84.2% for excessive working hours; MBSU Moderate NSUM estimates range from 1.08% (document withholding) to 2.98% (excessive hours). The order-of-magnitude difference between RDS and NSUM is itself a substantive finding (Section 4.4), reflecting the difference between ego-based reports (the respondent's own experience) and alter-based reports (what the respondent observes in their network). Within methods, the ordering of indicators by prevalence is remarkably stable: excessive working hours consistently </w:t>
+      </w:r>
+      <w:r>
+        <w:lastRenderedPageBreak/>
+        <w:t>the highest, followed by threats and abuse and pay-related issues, with document withholding the lowest. This consistency across methods, even where absolute levels differ, is a robustness signal for the indicator hierarchy itself.</w:t>
       </w:r>
     </w:p>
     <w:p>
@@ -5340,23 +4724,23 @@
     </w:p>
     <w:tbl>
       <w:tblPr>
-        <w:tblW w:type="auto" w:w="0"/>
-        <w:tblLook w:firstColumn="1" w:firstRow="1" w:lastColumn="0" w:lastRow="0" w:noHBand="0" w:noVBand="1" w:val="04A0"/>
+        <w:tblW w:w="0" w:type="auto"/>
+        <w:tblLook w:val="04A0" w:firstRow="1" w:lastRow="0" w:firstColumn="1" w:lastColumn="0" w:noHBand="0" w:noVBand="1"/>
       </w:tblPr>
       <w:tblGrid>
-        <w:gridCol w:w="3009"/>
-        <w:gridCol w:w="3009"/>
-        <w:gridCol w:w="3009"/>
+        <w:gridCol w:w="3005"/>
+        <w:gridCol w:w="3005"/>
+        <w:gridCol w:w="3006"/>
       </w:tblGrid>
       <w:tr>
         <w:tc>
           <w:tcPr>
-            <w:tcW w:type="dxa" w:w="3009"/>
+            <w:tcW w:w="3009" w:type="dxa"/>
             <w:tcBorders>
-              <w:top w:val="single" w:sz="4" w:color="000000"/>
-              <w:left w:val="single" w:sz="4" w:color="000000"/>
-              <w:bottom w:val="single" w:sz="4" w:color="000000"/>
-              <w:right w:val="single" w:sz="4" w:color="000000"/>
+              <w:top w:val="single" w:sz="4" w:space="0" w:color="000000"/>
+              <w:left w:val="single" w:sz="4" w:space="0" w:color="000000"/>
+              <w:bottom w:val="single" w:sz="4" w:space="0" w:color="000000"/>
+              <w:right w:val="single" w:sz="4" w:space="0" w:color="000000"/>
             </w:tcBorders>
           </w:tcPr>
           <w:p>
@@ -5370,12 +4754,12 @@
         </w:tc>
         <w:tc>
           <w:tcPr>
-            <w:tcW w:type="dxa" w:w="3009"/>
+            <w:tcW w:w="3009" w:type="dxa"/>
             <w:tcBorders>
-              <w:top w:val="single" w:sz="4" w:color="000000"/>
-              <w:left w:val="single" w:sz="4" w:color="000000"/>
-              <w:bottom w:val="single" w:sz="4" w:color="000000"/>
-              <w:right w:val="single" w:sz="4" w:color="000000"/>
+              <w:top w:val="single" w:sz="4" w:space="0" w:color="000000"/>
+              <w:left w:val="single" w:sz="4" w:space="0" w:color="000000"/>
+              <w:bottom w:val="single" w:sz="4" w:space="0" w:color="000000"/>
+              <w:right w:val="single" w:sz="4" w:space="0" w:color="000000"/>
             </w:tcBorders>
           </w:tcPr>
           <w:p>
@@ -5389,12 +4773,12 @@
         </w:tc>
         <w:tc>
           <w:tcPr>
-            <w:tcW w:type="dxa" w:w="3009"/>
+            <w:tcW w:w="3009" w:type="dxa"/>
             <w:tcBorders>
-              <w:top w:val="single" w:sz="4" w:color="000000"/>
-              <w:left w:val="single" w:sz="4" w:color="000000"/>
-              <w:bottom w:val="single" w:sz="4" w:color="000000"/>
-              <w:right w:val="single" w:sz="4" w:color="000000"/>
+              <w:top w:val="single" w:sz="4" w:space="0" w:color="000000"/>
+              <w:left w:val="single" w:sz="4" w:space="0" w:color="000000"/>
+              <w:bottom w:val="single" w:sz="4" w:space="0" w:color="000000"/>
+              <w:right w:val="single" w:sz="4" w:space="0" w:color="000000"/>
             </w:tcBorders>
           </w:tcPr>
           <w:p>
@@ -5410,12 +4794,12 @@
       <w:tr>
         <w:tc>
           <w:tcPr>
-            <w:tcW w:type="dxa" w:w="3009"/>
+            <w:tcW w:w="3009" w:type="dxa"/>
             <w:tcBorders>
-              <w:top w:val="single" w:sz="4" w:color="000000"/>
-              <w:left w:val="single" w:sz="4" w:color="000000"/>
-              <w:bottom w:val="single" w:sz="4" w:color="000000"/>
-              <w:right w:val="single" w:sz="4" w:color="000000"/>
+              <w:top w:val="single" w:sz="4" w:space="0" w:color="000000"/>
+              <w:left w:val="single" w:sz="4" w:space="0" w:color="000000"/>
+              <w:bottom w:val="single" w:sz="4" w:space="0" w:color="000000"/>
+              <w:right w:val="single" w:sz="4" w:space="0" w:color="000000"/>
             </w:tcBorders>
           </w:tcPr>
           <w:p>
@@ -5426,12 +4810,12 @@
         </w:tc>
         <w:tc>
           <w:tcPr>
-            <w:tcW w:type="dxa" w:w="3009"/>
+            <w:tcW w:w="3009" w:type="dxa"/>
             <w:tcBorders>
-              <w:top w:val="single" w:sz="4" w:color="000000"/>
-              <w:left w:val="single" w:sz="4" w:color="000000"/>
-              <w:bottom w:val="single" w:sz="4" w:color="000000"/>
-              <w:right w:val="single" w:sz="4" w:color="000000"/>
+              <w:top w:val="single" w:sz="4" w:space="0" w:color="000000"/>
+              <w:left w:val="single" w:sz="4" w:space="0" w:color="000000"/>
+              <w:bottom w:val="single" w:sz="4" w:space="0" w:color="000000"/>
+              <w:right w:val="single" w:sz="4" w:space="0" w:color="000000"/>
             </w:tcBorders>
           </w:tcPr>
           <w:p>
@@ -5442,12 +4826,12 @@
         </w:tc>
         <w:tc>
           <w:tcPr>
-            <w:tcW w:type="dxa" w:w="3009"/>
+            <w:tcW w:w="3009" w:type="dxa"/>
             <w:tcBorders>
-              <w:top w:val="single" w:sz="4" w:color="000000"/>
-              <w:left w:val="single" w:sz="4" w:color="000000"/>
-              <w:bottom w:val="single" w:sz="4" w:color="000000"/>
-              <w:right w:val="single" w:sz="4" w:color="000000"/>
+              <w:top w:val="single" w:sz="4" w:space="0" w:color="000000"/>
+              <w:left w:val="single" w:sz="4" w:space="0" w:color="000000"/>
+              <w:bottom w:val="single" w:sz="4" w:space="0" w:color="000000"/>
+              <w:right w:val="single" w:sz="4" w:space="0" w:color="000000"/>
             </w:tcBorders>
           </w:tcPr>
           <w:p>
@@ -5460,12 +4844,12 @@
       <w:tr>
         <w:tc>
           <w:tcPr>
-            <w:tcW w:type="dxa" w:w="3009"/>
+            <w:tcW w:w="3009" w:type="dxa"/>
             <w:tcBorders>
-              <w:top w:val="single" w:sz="4" w:color="000000"/>
-              <w:left w:val="single" w:sz="4" w:color="000000"/>
-              <w:bottom w:val="single" w:sz="4" w:color="000000"/>
-              <w:right w:val="single" w:sz="4" w:color="000000"/>
+              <w:top w:val="single" w:sz="4" w:space="0" w:color="000000"/>
+              <w:left w:val="single" w:sz="4" w:space="0" w:color="000000"/>
+              <w:bottom w:val="single" w:sz="4" w:space="0" w:color="000000"/>
+              <w:right w:val="single" w:sz="4" w:space="0" w:color="000000"/>
             </w:tcBorders>
           </w:tcPr>
           <w:p>
@@ -5476,12 +4860,12 @@
         </w:tc>
         <w:tc>
           <w:tcPr>
-            <w:tcW w:type="dxa" w:w="3009"/>
+            <w:tcW w:w="3009" w:type="dxa"/>
             <w:tcBorders>
-              <w:top w:val="single" w:sz="4" w:color="000000"/>
-              <w:left w:val="single" w:sz="4" w:color="000000"/>
-              <w:bottom w:val="single" w:sz="4" w:color="000000"/>
-              <w:right w:val="single" w:sz="4" w:color="000000"/>
+              <w:top w:val="single" w:sz="4" w:space="0" w:color="000000"/>
+              <w:left w:val="single" w:sz="4" w:space="0" w:color="000000"/>
+              <w:bottom w:val="single" w:sz="4" w:space="0" w:color="000000"/>
+              <w:right w:val="single" w:sz="4" w:space="0" w:color="000000"/>
             </w:tcBorders>
           </w:tcPr>
           <w:p>
@@ -5492,12 +4876,12 @@
         </w:tc>
         <w:tc>
           <w:tcPr>
-            <w:tcW w:type="dxa" w:w="3009"/>
+            <w:tcW w:w="3009" w:type="dxa"/>
             <w:tcBorders>
-              <w:top w:val="single" w:sz="4" w:color="000000"/>
-              <w:left w:val="single" w:sz="4" w:color="000000"/>
-              <w:bottom w:val="single" w:sz="4" w:color="000000"/>
-              <w:right w:val="single" w:sz="4" w:color="000000"/>
+              <w:top w:val="single" w:sz="4" w:space="0" w:color="000000"/>
+              <w:left w:val="single" w:sz="4" w:space="0" w:color="000000"/>
+              <w:bottom w:val="single" w:sz="4" w:space="0" w:color="000000"/>
+              <w:right w:val="single" w:sz="4" w:space="0" w:color="000000"/>
             </w:tcBorders>
           </w:tcPr>
           <w:p>
@@ -5510,12 +4894,12 @@
       <w:tr>
         <w:tc>
           <w:tcPr>
-            <w:tcW w:type="dxa" w:w="3009"/>
+            <w:tcW w:w="3009" w:type="dxa"/>
             <w:tcBorders>
-              <w:top w:val="single" w:sz="4" w:color="000000"/>
-              <w:left w:val="single" w:sz="4" w:color="000000"/>
-              <w:bottom w:val="single" w:sz="4" w:color="000000"/>
-              <w:right w:val="single" w:sz="4" w:color="000000"/>
+              <w:top w:val="single" w:sz="4" w:space="0" w:color="000000"/>
+              <w:left w:val="single" w:sz="4" w:space="0" w:color="000000"/>
+              <w:bottom w:val="single" w:sz="4" w:space="0" w:color="000000"/>
+              <w:right w:val="single" w:sz="4" w:space="0" w:color="000000"/>
             </w:tcBorders>
           </w:tcPr>
           <w:p>
@@ -5526,12 +4910,12 @@
         </w:tc>
         <w:tc>
           <w:tcPr>
-            <w:tcW w:type="dxa" w:w="3009"/>
+            <w:tcW w:w="3009" w:type="dxa"/>
             <w:tcBorders>
-              <w:top w:val="single" w:sz="4" w:color="000000"/>
-              <w:left w:val="single" w:sz="4" w:color="000000"/>
-              <w:bottom w:val="single" w:sz="4" w:color="000000"/>
-              <w:right w:val="single" w:sz="4" w:color="000000"/>
+              <w:top w:val="single" w:sz="4" w:space="0" w:color="000000"/>
+              <w:left w:val="single" w:sz="4" w:space="0" w:color="000000"/>
+              <w:bottom w:val="single" w:sz="4" w:space="0" w:color="000000"/>
+              <w:right w:val="single" w:sz="4" w:space="0" w:color="000000"/>
             </w:tcBorders>
           </w:tcPr>
           <w:p>
@@ -5542,12 +4926,12 @@
         </w:tc>
         <w:tc>
           <w:tcPr>
-            <w:tcW w:type="dxa" w:w="3009"/>
+            <w:tcW w:w="3009" w:type="dxa"/>
             <w:tcBorders>
-              <w:top w:val="single" w:sz="4" w:color="000000"/>
-              <w:left w:val="single" w:sz="4" w:color="000000"/>
-              <w:bottom w:val="single" w:sz="4" w:color="000000"/>
-              <w:right w:val="single" w:sz="4" w:color="000000"/>
+              <w:top w:val="single" w:sz="4" w:space="0" w:color="000000"/>
+              <w:left w:val="single" w:sz="4" w:space="0" w:color="000000"/>
+              <w:bottom w:val="single" w:sz="4" w:space="0" w:color="000000"/>
+              <w:right w:val="single" w:sz="4" w:space="0" w:color="000000"/>
             </w:tcBorders>
           </w:tcPr>
           <w:p>
@@ -5560,12 +4944,12 @@
       <w:tr>
         <w:tc>
           <w:tcPr>
-            <w:tcW w:type="dxa" w:w="3009"/>
+            <w:tcW w:w="3009" w:type="dxa"/>
             <w:tcBorders>
-              <w:top w:val="single" w:sz="4" w:color="000000"/>
-              <w:left w:val="single" w:sz="4" w:color="000000"/>
-              <w:bottom w:val="single" w:sz="4" w:color="000000"/>
-              <w:right w:val="single" w:sz="4" w:color="000000"/>
+              <w:top w:val="single" w:sz="4" w:space="0" w:color="000000"/>
+              <w:left w:val="single" w:sz="4" w:space="0" w:color="000000"/>
+              <w:bottom w:val="single" w:sz="4" w:space="0" w:color="000000"/>
+              <w:right w:val="single" w:sz="4" w:space="0" w:color="000000"/>
             </w:tcBorders>
           </w:tcPr>
           <w:p>
@@ -5576,12 +4960,12 @@
         </w:tc>
         <w:tc>
           <w:tcPr>
-            <w:tcW w:type="dxa" w:w="3009"/>
+            <w:tcW w:w="3009" w:type="dxa"/>
             <w:tcBorders>
-              <w:top w:val="single" w:sz="4" w:color="000000"/>
-              <w:left w:val="single" w:sz="4" w:color="000000"/>
-              <w:bottom w:val="single" w:sz="4" w:color="000000"/>
-              <w:right w:val="single" w:sz="4" w:color="000000"/>
+              <w:top w:val="single" w:sz="4" w:space="0" w:color="000000"/>
+              <w:left w:val="single" w:sz="4" w:space="0" w:color="000000"/>
+              <w:bottom w:val="single" w:sz="4" w:space="0" w:color="000000"/>
+              <w:right w:val="single" w:sz="4" w:space="0" w:color="000000"/>
             </w:tcBorders>
           </w:tcPr>
           <w:p>
@@ -5592,12 +4976,12 @@
         </w:tc>
         <w:tc>
           <w:tcPr>
-            <w:tcW w:type="dxa" w:w="3009"/>
+            <w:tcW w:w="3009" w:type="dxa"/>
             <w:tcBorders>
-              <w:top w:val="single" w:sz="4" w:color="000000"/>
-              <w:left w:val="single" w:sz="4" w:color="000000"/>
-              <w:bottom w:val="single" w:sz="4" w:color="000000"/>
-              <w:right w:val="single" w:sz="4" w:color="000000"/>
+              <w:top w:val="single" w:sz="4" w:space="0" w:color="000000"/>
+              <w:left w:val="single" w:sz="4" w:space="0" w:color="000000"/>
+              <w:bottom w:val="single" w:sz="4" w:space="0" w:color="000000"/>
+              <w:right w:val="single" w:sz="4" w:space="0" w:color="000000"/>
             </w:tcBorders>
           </w:tcPr>
           <w:p>
@@ -5610,12 +4994,12 @@
       <w:tr>
         <w:tc>
           <w:tcPr>
-            <w:tcW w:type="dxa" w:w="3009"/>
+            <w:tcW w:w="3009" w:type="dxa"/>
             <w:tcBorders>
-              <w:top w:val="single" w:sz="4" w:color="000000"/>
-              <w:left w:val="single" w:sz="4" w:color="000000"/>
-              <w:bottom w:val="single" w:sz="4" w:color="000000"/>
-              <w:right w:val="single" w:sz="4" w:color="000000"/>
+              <w:top w:val="single" w:sz="4" w:space="0" w:color="000000"/>
+              <w:left w:val="single" w:sz="4" w:space="0" w:color="000000"/>
+              <w:bottom w:val="single" w:sz="4" w:space="0" w:color="000000"/>
+              <w:right w:val="single" w:sz="4" w:space="0" w:color="000000"/>
             </w:tcBorders>
           </w:tcPr>
           <w:p>
@@ -5626,12 +5010,12 @@
         </w:tc>
         <w:tc>
           <w:tcPr>
-            <w:tcW w:type="dxa" w:w="3009"/>
+            <w:tcW w:w="3009" w:type="dxa"/>
             <w:tcBorders>
-              <w:top w:val="single" w:sz="4" w:color="000000"/>
-              <w:left w:val="single" w:sz="4" w:color="000000"/>
-              <w:bottom w:val="single" w:sz="4" w:color="000000"/>
-              <w:right w:val="single" w:sz="4" w:color="000000"/>
+              <w:top w:val="single" w:sz="4" w:space="0" w:color="000000"/>
+              <w:left w:val="single" w:sz="4" w:space="0" w:color="000000"/>
+              <w:bottom w:val="single" w:sz="4" w:space="0" w:color="000000"/>
+              <w:right w:val="single" w:sz="4" w:space="0" w:color="000000"/>
             </w:tcBorders>
           </w:tcPr>
           <w:p>
@@ -5642,12 +5026,12 @@
         </w:tc>
         <w:tc>
           <w:tcPr>
-            <w:tcW w:type="dxa" w:w="3009"/>
+            <w:tcW w:w="3009" w:type="dxa"/>
             <w:tcBorders>
-              <w:top w:val="single" w:sz="4" w:color="000000"/>
-              <w:left w:val="single" w:sz="4" w:color="000000"/>
-              <w:bottom w:val="single" w:sz="4" w:color="000000"/>
-              <w:right w:val="single" w:sz="4" w:color="000000"/>
+              <w:top w:val="single" w:sz="4" w:space="0" w:color="000000"/>
+              <w:left w:val="single" w:sz="4" w:space="0" w:color="000000"/>
+              <w:bottom w:val="single" w:sz="4" w:space="0" w:color="000000"/>
+              <w:right w:val="single" w:sz="4" w:space="0" w:color="000000"/>
             </w:tcBorders>
           </w:tcPr>
           <w:p>
@@ -5670,24 +5054,6 @@
       </w:pPr>
       <w:r>
         <w:rPr>
-          <w:rFonts w:ascii="var(--bs-body-font-family)" w:hAnsi="var(--bs-body-font-family)"/>
-          <w:lang w:val="en-US"/>
-        </w:rPr>
-      </w:r>
-      <w:r>
-        <w:rPr>
-          <w:rFonts w:ascii="var(--bs-body-font-family)" w:hAnsi="var(--bs-body-font-family)"/>
-          <w:lang w:val="en-US"/>
-        </w:rPr>
-      </w:r>
-      <w:r>
-        <w:rPr>
-          <w:rFonts w:ascii="var(--bs-body-font-family)" w:hAnsi="var(--bs-body-font-family)"/>
-          <w:lang w:val="en-US"/>
-        </w:rPr>
-      </w:r>
-      <w:r>
-        <w:rPr>
           <w:i/>
           <w:color w:val="999999"/>
           <w:sz w:val="18"/>
@@ -5700,22 +5066,26 @@
         <w:jc w:val="center"/>
       </w:pPr>
       <w:r>
+        <w:rPr>
+          <w:noProof/>
+        </w:rPr>
         <w:drawing>
-          <wp:inline xmlns:a="http://schemas.openxmlformats.org/drawingml/2006/main" xmlns:pic="http://schemas.openxmlformats.org/drawingml/2006/picture">
+          <wp:inline distT="0" distB="0" distL="0" distR="0" wp14:anchorId="0C47A11A" wp14:editId="32FC262E">
             <wp:extent cx="5486400" cy="3429000"/>
+            <wp:effectExtent l="0" t="0" r="0" b="0"/>
             <wp:docPr id="9" name="Picture 9"/>
             <wp:cNvGraphicFramePr>
-              <a:graphicFrameLocks noChangeAspect="1"/>
+              <a:graphicFrameLocks xmlns:a="http://schemas.openxmlformats.org/drawingml/2006/main" noChangeAspect="1"/>
             </wp:cNvGraphicFramePr>
-            <a:graphic>
+            <a:graphic xmlns:a="http://schemas.openxmlformats.org/drawingml/2006/main">
               <a:graphicData uri="http://schemas.openxmlformats.org/drawingml/2006/picture">
-                <pic:pic>
+                <pic:pic xmlns:pic="http://schemas.openxmlformats.org/drawingml/2006/picture">
                   <pic:nvPicPr>
                     <pic:cNvPr id="0" name="main_fig3_ma_forest_plot.png"/>
                     <pic:cNvPicPr/>
                   </pic:nvPicPr>
                   <pic:blipFill>
-                    <a:blip r:embed="rId19"/>
+                    <a:blip r:embed="rId11"/>
                     <a:stretch>
                       <a:fillRect/>
                     </a:stretch>
@@ -5725,7 +5095,9 @@
                       <a:off x="0" y="0"/>
                       <a:ext cx="5486400" cy="3429000"/>
                     </a:xfrm>
-                    <a:prstGeom prst="rect"/>
+                    <a:prstGeom prst="rect">
+                      <a:avLst/>
+                    </a:prstGeom>
                   </pic:spPr>
                 </pic:pic>
               </a:graphicData>
@@ -5761,30 +5133,29 @@
       </w:pPr>
       <w:r>
         <w:t>4.4</w:t>
+      </w:r>
+      <w:r>
         <w:tab/>
         <w:t>Supporting Estimates and Method Comparison</w:t>
       </w:r>
     </w:p>
     <w:p>
-      <w:pPr/>
       <w:r>
         <w:t>For each of the five binary indicators, three additional families of estimates are reported in the appendices for transparency and robustness.</w:t>
       </w:r>
     </w:p>
     <w:p>
-      <w:pPr/>
-      <w:r>
+      <w:r>
+        <w:lastRenderedPageBreak/>
         <w:t>Bayesian Model-Assisted (MA-RDS). Table 3 reports the Gile-Handcock (2015) MA-RDS Bayesian estimates at N = 50,000 with 95% credible intervals. Posterior means range from 34.1% (document withholding) to 84.0% (excessive working hours), broadly tracking the RDS-SS preferred estimates with slightly wider credible intervals — appropriate uncertainty quantification at n = 85. Figure 3 plots these as a forest.</w:t>
       </w:r>
     </w:p>
     <w:p>
-      <w:pPr/>
       <w:r>
         <w:t>Frequentist RDS-I and RDS-II. Table 4 compares RDS-I (Salganik-Heckathorn) and RDS-SS estimates for each indicator with per-method bootstrap 95% CIs. RDS-I estimates run systematically higher than RDS-SS — for document withholding, 50.7% versus 35.4% — reflecting the known downward bias of RDS-I relative to the Successive Sampling estimator in this regime. Figure 4 visualises the comparison; we treat RDS-SS as the preferred binary estimator on standard methodological grounds (Gile 2011; Goel and Salganik 2010).</w:t>
       </w:r>
     </w:p>
     <w:p>
-      <w:pPr/>
       <w:r>
         <w:t>NSUM under alternative adjustment-factor tiers. Table 5 reports MBSU NSUM estimates under three (δ, τ) tiers — Unadjusted, Moderate, Conservative. Conservative adjustments produce estimates approximately 1.8 times higher than Unadjusted; Moderate adjustments produce estimates approximately 1.3 times higher. Figure 5 shows the Moderate-tier NSUM forest plot. The continuous-τ sensitivity analysis (Section 4.5) supersedes this discrete-tier comparison for the substantive inference, but the tier comparison is retained here for direct comparability with the existing NSUM literature.</w:t>
       </w:r>
@@ -5806,12 +5177,6 @@
           <w:lang w:val="en"/>
         </w:rPr>
       </w:pPr>
-      <w:r>
-        <w:rPr>
-          <w:rFonts w:ascii="var(--bs-body-font-family)" w:eastAsia="Times New Roman" w:hAnsi="var(--bs-body-font-family)"/>
-          <w:lang w:val="en"/>
-        </w:rPr>
-      </w:r>
       <w:r>
         <w:rPr>
           <w:i/>
@@ -5907,25 +5272,7 @@
                 <w:b/>
                 <w:bCs/>
               </w:rPr>
-              <w:t xml:space="preserve">Population Prevalence (95% </w:t>
-            </w:r>
-            <w:proofErr w:type="spellStart"/>
-            <w:r>
-              <w:rPr>
-                <w:rFonts w:asciiTheme="majorHAnsi" w:hAnsiTheme="majorHAnsi"/>
-                <w:b/>
-                <w:bCs/>
-              </w:rPr>
-              <w:t>CrI</w:t>
-            </w:r>
-            <w:proofErr w:type="spellEnd"/>
-            <w:r>
-              <w:rPr>
-                <w:rFonts w:asciiTheme="majorHAnsi" w:hAnsiTheme="majorHAnsi"/>
-                <w:b/>
-                <w:bCs/>
-              </w:rPr>
-              <w:t>)</w:t>
+              <w:t>Population Prevalence (95% CrI)</w:t>
             </w:r>
             <w:r>
               <w:rPr>
@@ -6274,13 +5621,6 @@
       </w:pPr>
       <w:r>
         <w:rPr>
-          <w:rFonts w:ascii="var(--bs-body-font-family)" w:eastAsia="Times New Roman" w:hAnsi="var(--bs-body-font-family)"/>
-          <w:noProof/>
-          <w:lang w:val="en"/>
-        </w:rPr>
-      </w:r>
-      <w:r>
-        <w:rPr>
           <w:i/>
           <w:color w:val="999999"/>
           <w:sz w:val="18"/>
@@ -6293,22 +5633,26 @@
         <w:jc w:val="center"/>
       </w:pPr>
       <w:r>
+        <w:rPr>
+          <w:noProof/>
+        </w:rPr>
         <w:drawing>
-          <wp:inline xmlns:a="http://schemas.openxmlformats.org/drawingml/2006/main" xmlns:pic="http://schemas.openxmlformats.org/drawingml/2006/picture">
+          <wp:inline distT="0" distB="0" distL="0" distR="0" wp14:anchorId="0E519459" wp14:editId="6AB4C171">
             <wp:extent cx="5486400" cy="3429000"/>
+            <wp:effectExtent l="0" t="0" r="0" b="0"/>
             <wp:docPr id="10" name="Picture 10"/>
             <wp:cNvGraphicFramePr>
-              <a:graphicFrameLocks noChangeAspect="1"/>
+              <a:graphicFrameLocks xmlns:a="http://schemas.openxmlformats.org/drawingml/2006/main" noChangeAspect="1"/>
             </wp:cNvGraphicFramePr>
-            <a:graphic>
+            <a:graphic xmlns:a="http://schemas.openxmlformats.org/drawingml/2006/main">
               <a:graphicData uri="http://schemas.openxmlformats.org/drawingml/2006/picture">
-                <pic:pic>
+                <pic:pic xmlns:pic="http://schemas.openxmlformats.org/drawingml/2006/picture">
                   <pic:nvPicPr>
                     <pic:cNvPr id="0" name="main_fig4_rds_forest_plot.png"/>
                     <pic:cNvPicPr/>
                   </pic:nvPicPr>
                   <pic:blipFill>
-                    <a:blip r:embed="rId20"/>
+                    <a:blip r:embed="rId12"/>
                     <a:stretch>
                       <a:fillRect/>
                     </a:stretch>
@@ -6318,7 +5662,9 @@
                       <a:off x="0" y="0"/>
                       <a:ext cx="5486400" cy="3429000"/>
                     </a:xfrm>
-                    <a:prstGeom prst="rect"/>
+                    <a:prstGeom prst="rect">
+                      <a:avLst/>
+                    </a:prstGeom>
                   </pic:spPr>
                 </pic:pic>
               </a:graphicData>
@@ -6365,7 +5711,6 @@
           <w:lang w:val="en"/>
         </w:rPr>
       </w:pPr>
-      <w:r/>
     </w:p>
     <w:p>
       <w:pPr>
@@ -6388,12 +5733,6 @@
           <w:lang w:val="en"/>
         </w:rPr>
       </w:pPr>
-      <w:r>
-        <w:rPr>
-          <w:rFonts w:ascii="var(--bs-body-font-family)" w:hAnsi="var(--bs-body-font-family)"/>
-          <w:lang w:val="en"/>
-        </w:rPr>
-      </w:r>
       <w:r>
         <w:rPr>
           <w:i/>
@@ -7033,33 +6372,6 @@
       </w:pPr>
       <w:r>
         <w:rPr>
-          <w:rFonts w:ascii="var(--bs-body-font-family)" w:eastAsia="Times New Roman" w:hAnsi="var(--bs-body-font-family)"/>
-          <w:noProof/>
-          <w:lang w:val="en"/>
-        </w:rPr>
-      </w:r>
-      <w:r>
-        <w:rPr>
-          <w:rFonts w:ascii="var(--bs-body-font-family)" w:eastAsia="Times New Roman" w:hAnsi="var(--bs-body-font-family)"/>
-          <w:noProof/>
-          <w:lang w:val="en"/>
-        </w:rPr>
-      </w:r>
-      <w:r>
-        <w:rPr>
-          <w:rFonts w:ascii="var(--bs-body-font-family)" w:eastAsia="Times New Roman" w:hAnsi="var(--bs-body-font-family)"/>
-          <w:noProof/>
-          <w:lang w:val="en"/>
-        </w:rPr>
-      </w:r>
-      <w:r>
-        <w:rPr>
-          <w:rFonts w:ascii="var(--bs-body-font-family)" w:eastAsia="Times New Roman" w:hAnsi="var(--bs-body-font-family)"/>
-          <w:lang w:val="en"/>
-        </w:rPr>
-      </w:r>
-      <w:r>
-        <w:rPr>
           <w:i/>
           <w:color w:val="999999"/>
           <w:sz w:val="18"/>
@@ -7072,22 +6384,26 @@
         <w:jc w:val="center"/>
       </w:pPr>
       <w:r>
+        <w:rPr>
+          <w:noProof/>
+        </w:rPr>
         <w:drawing>
-          <wp:inline xmlns:a="http://schemas.openxmlformats.org/drawingml/2006/main" xmlns:pic="http://schemas.openxmlformats.org/drawingml/2006/picture">
+          <wp:inline distT="0" distB="0" distL="0" distR="0" wp14:anchorId="336E0536" wp14:editId="1ECAB772">
             <wp:extent cx="5486400" cy="3429000"/>
+            <wp:effectExtent l="0" t="0" r="0" b="0"/>
             <wp:docPr id="11" name="Picture 11"/>
             <wp:cNvGraphicFramePr>
-              <a:graphicFrameLocks noChangeAspect="1"/>
+              <a:graphicFrameLocks xmlns:a="http://schemas.openxmlformats.org/drawingml/2006/main" noChangeAspect="1"/>
             </wp:cNvGraphicFramePr>
-            <a:graphic>
+            <a:graphic xmlns:a="http://schemas.openxmlformats.org/drawingml/2006/main">
               <a:graphicData uri="http://schemas.openxmlformats.org/drawingml/2006/picture">
-                <pic:pic>
+                <pic:pic xmlns:pic="http://schemas.openxmlformats.org/drawingml/2006/picture">
                   <pic:nvPicPr>
                     <pic:cNvPr id="0" name="main_fig5_nsum_forest_plot.png"/>
                     <pic:cNvPicPr/>
                   </pic:nvPicPr>
                   <pic:blipFill>
-                    <a:blip r:embed="rId21"/>
+                    <a:blip r:embed="rId13"/>
                     <a:stretch>
                       <a:fillRect/>
                     </a:stretch>
@@ -7097,7 +6413,9 @@
                       <a:off x="0" y="0"/>
                       <a:ext cx="5486400" cy="3429000"/>
                     </a:xfrm>
-                    <a:prstGeom prst="rect"/>
+                    <a:prstGeom prst="rect">
+                      <a:avLst/>
+                    </a:prstGeom>
                   </pic:spPr>
                 </pic:pic>
               </a:graphicData>
@@ -7141,7 +6459,6 @@
           <w:lang w:val="en"/>
         </w:rPr>
       </w:pPr>
-      <w:r/>
     </w:p>
     <w:p>
       <w:pPr>
@@ -7233,7 +6550,6 @@
           <w:lang w:val="en-US"/>
         </w:rPr>
       </w:pPr>
-      <w:r/>
     </w:p>
     <w:p>
       <w:pPr>
@@ -7243,12 +6559,6 @@
           <w:lang w:val="en"/>
         </w:rPr>
       </w:pPr>
-      <w:r>
-        <w:rPr>
-          <w:rFonts w:ascii="var(--bs-body-font-family)" w:eastAsia="Times New Roman" w:hAnsi="var(--bs-body-font-family)"/>
-          <w:lang w:val="en"/>
-        </w:rPr>
-      </w:r>
       <w:r>
         <w:rPr>
           <w:i/>
@@ -9764,7 +9074,6 @@
               <w:rPr>
                 <w:rFonts w:asciiTheme="minorHAnsi" w:hAnsiTheme="minorHAnsi" w:cstheme="minorBidi"/>
               </w:rPr>
-              <w:lastRenderedPageBreak/>
               <w:t>MBSU (No Adjustment)</w:t>
             </w:r>
           </w:p>
@@ -10243,24 +9552,23 @@
       </w:pPr>
       <w:r>
         <w:t>4.5</w:t>
+      </w:r>
+      <w:r>
         <w:tab/>
         <w:t>Sensitivity and Robustness</w:t>
       </w:r>
     </w:p>
     <w:p>
-      <w:pPr/>
       <w:r>
         <w:t>Three sensitivity analyses are reported in full in ESM_4. First, the continuous-τ NSUM sweep (Section 3.5; ESM_4 Figure 1) shows MBSU prevalence as a continuous function of the visibility/true-positive-rate adjustment τ for each of the five indicators, with δ fixed at 0.9. Prevalence estimates increase monotonically as τ decreases (as expected algebraically); the increase is modest in absolute terms across the plausible range τ ∈ [0.7, 1.0] and substantial only at low τ ≤ 0.5. This continuous picture supersedes the discrete-tier comparison (Section 4.4) for substantive inference about how visibility assumptions affect estimates.</w:t>
       </w:r>
     </w:p>
     <w:p>
-      <w:pPr/>
       <w:r>
         <w:t>Second, the MA-RDS seed-selection sensitivity (ESM_4 Figure 2) shows that the Bayesian MA posterior estimates are insensitive to the choice of seed-selection method (degree, random, sample) at our sample size — different chains converge to the same posterior, confirming model robustness to initialisation.</w:t>
       </w:r>
     </w:p>
     <w:p>
-      <w:pPr/>
       <w:r>
         <w:t>Third, cross-indicator and cross-method consistency: across the five indicators and the four main estimators (RDS-I, RDS-SS, MA-RDS, MBSU NSUM Moderate), the rank-ordering of indicators by prevalence is stable. Excessive working hours is consistently highest, followed by threats and abuse and pay-related issues, with document withholding the lowest. Absolute prevalence levels vary by method but the substantive picture — which exploitation behaviours are most common, which least — does not.</w:t>
       </w:r>
@@ -10275,7 +9583,6 @@
           <w:lang w:val="en-US"/>
         </w:rPr>
       </w:pPr>
-      <w:r/>
     </w:p>
     <w:p>
       <w:pPr>
@@ -10296,9 +9603,10 @@
       </w:r>
     </w:p>
     <w:p>
-      <w:pPr/>
       <w:r>
         <w:t>5.1</w:t>
+      </w:r>
+      <w:r>
         <w:tab/>
         <w:t>Summary of Findings</w:t>
       </w:r>
@@ -10312,9 +9620,10 @@
       </w:r>
     </w:p>
     <w:p>
-      <w:pPr/>
       <w:r>
         <w:t>5.2</w:t>
+      </w:r>
+      <w:r>
         <w:tab/>
         <w:t>Methodological Reflections and Contributions</w:t>
       </w:r>
@@ -10360,9 +9669,10 @@
       </w:r>
     </w:p>
     <w:p>
-      <w:pPr/>
       <w:r>
         <w:t>5.3</w:t>
+      </w:r>
+      <w:r>
         <w:tab/>
         <w:t>The RDS–NSUM Divergence as Diagnostic</w:t>
       </w:r>
@@ -10424,9 +9734,10 @@
       </w:r>
     </w:p>
     <w:p>
-      <w:pPr/>
       <w:r>
         <w:t>5.4</w:t>
+      </w:r>
+      <w:r>
         <w:tab/>
         <w:t>Generalisability and Indicator Coverage</w:t>
       </w:r>
@@ -10464,9 +9775,10 @@
       </w:r>
     </w:p>
     <w:p>
-      <w:pPr/>
       <w:r>
         <w:t>5.5</w:t>
+      </w:r>
+      <w:r>
         <w:tab/>
         <w:t>Composite Risk Index: Construction and Weight Sensitivity</w:t>
       </w:r>
@@ -10496,9 +9808,10 @@
       </w:r>
     </w:p>
     <w:p>
-      <w:pPr/>
       <w:r>
         <w:t>5.6</w:t>
+      </w:r>
+      <w:r>
         <w:tab/>
         <w:t>Policy Implications and SDG 8.7 Monitoring</w:t>
       </w:r>
@@ -10592,20 +9905,6 @@
           <w:lang w:val="en-US"/>
         </w:rPr>
       </w:pPr>
-      <w:proofErr w:type="spellStart"/>
-      <w:proofErr w:type="spellEnd"/>
-      <w:proofErr w:type="spellStart"/>
-      <w:proofErr w:type="spellEnd"/>
-      <w:proofErr w:type="spellStart"/>
-      <w:proofErr w:type="spellEnd"/>
-      <w:proofErr w:type="spellStart"/>
-      <w:proofErr w:type="spellEnd"/>
-      <w:proofErr w:type="spellStart"/>
-      <w:proofErr w:type="spellEnd"/>
-      <w:proofErr w:type="spellStart"/>
-      <w:proofErr w:type="spellEnd"/>
-      <w:proofErr w:type="spellStart"/>
-      <w:proofErr w:type="spellEnd"/>
       <w:r>
         <w:t>This paper applies respondent-driven sampling and the network scale-up method to the same matched survey instrument for the first time in a developed-economy study of forced-labour and modern-slavery indicators, using a sample of 85 UK migrant domestic workers recruited through two civil-society partnerships. The paper makes two contributions to the measurement of modern slavery among hidden populations. First, the dual RDS–NSUM design lets the two estimators triangulate prevalence on a like-for-like indicator set, and — where the two diverge — yields a visibility-gradient diagnostic that locates each exploitation behaviour on a spectrum from network-visible to network-concealed. Second, we operationalise modern slavery as a graded latent construct rather than a binary condition, supporting both indicator-level prevalence estimates and a continuous composite risk index anchored on the ILO medium/strong severity hierarchy.</w:t>
       </w:r>
@@ -10706,7 +10005,6 @@
         <w:pStyle w:val="Bibliography"/>
       </w:pPr>
       <w:r>
-        <w:lastRenderedPageBreak/>
         <w:t xml:space="preserve">Alberti, G. and Però, D. (2018) ‘Migrating Industrial Relations: Migrant Workers’ Initiative Within and Outside Trade Unions’, </w:t>
       </w:r>
       <w:r>
@@ -10941,7 +10239,6 @@
         <w:pStyle w:val="Bibliography"/>
       </w:pPr>
       <w:r>
-        <w:lastRenderedPageBreak/>
         <w:t xml:space="preserve">Gile, K.J. and Handcock, M.S. (2010) ‘Respondent-Driven Sampling: An Assessment of Current Methodology’, </w:t>
       </w:r>
       <w:r>
@@ -11156,7 +10453,6 @@
         <w:pStyle w:val="Bibliography"/>
       </w:pPr>
       <w:r>
-        <w:lastRenderedPageBreak/>
         <w:t xml:space="preserve">Jordan, L. </w:t>
       </w:r>
       <w:r>
@@ -11391,7 +10687,6 @@
         <w:pStyle w:val="Bibliography"/>
       </w:pPr>
       <w:r>
-        <w:lastRenderedPageBreak/>
         <w:t xml:space="preserve">Semaan, S. </w:t>
       </w:r>
       <w:r>
@@ -11691,7 +10986,6 @@
         <w:divId w:val="1975518704"/>
       </w:pPr>
       <w:r>
-        <w:lastRenderedPageBreak/>
         <w:t>Figure Legend</w:t>
       </w:r>
     </w:p>
@@ -11764,7 +11058,6 @@
         <w:divId w:val="1975518704"/>
       </w:pPr>
       <w:r>
-        <w:lastRenderedPageBreak/>
         <w:t>Figure 5 Forest Plot of RDS Estimates: Comparison of RDS-I and RDS-SS prevalence estimates for binary exploitation indicators (N=980,000). Error bars represent 95% bootstrap confidence intervals. Source: Authors’ Own Work</w:t>
       </w:r>
     </w:p>
@@ -11813,21 +11106,7 @@
         <w:rPr>
           <w:lang w:val="en-US"/>
         </w:rPr>
-        <w:t xml:space="preserve">Table 3 RDS Estimates of Binary Exploitation Indicators: Comparison of RDS-I and RDS-SS estimators with </w:t>
-      </w:r>
-      <w:proofErr w:type="spellStart"/>
-      <w:r>
-        <w:rPr>
-          <w:lang w:val="en-US"/>
-        </w:rPr>
-        <w:t>neighbourhood</w:t>
-      </w:r>
-      <w:proofErr w:type="spellEnd"/>
-      <w:r>
-        <w:rPr>
-          <w:lang w:val="en-US"/>
-        </w:rPr>
-        <w:t xml:space="preserve"> bootstrap confidence intervals (N=980,000). Source: Authors’ Own Work</w:t>
+        <w:t>Table 3 RDS Estimates of Binary Exploitation Indicators: Comparison of RDS-I and RDS-SS estimators with neighbourhood bootstrap confidence intervals (N=980,000). Source: Authors’ Own Work</w:t>
       </w:r>
       <w:r>
         <w:t>.</w:t>
@@ -11846,7 +11125,7 @@
       </w:r>
     </w:p>
     <w:sectPr>
-      <w:footerReference w:type="default" r:id="rId8"/>
+      <w:footerReference w:type="default" r:id="rId14"/>
       <w:pgSz w:w="11906" w:h="16838"/>
       <w:pgMar w:top="1440" w:right="1440" w:bottom="1440" w:left="1440" w:header="708" w:footer="708" w:gutter="0"/>
       <w:cols w:space="708"/>
@@ -11857,7 +11136,7 @@
 </file>
 
 <file path=word/endnotes.xml><?xml version="1.0" encoding="utf-8"?>
-<w:endnotes xmlns:wpc="http://schemas.microsoft.com/office/word/2010/wordprocessingCanvas" xmlns:cx="http://schemas.microsoft.com/office/drawing/2014/chartex" xmlns:cx1="http://schemas.microsoft.com/office/drawing/2015/9/8/chartex" xmlns:cx2="http://schemas.microsoft.com/office/drawing/2015/10/21/chartex" xmlns:cx3="http://schemas.microsoft.com/office/drawing/2016/5/9/chartex" xmlns:cx4="http://schemas.microsoft.com/office/drawing/2016/5/10/chartex" xmlns:cx5="http://schemas.microsoft.com/office/drawing/2016/5/11/chartex" xmlns:cx6="http://schemas.microsoft.com/office/drawing/2016/5/12/chartex" xmlns:cx7="http://schemas.microsoft.com/office/drawing/2016/5/13/chartex" xmlns:cx8="http://schemas.microsoft.com/office/drawing/2016/5/14/chartex" xmlns:mc="http://schemas.openxmlformats.org/markup-compatibility/2006" xmlns:aink="http://schemas.microsoft.com/office/drawing/2016/ink" xmlns:am3d="http://schemas.microsoft.com/office/drawing/2017/model3d" xmlns:o="urn:schemas-microsoft-com:office:office" xmlns:oel="http://schemas.microsoft.com/office/2019/extlst" xmlns:r="http://schemas.openxmlformats.org/officeDocument/2006/relationships" xmlns:m="http://schemas.openxmlformats.org/officeDocument/2006/math" xmlns:v="urn:schemas-microsoft-com:vml" xmlns:wp14="http://schemas.microsoft.com/office/word/2010/wordprocessingDrawing" xmlns:wp="http://schemas.openxmlformats.org/drawingml/2006/wordprocessingDrawing" xmlns:w10="urn:schemas-microsoft-com:office:word" xmlns:w="http://schemas.openxmlformats.org/wordprocessingml/2006/main" xmlns:w14="http://schemas.microsoft.com/office/word/2010/wordml" xmlns:w15="http://schemas.microsoft.com/office/word/2012/wordml" xmlns:w16cex="http://schemas.microsoft.com/office/word/2018/wordml/cex" xmlns:w16cid="http://schemas.microsoft.com/office/word/2016/wordml/cid" xmlns:w16="http://schemas.microsoft.com/office/word/2018/wordml" xmlns:w16du="http://schemas.microsoft.com/office/word/2023/wordml/word16du" xmlns:w16sdtdh="http://schemas.microsoft.com/office/word/2020/wordml/sdtdatahash" xmlns:w16sdtfl="http://schemas.microsoft.com/office/word/2024/wordml/sdtformatlock" xmlns:w16se="http://schemas.microsoft.com/office/word/2015/wordml/symex" xmlns:wpg="http://schemas.microsoft.com/office/word/2010/wordprocessingGroup" xmlns:wpi="http://schemas.microsoft.com/office/word/2010/wordprocessingInk" xmlns:wne="http://schemas.microsoft.com/office/word/2006/wordml" xmlns:wps="http://schemas.microsoft.com/office/word/2010/wordprocessingShape" mc:Ignorable="w14 w15 w16se w16cid w16 w16cex w16sdtdh w16sdtfl w16du wp14">
+<w:endnotes xmlns:wpc="http://schemas.microsoft.com/office/word/2010/wordprocessingCanvas" xmlns:cx="http://schemas.microsoft.com/office/drawing/2014/chartex" xmlns:cx1="http://schemas.microsoft.com/office/drawing/2015/9/8/chartex" xmlns:cx2="http://schemas.microsoft.com/office/drawing/2015/10/21/chartex" xmlns:cx3="http://schemas.microsoft.com/office/drawing/2016/5/9/chartex" xmlns:cx4="http://schemas.microsoft.com/office/drawing/2016/5/10/chartex" xmlns:cx5="http://schemas.microsoft.com/office/drawing/2016/5/11/chartex" xmlns:cx6="http://schemas.microsoft.com/office/drawing/2016/5/12/chartex" xmlns:cx7="http://schemas.microsoft.com/office/drawing/2016/5/13/chartex" xmlns:cx8="http://schemas.microsoft.com/office/drawing/2016/5/14/chartex" xmlns:mc="http://schemas.openxmlformats.org/markup-compatibility/2006" xmlns:m="http://schemas.openxmlformats.org/officeDocument/2006/math" xmlns:aink="http://schemas.microsoft.com/office/drawing/2016/ink" xmlns:am3d="http://schemas.microsoft.com/office/drawing/2017/model3d" xmlns:oel="http://schemas.microsoft.com/office/2019/extlst" xmlns:r="http://schemas.openxmlformats.org/officeDocument/2006/relationships" xmlns:wp14="http://schemas.microsoft.com/office/word/2010/wordprocessingDrawing" xmlns:wp="http://schemas.openxmlformats.org/drawingml/2006/wordprocessingDrawing" xmlns:wpg="http://schemas.microsoft.com/office/word/2010/wordprocessingGroup" xmlns:wpi="http://schemas.microsoft.com/office/word/2010/wordprocessingInk" xmlns:wps="http://schemas.microsoft.com/office/word/2010/wordprocessingShape" xmlns:o="urn:schemas-microsoft-com:office:office" xmlns:v="urn:schemas-microsoft-com:vml" xmlns:w10="urn:schemas-microsoft-com:office:word" xmlns:w="http://schemas.openxmlformats.org/wordprocessingml/2006/main" xmlns:w14="http://schemas.microsoft.com/office/word/2010/wordml" xmlns:w15="http://schemas.microsoft.com/office/word/2012/wordml" xmlns:w16cex="http://schemas.microsoft.com/office/word/2018/wordml/cex" xmlns:w16cid="http://schemas.microsoft.com/office/word/2016/wordml/cid" xmlns:w16="http://schemas.microsoft.com/office/word/2018/wordml" xmlns:w16sdtdh="http://schemas.microsoft.com/office/word/2020/wordml/sdtdatahash" xmlns:w16sdtfl="http://schemas.microsoft.com/office/word/2024/wordml/sdtformatlock" xmlns:w16se="http://schemas.microsoft.com/office/word/2015/wordml/symex" xmlns:w16du="http://schemas.microsoft.com/office/word/2023/wordml/word16du" xmlns:wne="http://schemas.microsoft.com/office/word/2006/wordml" mc:Ignorable="w14 w15 w16se w16cid w16 w16cex w16sdtdh w16sdtfl w16du wp14">
   <w:endnote w:type="separator" w:id="-1">
     <w:p>
       <w:r>
@@ -11876,7 +11155,7 @@
 </file>
 
 <file path=word/footer1.xml><?xml version="1.0" encoding="utf-8"?>
-<w:ftr xmlns:wpc="http://schemas.microsoft.com/office/word/2010/wordprocessingCanvas" xmlns:cx="http://schemas.microsoft.com/office/drawing/2014/chartex" xmlns:cx1="http://schemas.microsoft.com/office/drawing/2015/9/8/chartex" xmlns:cx2="http://schemas.microsoft.com/office/drawing/2015/10/21/chartex" xmlns:cx3="http://schemas.microsoft.com/office/drawing/2016/5/9/chartex" xmlns:cx4="http://schemas.microsoft.com/office/drawing/2016/5/10/chartex" xmlns:cx5="http://schemas.microsoft.com/office/drawing/2016/5/11/chartex" xmlns:cx6="http://schemas.microsoft.com/office/drawing/2016/5/12/chartex" xmlns:cx7="http://schemas.microsoft.com/office/drawing/2016/5/13/chartex" xmlns:cx8="http://schemas.microsoft.com/office/drawing/2016/5/14/chartex" xmlns:mc="http://schemas.openxmlformats.org/markup-compatibility/2006" xmlns:aink="http://schemas.microsoft.com/office/drawing/2016/ink" xmlns:am3d="http://schemas.microsoft.com/office/drawing/2017/model3d" xmlns:o="urn:schemas-microsoft-com:office:office" xmlns:oel="http://schemas.microsoft.com/office/2019/extlst" xmlns:r="http://schemas.openxmlformats.org/officeDocument/2006/relationships" xmlns:m="http://schemas.openxmlformats.org/officeDocument/2006/math" xmlns:v="urn:schemas-microsoft-com:vml" xmlns:wp14="http://schemas.microsoft.com/office/word/2010/wordprocessingDrawing" xmlns:wp="http://schemas.openxmlformats.org/drawingml/2006/wordprocessingDrawing" xmlns:w10="urn:schemas-microsoft-com:office:word" xmlns:w="http://schemas.openxmlformats.org/wordprocessingml/2006/main" xmlns:w14="http://schemas.microsoft.com/office/word/2010/wordml" xmlns:w15="http://schemas.microsoft.com/office/word/2012/wordml" xmlns:w16cex="http://schemas.microsoft.com/office/word/2018/wordml/cex" xmlns:w16cid="http://schemas.microsoft.com/office/word/2016/wordml/cid" xmlns:w16="http://schemas.microsoft.com/office/word/2018/wordml" xmlns:w16du="http://schemas.microsoft.com/office/word/2023/wordml/word16du" xmlns:w16sdtdh="http://schemas.microsoft.com/office/word/2020/wordml/sdtdatahash" xmlns:w16sdtfl="http://schemas.microsoft.com/office/word/2024/wordml/sdtformatlock" xmlns:w16se="http://schemas.microsoft.com/office/word/2015/wordml/symex" xmlns:wpg="http://schemas.microsoft.com/office/word/2010/wordprocessingGroup" xmlns:wpi="http://schemas.microsoft.com/office/word/2010/wordprocessingInk" xmlns:wne="http://schemas.microsoft.com/office/word/2006/wordml" xmlns:wps="http://schemas.microsoft.com/office/word/2010/wordprocessingShape" mc:Ignorable="w14 w15 w16se w16cid w16 w16cex w16sdtdh w16sdtfl w16du wp14">
+<w:ftr xmlns:wpc="http://schemas.microsoft.com/office/word/2010/wordprocessingCanvas" xmlns:cx="http://schemas.microsoft.com/office/drawing/2014/chartex" xmlns:cx1="http://schemas.microsoft.com/office/drawing/2015/9/8/chartex" xmlns:cx2="http://schemas.microsoft.com/office/drawing/2015/10/21/chartex" xmlns:cx3="http://schemas.microsoft.com/office/drawing/2016/5/9/chartex" xmlns:cx4="http://schemas.microsoft.com/office/drawing/2016/5/10/chartex" xmlns:cx5="http://schemas.microsoft.com/office/drawing/2016/5/11/chartex" xmlns:cx6="http://schemas.microsoft.com/office/drawing/2016/5/12/chartex" xmlns:cx7="http://schemas.microsoft.com/office/drawing/2016/5/13/chartex" xmlns:cx8="http://schemas.microsoft.com/office/drawing/2016/5/14/chartex" xmlns:mc="http://schemas.openxmlformats.org/markup-compatibility/2006" xmlns:m="http://schemas.openxmlformats.org/officeDocument/2006/math" xmlns:aink="http://schemas.microsoft.com/office/drawing/2016/ink" xmlns:am3d="http://schemas.microsoft.com/office/drawing/2017/model3d" xmlns:oel="http://schemas.microsoft.com/office/2019/extlst" xmlns:r="http://schemas.openxmlformats.org/officeDocument/2006/relationships" xmlns:wp14="http://schemas.microsoft.com/office/word/2010/wordprocessingDrawing" xmlns:wp="http://schemas.openxmlformats.org/drawingml/2006/wordprocessingDrawing" xmlns:wpg="http://schemas.microsoft.com/office/word/2010/wordprocessingGroup" xmlns:wpi="http://schemas.microsoft.com/office/word/2010/wordprocessingInk" xmlns:wps="http://schemas.microsoft.com/office/word/2010/wordprocessingShape" xmlns:o="urn:schemas-microsoft-com:office:office" xmlns:v="urn:schemas-microsoft-com:vml" xmlns:w10="urn:schemas-microsoft-com:office:word" xmlns:w="http://schemas.openxmlformats.org/wordprocessingml/2006/main" xmlns:w14="http://schemas.microsoft.com/office/word/2010/wordml" xmlns:w15="http://schemas.microsoft.com/office/word/2012/wordml" xmlns:w16cex="http://schemas.microsoft.com/office/word/2018/wordml/cex" xmlns:w16cid="http://schemas.microsoft.com/office/word/2016/wordml/cid" xmlns:w16="http://schemas.microsoft.com/office/word/2018/wordml" xmlns:w16sdtdh="http://schemas.microsoft.com/office/word/2020/wordml/sdtdatahash" xmlns:w16sdtfl="http://schemas.microsoft.com/office/word/2024/wordml/sdtformatlock" xmlns:w16se="http://schemas.microsoft.com/office/word/2015/wordml/symex" xmlns:w16du="http://schemas.microsoft.com/office/word/2023/wordml/word16du" xmlns:wne="http://schemas.microsoft.com/office/word/2006/wordml" mc:Ignorable="w14 w15 w16se w16cid w16 w16cex w16sdtdh w16sdtfl w16du wp14">
   <w:sdt>
     <w:sdtPr>
       <w:id w:val="-1791972759"/>
@@ -11929,7 +11208,7 @@
 </file>
 
 <file path=word/footnotes.xml><?xml version="1.0" encoding="utf-8"?>
-<w:footnotes xmlns:wpc="http://schemas.microsoft.com/office/word/2010/wordprocessingCanvas" xmlns:cx="http://schemas.microsoft.com/office/drawing/2014/chartex" xmlns:cx1="http://schemas.microsoft.com/office/drawing/2015/9/8/chartex" xmlns:cx2="http://schemas.microsoft.com/office/drawing/2015/10/21/chartex" xmlns:cx3="http://schemas.microsoft.com/office/drawing/2016/5/9/chartex" xmlns:cx4="http://schemas.microsoft.com/office/drawing/2016/5/10/chartex" xmlns:cx5="http://schemas.microsoft.com/office/drawing/2016/5/11/chartex" xmlns:cx6="http://schemas.microsoft.com/office/drawing/2016/5/12/chartex" xmlns:cx7="http://schemas.microsoft.com/office/drawing/2016/5/13/chartex" xmlns:cx8="http://schemas.microsoft.com/office/drawing/2016/5/14/chartex" xmlns:mc="http://schemas.openxmlformats.org/markup-compatibility/2006" xmlns:aink="http://schemas.microsoft.com/office/drawing/2016/ink" xmlns:am3d="http://schemas.microsoft.com/office/drawing/2017/model3d" xmlns:o="urn:schemas-microsoft-com:office:office" xmlns:oel="http://schemas.microsoft.com/office/2019/extlst" xmlns:r="http://schemas.openxmlformats.org/officeDocument/2006/relationships" xmlns:m="http://schemas.openxmlformats.org/officeDocument/2006/math" xmlns:v="urn:schemas-microsoft-com:vml" xmlns:wp14="http://schemas.microsoft.com/office/word/2010/wordprocessingDrawing" xmlns:wp="http://schemas.openxmlformats.org/drawingml/2006/wordprocessingDrawing" xmlns:w10="urn:schemas-microsoft-com:office:word" xmlns:w="http://schemas.openxmlformats.org/wordprocessingml/2006/main" xmlns:w14="http://schemas.microsoft.com/office/word/2010/wordml" xmlns:w15="http://schemas.microsoft.com/office/word/2012/wordml" xmlns:w16cex="http://schemas.microsoft.com/office/word/2018/wordml/cex" xmlns:w16cid="http://schemas.microsoft.com/office/word/2016/wordml/cid" xmlns:w16="http://schemas.microsoft.com/office/word/2018/wordml" xmlns:w16du="http://schemas.microsoft.com/office/word/2023/wordml/word16du" xmlns:w16sdtdh="http://schemas.microsoft.com/office/word/2020/wordml/sdtdatahash" xmlns:w16sdtfl="http://schemas.microsoft.com/office/word/2024/wordml/sdtformatlock" xmlns:w16se="http://schemas.microsoft.com/office/word/2015/wordml/symex" xmlns:wpg="http://schemas.microsoft.com/office/word/2010/wordprocessingGroup" xmlns:wpi="http://schemas.microsoft.com/office/word/2010/wordprocessingInk" xmlns:wne="http://schemas.microsoft.com/office/word/2006/wordml" xmlns:wps="http://schemas.microsoft.com/office/word/2010/wordprocessingShape" mc:Ignorable="w14 w15 w16se w16cid w16 w16cex w16sdtdh w16sdtfl w16du wp14">
+<w:footnotes xmlns:wpc="http://schemas.microsoft.com/office/word/2010/wordprocessingCanvas" xmlns:cx="http://schemas.microsoft.com/office/drawing/2014/chartex" xmlns:cx1="http://schemas.microsoft.com/office/drawing/2015/9/8/chartex" xmlns:cx2="http://schemas.microsoft.com/office/drawing/2015/10/21/chartex" xmlns:cx3="http://schemas.microsoft.com/office/drawing/2016/5/9/chartex" xmlns:cx4="http://schemas.microsoft.com/office/drawing/2016/5/10/chartex" xmlns:cx5="http://schemas.microsoft.com/office/drawing/2016/5/11/chartex" xmlns:cx6="http://schemas.microsoft.com/office/drawing/2016/5/12/chartex" xmlns:cx7="http://schemas.microsoft.com/office/drawing/2016/5/13/chartex" xmlns:cx8="http://schemas.microsoft.com/office/drawing/2016/5/14/chartex" xmlns:mc="http://schemas.openxmlformats.org/markup-compatibility/2006" xmlns:m="http://schemas.openxmlformats.org/officeDocument/2006/math" xmlns:aink="http://schemas.microsoft.com/office/drawing/2016/ink" xmlns:am3d="http://schemas.microsoft.com/office/drawing/2017/model3d" xmlns:oel="http://schemas.microsoft.com/office/2019/extlst" xmlns:r="http://schemas.openxmlformats.org/officeDocument/2006/relationships" xmlns:wp14="http://schemas.microsoft.com/office/word/2010/wordprocessingDrawing" xmlns:wp="http://schemas.openxmlformats.org/drawingml/2006/wordprocessingDrawing" xmlns:wpg="http://schemas.microsoft.com/office/word/2010/wordprocessingGroup" xmlns:wpi="http://schemas.microsoft.com/office/word/2010/wordprocessingInk" xmlns:wps="http://schemas.microsoft.com/office/word/2010/wordprocessingShape" xmlns:o="urn:schemas-microsoft-com:office:office" xmlns:v="urn:schemas-microsoft-com:vml" xmlns:w10="urn:schemas-microsoft-com:office:word" xmlns:w="http://schemas.openxmlformats.org/wordprocessingml/2006/main" xmlns:w14="http://schemas.microsoft.com/office/word/2010/wordml" xmlns:w15="http://schemas.microsoft.com/office/word/2012/wordml" xmlns:w16cex="http://schemas.microsoft.com/office/word/2018/wordml/cex" xmlns:w16cid="http://schemas.microsoft.com/office/word/2016/wordml/cid" xmlns:w16="http://schemas.microsoft.com/office/word/2018/wordml" xmlns:w16sdtdh="http://schemas.microsoft.com/office/word/2020/wordml/sdtdatahash" xmlns:w16sdtfl="http://schemas.microsoft.com/office/word/2024/wordml/sdtformatlock" xmlns:w16se="http://schemas.microsoft.com/office/word/2015/wordml/symex" xmlns:w16du="http://schemas.microsoft.com/office/word/2023/wordml/word16du" xmlns:wne="http://schemas.microsoft.com/office/word/2006/wordml" mc:Ignorable="w14 w15 w16se w16cid w16 w16cex w16sdtdh w16sdtfl w16du wp14">
   <w:footnote w:type="separator" w:id="-1">
     <w:p>
       <w:r>
@@ -11948,7 +11227,7 @@
 </file>
 
 <file path=word/numbering.xml><?xml version="1.0" encoding="utf-8"?>
-<w:numbering xmlns:wpc="http://schemas.microsoft.com/office/word/2010/wordprocessingCanvas" xmlns:cx="http://schemas.microsoft.com/office/drawing/2014/chartex" xmlns:cx1="http://schemas.microsoft.com/office/drawing/2015/9/8/chartex" xmlns:cx2="http://schemas.microsoft.com/office/drawing/2015/10/21/chartex" xmlns:cx3="http://schemas.microsoft.com/office/drawing/2016/5/9/chartex" xmlns:cx4="http://schemas.microsoft.com/office/drawing/2016/5/10/chartex" xmlns:cx5="http://schemas.microsoft.com/office/drawing/2016/5/11/chartex" xmlns:cx6="http://schemas.microsoft.com/office/drawing/2016/5/12/chartex" xmlns:cx7="http://schemas.microsoft.com/office/drawing/2016/5/13/chartex" xmlns:cx8="http://schemas.microsoft.com/office/drawing/2016/5/14/chartex" xmlns:mc="http://schemas.openxmlformats.org/markup-compatibility/2006" xmlns:aink="http://schemas.microsoft.com/office/drawing/2016/ink" xmlns:am3d="http://schemas.microsoft.com/office/drawing/2017/model3d" xmlns:o="urn:schemas-microsoft-com:office:office" xmlns:oel="http://schemas.microsoft.com/office/2019/extlst" xmlns:r="http://schemas.openxmlformats.org/officeDocument/2006/relationships" xmlns:m="http://schemas.openxmlformats.org/officeDocument/2006/math" xmlns:v="urn:schemas-microsoft-com:vml" xmlns:wp14="http://schemas.microsoft.com/office/word/2010/wordprocessingDrawing" xmlns:wp="http://schemas.openxmlformats.org/drawingml/2006/wordprocessingDrawing" xmlns:w10="urn:schemas-microsoft-com:office:word" xmlns:w="http://schemas.openxmlformats.org/wordprocessingml/2006/main" xmlns:w14="http://schemas.microsoft.com/office/word/2010/wordml" xmlns:w15="http://schemas.microsoft.com/office/word/2012/wordml" xmlns:w16cex="http://schemas.microsoft.com/office/word/2018/wordml/cex" xmlns:w16cid="http://schemas.microsoft.com/office/word/2016/wordml/cid" xmlns:w16="http://schemas.microsoft.com/office/word/2018/wordml" xmlns:w16du="http://schemas.microsoft.com/office/word/2023/wordml/word16du" xmlns:w16sdtdh="http://schemas.microsoft.com/office/word/2020/wordml/sdtdatahash" xmlns:w16sdtfl="http://schemas.microsoft.com/office/word/2024/wordml/sdtformatlock" xmlns:w16se="http://schemas.microsoft.com/office/word/2015/wordml/symex" xmlns:wpg="http://schemas.microsoft.com/office/word/2010/wordprocessingGroup" xmlns:wpi="http://schemas.microsoft.com/office/word/2010/wordprocessingInk" xmlns:wne="http://schemas.microsoft.com/office/word/2006/wordml" xmlns:wps="http://schemas.microsoft.com/office/word/2010/wordprocessingShape" mc:Ignorable="w14 w15 w16se w16cid w16 w16cex w16sdtdh w16sdtfl w16du wp14">
+<w:numbering xmlns:wpc="http://schemas.microsoft.com/office/word/2010/wordprocessingCanvas" xmlns:cx="http://schemas.microsoft.com/office/drawing/2014/chartex" xmlns:cx1="http://schemas.microsoft.com/office/drawing/2015/9/8/chartex" xmlns:cx2="http://schemas.microsoft.com/office/drawing/2015/10/21/chartex" xmlns:cx3="http://schemas.microsoft.com/office/drawing/2016/5/9/chartex" xmlns:cx4="http://schemas.microsoft.com/office/drawing/2016/5/10/chartex" xmlns:cx5="http://schemas.microsoft.com/office/drawing/2016/5/11/chartex" xmlns:cx6="http://schemas.microsoft.com/office/drawing/2016/5/12/chartex" xmlns:cx7="http://schemas.microsoft.com/office/drawing/2016/5/13/chartex" xmlns:cx8="http://schemas.microsoft.com/office/drawing/2016/5/14/chartex" xmlns:mc="http://schemas.openxmlformats.org/markup-compatibility/2006" xmlns:m="http://schemas.openxmlformats.org/officeDocument/2006/math" xmlns:aink="http://schemas.microsoft.com/office/drawing/2016/ink" xmlns:am3d="http://schemas.microsoft.com/office/drawing/2017/model3d" xmlns:oel="http://schemas.microsoft.com/office/2019/extlst" xmlns:r="http://schemas.openxmlformats.org/officeDocument/2006/relationships" xmlns:wp14="http://schemas.microsoft.com/office/word/2010/wordprocessingDrawing" xmlns:wp="http://schemas.openxmlformats.org/drawingml/2006/wordprocessingDrawing" xmlns:wpg="http://schemas.microsoft.com/office/word/2010/wordprocessingGroup" xmlns:wpi="http://schemas.microsoft.com/office/word/2010/wordprocessingInk" xmlns:wps="http://schemas.microsoft.com/office/word/2010/wordprocessingShape" xmlns:o="urn:schemas-microsoft-com:office:office" xmlns:v="urn:schemas-microsoft-com:vml" xmlns:w10="urn:schemas-microsoft-com:office:word" xmlns:w="http://schemas.openxmlformats.org/wordprocessingml/2006/main" xmlns:w14="http://schemas.microsoft.com/office/word/2010/wordml" xmlns:w15="http://schemas.microsoft.com/office/word/2012/wordml" xmlns:w16cex="http://schemas.microsoft.com/office/word/2018/wordml/cex" xmlns:w16cid="http://schemas.microsoft.com/office/word/2016/wordml/cid" xmlns:w16="http://schemas.microsoft.com/office/word/2018/wordml" xmlns:w16sdtdh="http://schemas.microsoft.com/office/word/2020/wordml/sdtdatahash" xmlns:w16sdtfl="http://schemas.microsoft.com/office/word/2024/wordml/sdtformatlock" xmlns:w16se="http://schemas.microsoft.com/office/word/2015/wordml/symex" xmlns:w16du="http://schemas.microsoft.com/office/word/2023/wordml/word16du" xmlns:wne="http://schemas.microsoft.com/office/word/2006/wordml" mc:Ignorable="w14 w15 w16se w16cid w16 w16cex w16sdtdh w16sdtfl w16du wp14">
   <w:abstractNum w:abstractNumId="0" w15:restartNumberingAfterBreak="0">
     <w:nsid w:val="0BD50CE4"/>
     <w:multiLevelType w:val="multilevel"/>
@@ -14375,7 +13654,7 @@
 </file>
 
 <file path=word/styles.xml><?xml version="1.0" encoding="utf-8"?>
-<w:styles xmlns:mc="http://schemas.openxmlformats.org/markup-compatibility/2006" xmlns:r="http://schemas.openxmlformats.org/officeDocument/2006/relationships" xmlns:w="http://schemas.openxmlformats.org/wordprocessingml/2006/main" xmlns:w14="http://schemas.microsoft.com/office/word/2010/wordml" xmlns:w15="http://schemas.microsoft.com/office/word/2012/wordml" xmlns:w16cex="http://schemas.microsoft.com/office/word/2018/wordml/cex" xmlns:w16cid="http://schemas.microsoft.com/office/word/2016/wordml/cid" xmlns:w16="http://schemas.microsoft.com/office/word/2018/wordml" xmlns:w16du="http://schemas.microsoft.com/office/word/2023/wordml/word16du" xmlns:w16sdtdh="http://schemas.microsoft.com/office/word/2020/wordml/sdtdatahash" xmlns:w16sdtfl="http://schemas.microsoft.com/office/word/2024/wordml/sdtformatlock" xmlns:w16se="http://schemas.microsoft.com/office/word/2015/wordml/symex" mc:Ignorable="w14 w15 w16se w16cid w16 w16cex w16sdtdh w16sdtfl w16du">
+<w:styles xmlns:mc="http://schemas.openxmlformats.org/markup-compatibility/2006" xmlns:r="http://schemas.openxmlformats.org/officeDocument/2006/relationships" xmlns:w="http://schemas.openxmlformats.org/wordprocessingml/2006/main" xmlns:w14="http://schemas.microsoft.com/office/word/2010/wordml" xmlns:w15="http://schemas.microsoft.com/office/word/2012/wordml" xmlns:w16cex="http://schemas.microsoft.com/office/word/2018/wordml/cex" xmlns:w16cid="http://schemas.microsoft.com/office/word/2016/wordml/cid" xmlns:w16="http://schemas.microsoft.com/office/word/2018/wordml" xmlns:w16sdtdh="http://schemas.microsoft.com/office/word/2020/wordml/sdtdatahash" xmlns:w16sdtfl="http://schemas.microsoft.com/office/word/2024/wordml/sdtformatlock" xmlns:w16se="http://schemas.microsoft.com/office/word/2015/wordml/symex" xmlns:w16du="http://schemas.microsoft.com/office/word/2023/wordml/word16du" mc:Ignorable="w14 w15 w16se w16cid w16 w16cex w16sdtdh w16sdtfl w16du">
   <w:docDefaults>
     <w:rPrDefault>
       <w:rPr>

</xml_diff>